<commit_message>
Executable verifier behind the LLM (eval/verifier): results on 400 blind stays; manuscript §3.9 + Table 7, abstract, Discussion, Limitations, Conclusion; Supplementary Note 14 + repro row; highlight 5
</commit_message>
<xml_diff>
--- a/docs/paper1/v7/Paper1_Hemoglyph_CMPB_EN_v7_R6.docx
+++ b/docs/paper1/v7/Paper1_Hemoglyph_CMPB_EN_v7_R6.docx
@@ -137,7 +137,7 @@
         <w:t>Background and Objective:</w:t>
       </w:r>
       <w:r>
-        <w:t xml:space="preserve"> Rule bases can now be drafted at scale with large language models, but rules uncheckable against their sources, and engines validated only on authors' vignettes, are not auditable. We evaluate three verification methods—executable invariants, a frozen source-concordance protocol and a hash-frozen one-shot benchmark—on Hemoglyph, an offline engine ranking a cited differential from a laboratory panel with 33,183 guideline-transcribed rules (99.2% AI-drafted) and no outcome training.</w:t>
+        <w:t xml:space="preserve"> LLM-drafted rule bases are not auditable when rules cannot be checked against sources and engines are validated only on vignettes. We evaluate three verification methods—executable invariants, a frozen source-concordance protocol and a hash-frozen one-shot benchmark—on Hemoglyph, an offline engine ranking a cited differential from a laboratory panel with 33,183 guideline-transcribed rules (99.2% AI-drafted), untrained on outcomes.</w:t>
       </w:r>
     </w:p>
     <w:p>
@@ -148,7 +148,7 @@
         <w:t>Methods:</w:t>
       </w:r>
       <w:r>
-        <w:t xml:space="preserve"> Property-based tests check invariants (determinism, unit and presentation invariance, monotonicity, absent-analyte and context) on randomised panels and, as a black box, on real panels given identically to engine and LLM. A protocol frozen before sampling labels 200 rules concordant, discordant or unresolvable against their locator. Under a hash-frozen analysis plan with two one-shot quarantine rounds, the engine was benchmarked on the eICU-CRD demo (2,314 ICU stays), 9,000 NHANES adults, 14,420 sepsis patients and external cohorts, with supervised baselines, ablation and a blinded comparison with an unnamed frontier LLM (400 stays).</w:t>
+        <w:t xml:space="preserve"> Property-based tests check invariants (determinism, unit/presentation invariance, monotonicity, absent analyte, context) on randomised panels, as a black box on real panels given identically to engine and LLM, and as a verifier behind the LLM. A frozen protocol labels 200 sampled rules concordant, discordant or unresolvable against their locator. Under a hash-frozen plan with two one-shot quarantine rounds, benchmarks covered the eICU-CRD demo (2,314 ICU stays), 9,000 NHANES adults, 14,420 sepsis patients and external cohorts, with ablation and a blinded comparison with an unnamed frontier LLM (400 stays).</w:t>
       </w:r>
     </w:p>
     <w:p>
@@ -159,7 +159,7 @@
         <w:t>Results:</w:t>
       </w:r>
       <w:r>
-        <w:t xml:space="preserve"> The invariant suite exposed a ranking defect missed by 353 adversarial vignettes. Of 200 audited rules, 92% (95% CI 87.4–95.1) were unresolvable from their locators and ≥7.5% (4.6–12.0) discordant. On the benchmark 60.8% (58.7–62.9) of clinician-listed ICU diagnoses appeared in the top five from laboratory values (prevalence baseline 51.3%). NHANES AUROCs reproduced across cycles (0.88–0.99; 2/485 healthy false assertions); sepsis prediction failed as pre-specified. Engine and LLM were at recall@5 parity (60.7% vs 59.6%, p = 0.54); the LLM led at rank 1 (κ 0.69). On identical perturbed panels SI units left the engine's top-5 unchanged in 40/40 versus 8/40 (LLM); a diagnosis was asserted without its defining analyte in 3/40 versus 14/40; the test also exposed an engine unit defect, since fixed. Ablation placed the result in 272 curated anchors and the syndrome layer, not the AI-drafted bulk.</w:t>
+        <w:t xml:space="preserve"> The invariants exposed a ranking defect missed by 353 vignettes. Of 200 audited rules, 92% (95% CI 87.4–95.1) were unresolvable from their locators and ≥7.5% (4.6–12.0) discordant. 60.8% (58.7–62.9) of clinician-listed ICU diagnoses ranked in the top five (prevalence baseline 51.3%). NHANES AUROCs reproduced across cycles (0.88–0.99); sepsis prediction failed as pre-specified. Engine and LLM were at recall@5 parity (60.7% vs 59.6%, p = 0.54); the LLM led at rank 1. On identical perturbed panels SI units left the engine's top-5 unchanged in 40/40 versus 8/40 (LLM), a diagnosis was asserted without its defining analyte in 3/40 versus 14/40, and a unit defect was exposed and fixed. The engine's criteria, used as a verifier, removed 40% of the LLM's unsupported top-5 assertions at no recall cost and flagged the engine's own output more often. Ablation placed the result in 272 curated anchors, not the AI-drafted bulk.</w:t>
       </w:r>
     </w:p>
     <w:p>
@@ -170,7 +170,7 @@
         <w:t>Conclusions:</w:t>
       </w:r>
       <w:r>
-        <w:t xml:space="preserve"> Executable invariants and a frozen provenance audit are cheap, reproducible and informative—here unfavourably: provenance granularity, not rule count, limits auditability of AI-drafted rule bases. A traceable engine matched a frontier LLM on a blinded panel task and, unlike it, can be held to invariants. No clinical claim is made; code, rules, protocols and outputs are public.</w:t>
+        <w:t xml:space="preserve"> Executable invariants and a frozen provenance audit are cheap, reproducible and informative—here unfavourably: provenance granularity, not rule count, limits auditability of AI-drafted rule bases. A traceable engine matched a frontier LLM on a blinded panel task, can be held to invariants and can verify the LLM's output. No clinical claim is made; code, rules, protocols and outputs are public.</w:t>
       </w:r>
     </w:p>
     <w:p>
@@ -320,6 +320,24 @@
         <w:t>eval/blackbox/</w:t>
       </w:r>
       <w:r>
+        <w:t xml:space="preserve">). Finally, the same guideline criteria were used as an </w:t>
+      </w:r>
+      <w:r>
+        <w:rPr>
+          <w:i/>
+        </w:rPr>
+        <w:t>executable verifier</w:t>
+      </w:r>
+      <w:r>
+        <w:t xml:space="preserve"> behind the LLM: each entry of the 400 stored blind readings was mapped to a label group and checked against its own panel as supported, contradicted (defining analyte present, criterion not met), analyte-absent, or not verifiable (no criterion, or no mapped group); unsupported entries were demoted below all others and recall and the unsupported-assertion rate re-scored. The engine's own top-5 was passed through the same verifier. Protocol and predictions were committed before computation; no LLM call was made (</w:t>
+      </w:r>
+      <w:r>
+        <w:rPr>
+          <w:rFonts w:ascii="Consolas" w:hAnsi="Consolas"/>
+        </w:rPr>
+        <w:t>eval/verifier/</w:t>
+      </w:r>
+      <w:r>
         <w:t>).</w:t>
       </w:r>
     </w:p>
@@ -586,6 +604,22 @@
     </w:p>
     <w:p>
       <w:pPr>
+        <w:pStyle w:val="Heading2"/>
+      </w:pPr>
+      <w:r>
+        <w:rPr>
+          <w:color w:val="303030"/>
+        </w:rPr>
+        <w:t>3.9 The engine's criteria as an executable verifier behind the LLM</w:t>
+      </w:r>
+    </w:p>
+    <w:p>
+      <w:r>
+        <w:t>Of 2,424 LLM entries, 1,636 mapped to a group with a criterion (1,439 supported, 182 contradicted, 15 analyte-absent); 788 were not verifiable (Table 7). Among mapped top-5 entries, 140/1,486 (9.4%) were unsupported—below the registered 15–30%—10 of them without the defining analyte in the panel; the engine's own top-5 failed the same proxy criteria in 233/1,518 (15.3%; registered 5–15%) but never without the analyte (0/1,518). Demoting unsupported LLM entries left recall@5 unchanged (59.6 → 59.4%, paired difference −0.2, 95% CI −0.5 to 0.0) and raised recall@1 by 1.2 points (28.2 → 29.4%, CI 0.2–2.3, p = 0.014), halving the unsupported share to 5.7% (registered &lt; 5%); removing them cost 1.2 points at rank 5. Of 197 demoted entries 10 were clinician labels (5.1%; registered ≤ 10%): five synonym-map artefacts (respiratory acidosis matched by "acidosis"; compound names) and five borderline values (glucose 134 mg/dL, creatinine 0.94, INR 1.4, two early-DKA calls with bicarbonate 24 or absent); post hoc, the respiratory-acidosis artefact alone lowers the LLM's raw rate to 7.1%. The engine's failures concentrate in the diabetes/hyperglycaemia groups (criterion stricter than its hyperglycaemia rule) and in renal entries ranked from the urea:creatinine ratio at creatinine 0.9–1.2 mg/dL (Supplementary Note 14). Two of five registered predictions were met.</w:t>
+      </w:r>
+    </w:p>
+    <w:p>
+      <w:pPr>
         <w:pStyle w:val="Heading1"/>
       </w:pPr>
       <w:r>
@@ -597,17 +631,26 @@
     </w:p>
     <w:p>
       <w:r>
-        <w:t>Three methods were applied to an AI-drafted clinical rule base, and each produced information that conventional validation had not. The invariant suite found a monotonicity defect that 353 adversarial vignettes missed, and its black-box variant on real SI-unit panels found a unit-handling defect in a legacy alias path that the in-process suite did not reach; the frozen concordance protocol showed that the rule base, as released, cannot be audited from its own locators and that at least 7.5% of sampled rules are demonstrably discordant; and the frozen benchmark showed an untrained, fully traceable engine at recall@5 parity with a frontier LLM while a prevalence baseline reached 51%—so the engine's measurable contribution is ordering (NDCG@5 56.5% vs 39.0%) and per-stay specificity, not coverage. Each method is cheap—minutes for the suite, two rater-days for the audit, public data and released scripts for the benchmark—and reproducible from the repository.</w:t>
+        <w:t>Three methods were applied to an AI-drafted clinical rule base, and each produced information that conventional validation had not. The invariant suite found a monotonicity defect that 353 adversarial vignettes missed, and its black-box variant found a unit-handling defect in a legacy alias path the in-process suite did not reach; the frozen concordance protocol showed that the rule base cannot be audited from its own locators and that at least 7.5% of sampled rules are discordant; the frozen benchmark showed an untrained, traceable engine at recall@5 parity with a frontier LLM while a prevalence baseline reached 51%—so the engine's measurable contribution is ordering (NDCG@5 56.5% vs 39.0%) and per-stay specificity, not coverage. Each method is cheap and reproducible from the repository.</w:t>
       </w:r>
     </w:p>
     <w:p>
       <w:r>
-        <w:t>The methodological lesson is about where verification stops. Executable invariants are a genuine advantage of a rule engine over an LLM: they can be stated, run on every release and violated only visibly; on identical panels the engine held unit and presentation invariance where the LLM's output changed in most panels (Section 3.8), and the same test found two engine defects—which is the point: a violated invariant is a bug report with a reproducer, whereas an LLM's changed answer is not actionable. But they establish logical consistency, not correctness—a mistranscribed threshold passes every invariant—and the concordance audit shows why correctness is hard to reach: the limiting factor was not rater effort but locator granularity. Organisation-level URLs and generic standards make 92% of rules uncheckable, and where checking was possible the error was usually attribution, which a title reveals and a transcription audit therefore over-samples. Any audit protocol for such rule bases should therefore require the verbatim source sentence for every verdict, and any registry intended to be auditable should carry section- or table-level locators; both are planned for release 15 together with re-sourcing or retirement of the 46 sampled candidates whose only citation is a generic standard and correction of the five curated-anchor attribution errors found. Concordance remains necessary, not sufficient: an independent clinical audit is the next step and is outside this paper. Both tools transfer without change to any rule base whose records carry analyte, operator, threshold, unit, population and locator—including rule sets generated by retrieval-augmented LLM pipelines—and the benchmark scripts run unchanged on the credentialed full eICU and MIMIC-IV releases.</w:t>
+        <w:t xml:space="preserve">The methodological lesson is about where verification stops. Executable invariants are a genuine advantage of a rule engine over an LLM: they can be stated, run on every release and violated only visibly; on identical panels the engine held unit and presentation invariance where the LLM's output changed in most panels (Section 3.8), and the same test found two engine defects—which is the point: a violated invariant is a bug report with a reproducer, whereas an LLM's changed answer is not actionable. The criteria also work as a verifier </w:t>
+      </w:r>
+      <w:r>
+        <w:rPr>
+          <w:i/>
+        </w:rPr>
+        <w:t>behind</w:t>
+      </w:r>
+      <w:r>
+        <w:t xml:space="preserve"> the LLM: demoting entries the panel does not support removed 40% of its unsupported top-5 assertions at no recall cost (Section 3.9)—and flagged the engine's own output more often, so executable verification is a check on both systems, not a privilege of one. But they establish logical consistency, not correctness—a mistranscribed threshold passes every invariant—and the concordance audit shows why correctness is hard to reach: the limiting factor was not rater effort but locator granularity. Organisation-level URLs and generic standards make 92% of rules uncheckable, and where checking was possible the error was usually attribution. Audit protocols for such rule bases should require the verbatim source sentence for every verdict, and auditable registries should carry section- or table-level locators; both are planned for release 15, with re-sourcing or retirement of the 46 sampled generic-standard citations and correction of the five anchor attribution errors. Concordance is necessary, not sufficient: an independent clinical audit is the next step and outside this paper. Both tools transfer without change to any rule base whose records carry analyte, operator, threshold, unit, population and locator—including rule sets generated by retrieval-augmented LLM pipelines—and the benchmark scripts run unchanged on the credentialed full eICU and MIMIC-IV releases.</w:t>
       </w:r>
     </w:p>
     <w:p>
       <w:r>
-        <w:t>The benchmark numbers measure the reference standard at least as much as the engine; three observations locate the ceiling. First, the labels: a quarter of admission-level problem-list entries were not inferable from the first panel at all, and the panel-supported subset is recovered at 78.0% (k = 5) and 91.8% (k = 10). Second, the comparators: supervised models trained on the labels themselves did not exceed 0.82 AUROC for outcome-defined groups and a prevalence-ranking baseline overtakes any method at k = 10, so no laboratory-only system can score much higher on this reference. Third, the "false positives": of the 85.8% of top-5 assertions not on the problem list, 54.8% satisfy the group's laboratory criterion in the same panel and only 12.6% are criterion-negative—the coded precision of 14.2% is a lower bound and 69.0% an upper bound. Where the engine genuinely loses (sepsis, bleeding, withdrawal, CKD without a second creatinine) the label is an outcome learned from hidden correlates or needs longitudinal data—an argument for hybrid designs; part of the loss was chosen, since withdrawing single-creatinine CKD assertions to comply with KDIGO cost three points of recall@5. The ablation locates the result in the rule vote and the curated syndrome constellations, written by a non-clinician from guideline criteria; the 33,000-rule bulk adds one to three points, so Hemoglyph is guideline-</w:t>
+        <w:t>The benchmark numbers measure the reference standard at least as much as the engine; three observations locate the ceiling. First, a quarter of admission-level problem-list entries were not inferable from the first panel at all; the panel-supported subset is recovered at 78.0% (k = 5) and 91.8% (k = 10). Second, supervised models trained on the labels did not exceed 0.82 AUROC for outcome-defined groups and a prevalence baseline overtakes any method at k = 10, so no laboratory-only system can score much higher on this reference. Third, of the 85.8% of top-5 assertions not on the problem list, 54.8% satisfy the group's laboratory criterion in the same panel and only 12.6% are criterion-negative—coded precision (14.2%) is a lower bound, 69.0% an upper bound. Where the engine genuinely loses (sepsis, bleeding, withdrawal, CKD without a second creatinine) the label is an outcome learned from hidden correlates or needs longitudinal data—an argument for hybrid designs; part of the loss was chosen, since withdrawing single-creatinine CKD assertions to comply with KDIGO cost three points of recall@5. The ablation locates the result in the rule vote and the curated syndrome constellations, written by a non-clinician from guideline criteria; the 33,000-rule bulk adds one to three points, so Hemoglyph is guideline-</w:t>
       </w:r>
       <w:r>
         <w:rPr>
@@ -616,7 +659,7 @@
         <w:t>transcribed</w:t>
       </w:r>
       <w:r>
-        <w:t>, not guideline-derived. The contribution of such an engine is therefore not accuracy beyond what the reference permits but a property no LLM and no trained model offers: every output carries a rule identifier, threshold and source, runs offline in about one second without a GPU, and can be verified by executable invariants before release. Our design also addresses criticisms of recent LLM benchmarks—unstable metrics, leakage and post-hoc selection [28,33]: releases were frozen with manifests, quarantine data were run once, the failed round and the weakened criteria are disclosed, and the LLM's test–retest variability (κ 0.69) exceeded the between-system difference. Compared with Isabel and DXplain [13–16,34], this study isolates laboratory-only reasoning on more than 20,000 encounters and releases its knowledge base under an open licence. The output design (a rule identifier and source for every entry) is consistent with the transparency principle of the FDA's January 2026 clinical-decision-support guidance; no regulatory claim is made.</w:t>
+        <w:t>, not guideline-derived. The contribution of such an engine is therefore not accuracy beyond what the reference permits but a property no LLM or trained model offers: every output carries a rule identifier, threshold and source, runs offline in about one second without a GPU, and is verifiable by executable invariants before release. Our design also addresses criticisms of recent LLM benchmarks—unstable metrics, leakage and post-hoc selection [28,33]: releases were frozen with manifests, quarantine data were run once, the failed round and the weakened criteria are disclosed, and the LLM's test–retest variability (κ 0.69) exceeded the between-system difference. Compared with Isabel and DXplain [13–16,34], this study isolates laboratory-only reasoning on more than 20,000 encounters and releases its knowledge base under an open licence; the per-entry rule identifier and source are consistent with the transparency principle of the FDA's January 2026 clinical-decision-support guidance, without any regulatory claim.</w:t>
       </w:r>
     </w:p>
     <w:p>
@@ -632,7 +675,7 @@
     </w:p>
     <w:p>
       <w:r>
-        <w:t>No clinician audited the rules or adjudicated outputs; the concordance audit is single-rater, by a declared AI agent, without inter-rater reliability. The components that carry the result were written by a non-clinician first author; 34 sources lack a locator; Bayesian priors are hand-coded without a per-value citation table; no version-control history exists for the development period. Only the open demo subsets of eICU and MIMIC-IV were used, with admission-level problem lists and ICD codes as reference standards. The LLM comparison is an author-run self-baseline through a platform that does not disclose the model, with two prompts, no retrieval augmentation and no clinician adjudication, and the model's training data may include the public eICU demo. Quarantine criteria were weakened after round 1; the panel-supported metric is post hoc; NHANES laboratory-defined labels overlap the inputs; raw scores are uncalibrated; external cohorts are small; the OCR front end was not evaluated; Iranian populations and non-English laboratory conventions were not evaluated. The first author is a secondary-school student with a financial interest in the commercial product, and the system, including 99.2% of the rules, was developed with AI-agent assistance. Hemoglyph is a research prototype with no regulatory clearance.</w:t>
+        <w:t>No clinician audited the rules or adjudicated outputs; the concordance audit is single-rater, by a declared AI agent, without inter-rater reliability. The components that carry the result were written by a non-clinician first author; 34 sources lack a locator; Bayesian priors are hand-coded without a per-value citation table; no version-control history exists for the development period. Only the open demo subsets of eICU and MIMIC-IV were used, with admission-level problem lists and ICD codes as reference standards. The LLM comparison is an author-run self-baseline through a platform that does not disclose the model, with two prompts, no retrieval augmentation and no clinician adjudication, and the model's training data may include the public eICU demo. Quarantine criteria were weakened after round 1; the panel-supported metric is post hoc; NHANES laboratory-defined labels overlap the inputs; raw scores are uncalibrated; external cohorts are small; the OCR front end, Iranian populations and non-English laboratory conventions were not evaluated. The verifier's criteria are proxies and its synonym map is coarse, so its verdicts bound rather than measure unsupported assertion. The first author is a secondary-school student with a financial interest in the commercial product, and the system, including 99.2% of the rules, was developed with AI-agent assistance. Hemoglyph is a research prototype with no regulatory clearance.</w:t>
       </w:r>
     </w:p>
     <w:p>
@@ -648,7 +691,7 @@
     </w:p>
     <w:p>
       <w:r>
-        <w:t>Executable invariants, a frozen source-concordance protocol and a hash-frozen one-shot benchmark are three low-cost, reproducible methods for verifying an AI-drafted clinical rule base. A rule engine whose every output carries a rule identifier, threshold and source can be audited in ways a language model cannot, and its measured recall is bounded by the reference standard rather than by the method. Applied to Hemoglyph they found a defect that vignettes had missed, showed that provenance granularity rather than rule count limits auditability, and placed an untrained, traceable engine at parity with a frontier LLM on a blinded laboratory-panel task close to the ceiling the reference standard allows. The limits—an unaudited rule base, outcome-defined syndromes, uncalibrated scores—are stated so that they can be measured and closed.</w:t>
+        <w:t>Executable invariants, a frozen source-concordance protocol and a hash-frozen one-shot benchmark are three low-cost, reproducible methods for verifying an AI-drafted clinical rule base. A rule engine whose every output carries a rule identifier, threshold and source can be audited in ways a language model cannot—and can audit the language model's output in turn. Applied to Hemoglyph the methods found defects that vignettes had missed, showed that provenance granularity rather than rule count limits auditability, and placed an untrained, traceable engine at parity with a frontier LLM on a blinded laboratory-panel task close to the ceiling the reference standard allows. The limits—an unaudited rule base, outcome-defined syndromes, uncalibrated scores—are stated so that they can be measured and closed.</w:t>
       </w:r>
     </w:p>
     <w:p>
@@ -8530,6 +8573,726 @@
     <w:p/>
     <w:p>
       <w:pPr>
+        <w:keepNext/>
+      </w:pPr>
+      <w:r>
+        <w:rPr>
+          <w:b/>
+          <w:sz w:val="20"/>
+        </w:rPr>
+        <w:t>Table 7 | Executable verifier applied to the LLM's 400 blind differentials and to the engine's own top-5 (same criteria, same panels; no new LLM call).</w:t>
+      </w:r>
+      <w:r>
+        <w:rPr>
+          <w:sz w:val="20"/>
+        </w:rPr>
+        <w:t xml:space="preserve"> Unsupported = contradicted or analyte-absent among entries mapped to a group with a criterion; recall against clinician labels (596) with stay-clustered bootstrap; protocol and predictions committed before computation.</w:t>
+      </w:r>
+    </w:p>
+    <w:tbl>
+      <w:tblPr>
+        <w:tblStyle w:val="TableGrid"/>
+        <w:tblW w:type="auto" w:w="0"/>
+        <w:jc w:val="center"/>
+        <w:tblLook w:firstColumn="1" w:firstRow="1" w:lastColumn="0" w:lastRow="0" w:noHBand="0" w:noVBand="1" w:val="04A0"/>
+      </w:tblPr>
+      <w:tblGrid>
+        <w:gridCol w:w="1881"/>
+        <w:gridCol w:w="1881"/>
+        <w:gridCol w:w="1881"/>
+        <w:gridCol w:w="1881"/>
+        <w:gridCol w:w="1881"/>
+      </w:tblGrid>
+      <w:tr>
+        <w:trPr>
+          <w:cantSplit/>
+          <w:tblHeader/>
+        </w:trPr>
+        <w:tc>
+          <w:tcPr>
+            <w:tcW w:type="dxa" w:w="1881"/>
+          </w:tcPr>
+          <w:p>
+            <w:pPr>
+              <w:keepNext/>
+              <w:spacing w:line="240" w:lineRule="auto" w:after="0"/>
+            </w:pPr>
+            <w:r>
+              <w:rPr>
+                <w:b/>
+              </w:rPr>
+            </w:r>
+            <w:r>
+              <w:rPr>
+                <w:b/>
+                <w:sz w:val="17"/>
+              </w:rPr>
+              <w:t>Quantity</w:t>
+            </w:r>
+          </w:p>
+        </w:tc>
+        <w:tc>
+          <w:tcPr>
+            <w:tcW w:type="dxa" w:w="1881"/>
+          </w:tcPr>
+          <w:p>
+            <w:pPr>
+              <w:keepNext/>
+              <w:spacing w:line="240" w:lineRule="auto" w:after="0"/>
+            </w:pPr>
+            <w:r>
+              <w:rPr>
+                <w:b/>
+              </w:rPr>
+            </w:r>
+            <w:r>
+              <w:rPr>
+                <w:b/>
+                <w:sz w:val="17"/>
+              </w:rPr>
+              <w:t>LLM raw</w:t>
+            </w:r>
+          </w:p>
+        </w:tc>
+        <w:tc>
+          <w:tcPr>
+            <w:tcW w:type="dxa" w:w="1881"/>
+          </w:tcPr>
+          <w:p>
+            <w:pPr>
+              <w:keepNext/>
+              <w:spacing w:line="240" w:lineRule="auto" w:after="0"/>
+            </w:pPr>
+            <w:r>
+              <w:rPr>
+                <w:b/>
+              </w:rPr>
+            </w:r>
+            <w:r>
+              <w:rPr>
+                <w:b/>
+                <w:sz w:val="17"/>
+              </w:rPr>
+              <w:t>LLM, unsupported demoted</w:t>
+            </w:r>
+          </w:p>
+        </w:tc>
+        <w:tc>
+          <w:tcPr>
+            <w:tcW w:type="dxa" w:w="1881"/>
+          </w:tcPr>
+          <w:p>
+            <w:pPr>
+              <w:keepNext/>
+              <w:spacing w:line="240" w:lineRule="auto" w:after="0"/>
+            </w:pPr>
+            <w:r>
+              <w:rPr>
+                <w:b/>
+              </w:rPr>
+            </w:r>
+            <w:r>
+              <w:rPr>
+                <w:b/>
+                <w:sz w:val="17"/>
+              </w:rPr>
+              <w:t>LLM, unsupported removed</w:t>
+            </w:r>
+          </w:p>
+        </w:tc>
+        <w:tc>
+          <w:tcPr>
+            <w:tcW w:type="dxa" w:w="1881"/>
+          </w:tcPr>
+          <w:p>
+            <w:pPr>
+              <w:keepNext/>
+              <w:spacing w:line="240" w:lineRule="auto" w:after="0"/>
+            </w:pPr>
+            <w:r>
+              <w:rPr>
+                <w:b/>
+              </w:rPr>
+            </w:r>
+            <w:r>
+              <w:rPr>
+                <w:b/>
+                <w:sz w:val="17"/>
+              </w:rPr>
+              <w:t>Engine v7</w:t>
+            </w:r>
+          </w:p>
+        </w:tc>
+      </w:tr>
+      <w:tr>
+        <w:trPr>
+          <w:cantSplit/>
+        </w:trPr>
+        <w:tc>
+          <w:tcPr>
+            <w:tcW w:type="dxa" w:w="1881"/>
+          </w:tcPr>
+          <w:p>
+            <w:pPr>
+              <w:keepNext/>
+              <w:spacing w:line="240" w:lineRule="auto" w:after="0"/>
+            </w:pPr>
+            <w:r/>
+            <w:r>
+              <w:rPr>
+                <w:sz w:val="17"/>
+              </w:rPr>
+              <w:t>Top-5 unsupported assertions (of mapped, verifiable)</w:t>
+            </w:r>
+          </w:p>
+        </w:tc>
+        <w:tc>
+          <w:tcPr>
+            <w:tcW w:type="dxa" w:w="1881"/>
+          </w:tcPr>
+          <w:p>
+            <w:pPr>
+              <w:keepNext/>
+              <w:spacing w:line="240" w:lineRule="auto" w:after="0"/>
+            </w:pPr>
+            <w:r/>
+            <w:r>
+              <w:rPr>
+                <w:sz w:val="17"/>
+              </w:rPr>
+              <w:t>140/1,486 (9.4%)</w:t>
+            </w:r>
+          </w:p>
+        </w:tc>
+        <w:tc>
+          <w:tcPr>
+            <w:tcW w:type="dxa" w:w="1881"/>
+          </w:tcPr>
+          <w:p>
+            <w:pPr>
+              <w:keepNext/>
+              <w:spacing w:line="240" w:lineRule="auto" w:after="0"/>
+            </w:pPr>
+            <w:r/>
+            <w:r>
+              <w:rPr>
+                <w:sz w:val="17"/>
+              </w:rPr>
+              <w:t>84/1,464 (5.7%)</w:t>
+            </w:r>
+          </w:p>
+        </w:tc>
+        <w:tc>
+          <w:tcPr>
+            <w:tcW w:type="dxa" w:w="1881"/>
+          </w:tcPr>
+          <w:p>
+            <w:pPr>
+              <w:keepNext/>
+              <w:spacing w:line="240" w:lineRule="auto" w:after="0"/>
+            </w:pPr>
+            <w:r/>
+            <w:r>
+              <w:rPr>
+                <w:sz w:val="17"/>
+              </w:rPr>
+              <w:t>—</w:t>
+            </w:r>
+          </w:p>
+        </w:tc>
+        <w:tc>
+          <w:tcPr>
+            <w:tcW w:type="dxa" w:w="1881"/>
+          </w:tcPr>
+          <w:p>
+            <w:pPr>
+              <w:keepNext/>
+              <w:spacing w:line="240" w:lineRule="auto" w:after="0"/>
+            </w:pPr>
+            <w:r/>
+            <w:r>
+              <w:rPr>
+                <w:sz w:val="17"/>
+              </w:rPr>
+              <w:t>233/1,518 (15.3%)</w:t>
+            </w:r>
+          </w:p>
+        </w:tc>
+      </w:tr>
+      <w:tr>
+        <w:trPr>
+          <w:cantSplit/>
+        </w:trPr>
+        <w:tc>
+          <w:tcPr>
+            <w:tcW w:type="dxa" w:w="1881"/>
+          </w:tcPr>
+          <w:p>
+            <w:pPr>
+              <w:keepNext/>
+              <w:spacing w:line="240" w:lineRule="auto" w:after="0"/>
+            </w:pPr>
+            <w:r/>
+            <w:r>
+              <w:rPr>
+                <w:sz w:val="17"/>
+              </w:rPr>
+              <w:t>of which defining analyte absent</w:t>
+            </w:r>
+          </w:p>
+        </w:tc>
+        <w:tc>
+          <w:tcPr>
+            <w:tcW w:type="dxa" w:w="1881"/>
+          </w:tcPr>
+          <w:p>
+            <w:pPr>
+              <w:keepNext/>
+              <w:spacing w:line="240" w:lineRule="auto" w:after="0"/>
+            </w:pPr>
+            <w:r/>
+            <w:r>
+              <w:rPr>
+                <w:sz w:val="17"/>
+              </w:rPr>
+              <w:t>10</w:t>
+            </w:r>
+          </w:p>
+        </w:tc>
+        <w:tc>
+          <w:tcPr>
+            <w:tcW w:type="dxa" w:w="1881"/>
+          </w:tcPr>
+          <w:p>
+            <w:pPr>
+              <w:keepNext/>
+              <w:spacing w:line="240" w:lineRule="auto" w:after="0"/>
+            </w:pPr>
+            <w:r/>
+            <w:r>
+              <w:rPr>
+                <w:sz w:val="17"/>
+              </w:rPr>
+              <w:t>—</w:t>
+            </w:r>
+          </w:p>
+        </w:tc>
+        <w:tc>
+          <w:tcPr>
+            <w:tcW w:type="dxa" w:w="1881"/>
+          </w:tcPr>
+          <w:p>
+            <w:pPr>
+              <w:keepNext/>
+              <w:spacing w:line="240" w:lineRule="auto" w:after="0"/>
+            </w:pPr>
+            <w:r/>
+            <w:r>
+              <w:rPr>
+                <w:sz w:val="17"/>
+              </w:rPr>
+              <w:t>—</w:t>
+            </w:r>
+          </w:p>
+        </w:tc>
+        <w:tc>
+          <w:tcPr>
+            <w:tcW w:type="dxa" w:w="1881"/>
+          </w:tcPr>
+          <w:p>
+            <w:pPr>
+              <w:keepNext/>
+              <w:spacing w:line="240" w:lineRule="auto" w:after="0"/>
+            </w:pPr>
+            <w:r/>
+            <w:r>
+              <w:rPr>
+                <w:sz w:val="17"/>
+              </w:rPr>
+              <w:t>0</w:t>
+            </w:r>
+          </w:p>
+        </w:tc>
+      </w:tr>
+      <w:tr>
+        <w:trPr>
+          <w:cantSplit/>
+        </w:trPr>
+        <w:tc>
+          <w:tcPr>
+            <w:tcW w:type="dxa" w:w="1881"/>
+          </w:tcPr>
+          <w:p>
+            <w:pPr>
+              <w:keepNext/>
+              <w:spacing w:line="240" w:lineRule="auto" w:after="0"/>
+            </w:pPr>
+            <w:r/>
+            <w:r>
+              <w:rPr>
+                <w:sz w:val="17"/>
+              </w:rPr>
+              <w:t>recall@1</w:t>
+            </w:r>
+          </w:p>
+        </w:tc>
+        <w:tc>
+          <w:tcPr>
+            <w:tcW w:type="dxa" w:w="1881"/>
+          </w:tcPr>
+          <w:p>
+            <w:pPr>
+              <w:keepNext/>
+              <w:spacing w:line="240" w:lineRule="auto" w:after="0"/>
+            </w:pPr>
+            <w:r/>
+            <w:r>
+              <w:rPr>
+                <w:sz w:val="17"/>
+              </w:rPr>
+              <w:t>28.2</w:t>
+            </w:r>
+          </w:p>
+        </w:tc>
+        <w:tc>
+          <w:tcPr>
+            <w:tcW w:type="dxa" w:w="1881"/>
+          </w:tcPr>
+          <w:p>
+            <w:pPr>
+              <w:keepNext/>
+              <w:spacing w:line="240" w:lineRule="auto" w:after="0"/>
+            </w:pPr>
+            <w:r/>
+            <w:r>
+              <w:rPr>
+                <w:sz w:val="17"/>
+              </w:rPr>
+              <w:t>29.4 (+1.2; 0.2 to 2.3)</w:t>
+            </w:r>
+          </w:p>
+        </w:tc>
+        <w:tc>
+          <w:tcPr>
+            <w:tcW w:type="dxa" w:w="1881"/>
+          </w:tcPr>
+          <w:p>
+            <w:pPr>
+              <w:keepNext/>
+              <w:spacing w:line="240" w:lineRule="auto" w:after="0"/>
+            </w:pPr>
+            <w:r/>
+            <w:r>
+              <w:rPr>
+                <w:sz w:val="17"/>
+              </w:rPr>
+              <w:t>29.4</w:t>
+            </w:r>
+          </w:p>
+        </w:tc>
+        <w:tc>
+          <w:tcPr>
+            <w:tcW w:type="dxa" w:w="1881"/>
+          </w:tcPr>
+          <w:p>
+            <w:pPr>
+              <w:keepNext/>
+              <w:spacing w:line="240" w:lineRule="auto" w:after="0"/>
+            </w:pPr>
+            <w:r/>
+            <w:r>
+              <w:rPr>
+                <w:sz w:val="17"/>
+              </w:rPr>
+              <w:t>24.0</w:t>
+            </w:r>
+          </w:p>
+        </w:tc>
+      </w:tr>
+      <w:tr>
+        <w:trPr>
+          <w:cantSplit/>
+        </w:trPr>
+        <w:tc>
+          <w:tcPr>
+            <w:tcW w:type="dxa" w:w="1881"/>
+          </w:tcPr>
+          <w:p>
+            <w:pPr>
+              <w:keepNext/>
+              <w:spacing w:line="240" w:lineRule="auto" w:after="0"/>
+            </w:pPr>
+            <w:r/>
+            <w:r>
+              <w:rPr>
+                <w:sz w:val="17"/>
+              </w:rPr>
+              <w:t>recall@5</w:t>
+            </w:r>
+          </w:p>
+        </w:tc>
+        <w:tc>
+          <w:tcPr>
+            <w:tcW w:type="dxa" w:w="1881"/>
+          </w:tcPr>
+          <w:p>
+            <w:pPr>
+              <w:keepNext/>
+              <w:spacing w:line="240" w:lineRule="auto" w:after="0"/>
+            </w:pPr>
+            <w:r/>
+            <w:r>
+              <w:rPr>
+                <w:sz w:val="17"/>
+              </w:rPr>
+              <w:t>59.6</w:t>
+            </w:r>
+          </w:p>
+        </w:tc>
+        <w:tc>
+          <w:tcPr>
+            <w:tcW w:type="dxa" w:w="1881"/>
+          </w:tcPr>
+          <w:p>
+            <w:pPr>
+              <w:keepNext/>
+              <w:spacing w:line="240" w:lineRule="auto" w:after="0"/>
+            </w:pPr>
+            <w:r/>
+            <w:r>
+              <w:rPr>
+                <w:sz w:val="17"/>
+              </w:rPr>
+              <w:t>59.4 (−0.2; −0.5 to 0.0)</w:t>
+            </w:r>
+          </w:p>
+        </w:tc>
+        <w:tc>
+          <w:tcPr>
+            <w:tcW w:type="dxa" w:w="1881"/>
+          </w:tcPr>
+          <w:p>
+            <w:pPr>
+              <w:keepNext/>
+              <w:spacing w:line="240" w:lineRule="auto" w:after="0"/>
+            </w:pPr>
+            <w:r/>
+            <w:r>
+              <w:rPr>
+                <w:sz w:val="17"/>
+              </w:rPr>
+              <w:t>58.4 (−1.2; −2.1 to −0.4)</w:t>
+            </w:r>
+          </w:p>
+        </w:tc>
+        <w:tc>
+          <w:tcPr>
+            <w:tcW w:type="dxa" w:w="1881"/>
+          </w:tcPr>
+          <w:p>
+            <w:pPr>
+              <w:keepNext/>
+              <w:spacing w:line="240" w:lineRule="auto" w:after="0"/>
+            </w:pPr>
+            <w:r/>
+            <w:r>
+              <w:rPr>
+                <w:sz w:val="17"/>
+              </w:rPr>
+              <w:t>60.7</w:t>
+            </w:r>
+          </w:p>
+        </w:tc>
+      </w:tr>
+      <w:tr>
+        <w:trPr>
+          <w:cantSplit/>
+        </w:trPr>
+        <w:tc>
+          <w:tcPr>
+            <w:tcW w:type="dxa" w:w="1881"/>
+          </w:tcPr>
+          <w:p>
+            <w:pPr>
+              <w:keepNext/>
+              <w:spacing w:line="240" w:lineRule="auto" w:after="0"/>
+            </w:pPr>
+            <w:r/>
+            <w:r>
+              <w:rPr>
+                <w:sz w:val="17"/>
+              </w:rPr>
+              <w:t>recall@10</w:t>
+            </w:r>
+          </w:p>
+        </w:tc>
+        <w:tc>
+          <w:tcPr>
+            <w:tcW w:type="dxa" w:w="1881"/>
+          </w:tcPr>
+          <w:p>
+            <w:pPr>
+              <w:keepNext/>
+              <w:spacing w:line="240" w:lineRule="auto" w:after="0"/>
+            </w:pPr>
+            <w:r/>
+            <w:r>
+              <w:rPr>
+                <w:sz w:val="17"/>
+              </w:rPr>
+              <w:t>65.1</w:t>
+            </w:r>
+          </w:p>
+        </w:tc>
+        <w:tc>
+          <w:tcPr>
+            <w:tcW w:type="dxa" w:w="1881"/>
+          </w:tcPr>
+          <w:p>
+            <w:pPr>
+              <w:keepNext/>
+              <w:spacing w:line="240" w:lineRule="auto" w:after="0"/>
+            </w:pPr>
+            <w:r/>
+            <w:r>
+              <w:rPr>
+                <w:sz w:val="17"/>
+              </w:rPr>
+              <w:t>65.1</w:t>
+            </w:r>
+          </w:p>
+        </w:tc>
+        <w:tc>
+          <w:tcPr>
+            <w:tcW w:type="dxa" w:w="1881"/>
+          </w:tcPr>
+          <w:p>
+            <w:pPr>
+              <w:keepNext/>
+              <w:spacing w:line="240" w:lineRule="auto" w:after="0"/>
+            </w:pPr>
+            <w:r/>
+            <w:r>
+              <w:rPr>
+                <w:sz w:val="17"/>
+              </w:rPr>
+              <w:t>63.8 (−1.3)</w:t>
+            </w:r>
+          </w:p>
+        </w:tc>
+        <w:tc>
+          <w:tcPr>
+            <w:tcW w:type="dxa" w:w="1881"/>
+          </w:tcPr>
+          <w:p>
+            <w:pPr>
+              <w:keepNext/>
+              <w:spacing w:line="240" w:lineRule="auto" w:after="0"/>
+            </w:pPr>
+            <w:r/>
+            <w:r>
+              <w:rPr>
+                <w:sz w:val="17"/>
+              </w:rPr>
+              <w:t>72.0</w:t>
+            </w:r>
+          </w:p>
+        </w:tc>
+      </w:tr>
+      <w:tr>
+        <w:trPr>
+          <w:cantSplit/>
+        </w:trPr>
+        <w:tc>
+          <w:tcPr>
+            <w:tcW w:type="dxa" w:w="1881"/>
+          </w:tcPr>
+          <w:p>
+            <w:pPr>
+              <w:spacing w:line="240" w:lineRule="auto" w:after="0"/>
+            </w:pPr>
+            <w:r/>
+            <w:r>
+              <w:rPr>
+                <w:sz w:val="17"/>
+              </w:rPr>
+              <w:t>Demoted entries that were clinician labels</w:t>
+            </w:r>
+          </w:p>
+        </w:tc>
+        <w:tc>
+          <w:tcPr>
+            <w:tcW w:type="dxa" w:w="1881"/>
+          </w:tcPr>
+          <w:p>
+            <w:pPr>
+              <w:spacing w:line="240" w:lineRule="auto" w:after="0"/>
+            </w:pPr>
+            <w:r/>
+            <w:r>
+              <w:rPr>
+                <w:sz w:val="17"/>
+              </w:rPr>
+              <w:t>—</w:t>
+            </w:r>
+          </w:p>
+        </w:tc>
+        <w:tc>
+          <w:tcPr>
+            <w:tcW w:type="dxa" w:w="1881"/>
+          </w:tcPr>
+          <w:p>
+            <w:pPr>
+              <w:spacing w:line="240" w:lineRule="auto" w:after="0"/>
+            </w:pPr>
+            <w:r/>
+            <w:r>
+              <w:rPr>
+                <w:sz w:val="17"/>
+              </w:rPr>
+              <w:t>10/197 (5.1%)</w:t>
+            </w:r>
+          </w:p>
+        </w:tc>
+        <w:tc>
+          <w:tcPr>
+            <w:tcW w:type="dxa" w:w="1881"/>
+          </w:tcPr>
+          <w:p>
+            <w:pPr>
+              <w:spacing w:line="240" w:lineRule="auto" w:after="0"/>
+            </w:pPr>
+            <w:r/>
+            <w:r>
+              <w:rPr>
+                <w:sz w:val="17"/>
+              </w:rPr>
+              <w:t>10/197</w:t>
+            </w:r>
+          </w:p>
+        </w:tc>
+        <w:tc>
+          <w:tcPr>
+            <w:tcW w:type="dxa" w:w="1881"/>
+          </w:tcPr>
+          <w:p>
+            <w:pPr>
+              <w:spacing w:line="240" w:lineRule="auto" w:after="0"/>
+            </w:pPr>
+            <w:r/>
+            <w:r>
+              <w:rPr>
+                <w:sz w:val="17"/>
+              </w:rPr>
+              <w:t>—</w:t>
+            </w:r>
+          </w:p>
+        </w:tc>
+      </w:tr>
+    </w:tbl>
+    <w:p/>
+    <w:p>
+      <w:pPr>
         <w:pStyle w:val="Heading1"/>
       </w:pPr>
       <w:r>
@@ -8541,7 +9304,7 @@
     </w:p>
     <w:p>
       <w:r>
-        <w:t>Notes: Note 1 SAP and amendments; Table S1 engine change log C1–C16 with sources; Table S2 quarantine criteria and outcomes (rounds 1 and 2); Note 2 LLM comparison protocol; Table S3 participant flow and baseline characteristics; Note 3 fusion/Theory-of-Evidence algorithm and consistency identities; Table S4 subgroup recall; Table S5 next-test utility (engine v5.3, superseded metric); Tables S6–S6c calibration, recalibration, decision curves, multiplicity and panel-size sensitivity; Table S7 survey-weighted NHANES AUROC; Table S8 per-group calibration; Table S9 label-mapping audit (400 stays); Table S10 registry count reconciliation; Table S11 precision/F1/NDCG, alert burden, per-group PPV and prevalence baseline; Table S12 fusion-weight sensitivity; Table S12b historical comparisons (superseded); Table S13 participant flow for the UCI cohorts; Table S15 open vs proprietary components; Table S16 sepsis companion model; Note 4 regression gate; Note 5 definitions, audits and completed TRIPOD+AI checklist; Note 6 version manifest; Note 7 evidence triage of twelve proposals; Note 8 source-concordance audit; Notes 9–12 material moved from the main text; Note 13 black-box property-conformance benchmark (engine and LLM on identical perturbed panels); Fig. S1 provenance audit; Fig. S2 per-release eICU metrics; Fig. S3 per-group panel-supported recall; Fig. S4 per-group calibration; Fig. S5 context-echo analysis; Fig. S6 historical LLM comparison vs engine v5.1; Fig. S7 participant flow; Data 1 per-stay outputs and LLM prompts/outputs.</w:t>
+        <w:t>Notes: Note 1 SAP and amendments; Table S1 engine change log C1–C16 with sources; Table S2 quarantine criteria and outcomes (rounds 1 and 2); Note 2 LLM comparison protocol; Table S3 participant flow and baseline characteristics; Note 3 fusion/Theory-of-Evidence algorithm and consistency identities; Table S4 subgroup recall; Table S5 next-test utility (engine v5.3, superseded metric); Tables S6–S6c calibration, recalibration, decision curves, multiplicity and panel-size sensitivity; Table S7 survey-weighted NHANES AUROC; Table S8 per-group calibration; Table S9 label-mapping audit (400 stays); Table S10 registry count reconciliation; Table S11 precision/F1/NDCG, alert burden, per-group PPV and prevalence baseline; Table S12 fusion-weight sensitivity; Table S12b historical comparisons (superseded); Table S13 participant flow for the UCI cohorts; Table S15 open vs proprietary components; Table S16 sepsis companion model; Note 4 regression gate; Note 5 definitions, audits and completed TRIPOD+AI checklist; Note 6 version manifest; Note 7 evidence triage of twelve proposals; Note 8 source-concordance audit; Notes 9–12 material moved from the main text; Note 13 black-box property-conformance benchmark (engine and LLM on identical perturbed panels); Note 14 executable verifier behind the LLM; Fig. S1 provenance audit; Fig. S2 per-release eICU metrics; Fig. S3 per-group panel-supported recall; Fig. S4 per-group calibration; Fig. S5 context-echo analysis; Fig. S6 historical LLM comparison vs engine v5.1; Fig. S7 participant flow; Data 1 per-stay outputs and LLM prompts/outputs.</w:t>
       </w:r>
     </w:p>
     <w:p>

</xml_diff>

<commit_message>
Verified consensus arm (eval/consensus): pre-specified negative result; §3.8–3.9 condensed, Table 7 column, Discussion; Supplementary Note 14 extended; intro trimmed
</commit_message>
<xml_diff>
--- a/docs/paper1/v7/Paper1_Hemoglyph_CMPB_EN_v7_R6.docx
+++ b/docs/paper1/v7/Paper1_Hemoglyph_CMPB_EN_v7_R6.docx
@@ -202,12 +202,12 @@
     </w:p>
     <w:p>
       <w:r>
-        <w:t>Large language models have changed one part of this picture: a guideline-transcribed rule base that would once have taken a committee years can now be drafted in weeks. This creates a new software-engineering problem rather than solving an old one. An AI-drafted rule is a hypothesis about what a source says; nobody has read most of them; and the conventional validation of such engines—vignettes written by the same authors, a single institution, no comparator [12]—cannot detect either mistranscription or ranking defects. Mature diagnostic decision-support systems (Isabel, DXplain) have been compared with GPT-4-class models on 36–201 symptom cases [13–16], formal verification has been applied to the acquisition of guideline-derived knowledge models [17], and external-validation methodology for learned models is well developed [18]; but no method has been described for verifying a large AI-drafted laboratory rule base, and the public infrastructure for executable guideline knowledge has contracted: AHRQ CDS Connect went offline in April 2025 and a dated search found no openly licensed, machine-executable rule set for laboratory-panel interpretation (Supplementary Note 5).</w:t>
+        <w:t>LLMs have changed one part of this picture: a guideline-transcribed rule base that once took a committee years can now be drafted in weeks. This creates a software-engineering problem rather than solving a clinical one: an AI-drafted rule is a hypothesis about what a source says, nobody has read most of them, and conventional validation—authors' vignettes, one institution, no comparator [12]—detects neither mistranscription nor ranking defects. Mature diagnostic decision-support systems (Isabel, DXplain) have been compared with GPT-4-class models on 36–201 symptom cases [13–16], formal verification has been applied to the acquisition of guideline-derived knowledge models [17], and external-validation methodology for learned models is well developed [18]; but no method has been described for verifying a large AI-drafted laboratory rule base, and the public infrastructure for executable guideline knowledge has contracted: AHRQ CDS Connect went offline in April 2025 and a dated search found no openly licensed, machine-executable rule set for laboratory-panel interpretation (Supplementary Note 5).</w:t>
       </w:r>
     </w:p>
     <w:p>
       <w:r>
-        <w:t>This paper treats the rule base as software and asks how it can be verified. We contribute (i) a property-based test suite that states invariants any correct laboratory-interpretation engine must satisfy and checks them on randomised panels; (ii) a source-concordance protocol, frozen before sampling, that reports with explicit denominators whether a rule transcribes what its locator says; and (iii) a hash-frozen, one-shot, multi-dataset benchmark with a supervised baseline, an ablation and a blinded comparison against a frontier LLM, in which a failed quarantine round is reported rather than discarded. The invariant suite and the audit protocol are engine-agnostic—they require only that a rule be expressed as analyte, operator, threshold, unit, population gate and source locator—and are released as standalone tools. This paper does not claim that the engine is accurate; it claims that the engine is verifiable, and shows what verification finds. The object of study is Hemoglyph (</w:t>
+        <w:t>This paper treats the rule base as software and asks how it can be verified. We contribute (i) a property-based test suite that states invariants any correct laboratory-interpretation engine must satisfy and checks them on randomised panels; (ii) a source-concordance protocol, frozen before sampling, that reports with explicit denominators whether a rule transcribes what its locator says; and (iii) a hash-frozen, one-shot, multi-dataset benchmark with a supervised baseline, an ablation and a blinded comparison against a frontier LLM, in which a failed quarantine round is reported rather than discarded; the invariants are additionally run as a black box on the LLM and as a verifier behind it. Suite and protocol are engine-agnostic—they require only that a rule be expressed as analyte, operator, threshold, unit, population gate and source locator—and are released as standalone tools. The paper does not claim that the engine is accurate; it claims that it is verifiable, and shows what verification finds. The object of study is Hemoglyph (</w:t>
       </w:r>
       <w:r>
         <w:rPr>
@@ -216,7 +216,7 @@
         <w:t>analyse_gidlines.py</w:t>
       </w:r>
       <w:r>
-        <w:t>, v7), an offline single-process engine with 33,183 guideline-transcribed rules, 99.2% of them AI-drafted by a non-clinician first author and none clinically audited. The engine is the same file that ships inside a proprietary desktop product owned by the first author; this interest is declared and motivated the frozen design. Only the inference engine fed with structured analyte–value pairs is evaluated; the optical-character-recognition front end is not. We make no claim of clinical validation.</w:t>
+        <w:t>, v7), an offline single-process engine with 33,183 guideline-transcribed rules, 99.2% of them AI-drafted by a non-clinician first author and none clinically audited. The same file ships inside a proprietary desktop product owned by the first author; this interest is declared and motivated the frozen design. Only the inference engine fed with structured analyte–value pairs is evaluated, not the optical-character-recognition front end; no clinical validation is claimed.</w:t>
       </w:r>
     </w:p>
     <w:p>
@@ -329,13 +329,31 @@
         <w:t>executable verifier</w:t>
       </w:r>
       <w:r>
-        <w:t xml:space="preserve"> behind the LLM: each entry of the 400 stored blind readings was mapped to a label group and checked against its own panel as supported, contradicted (defining analyte present, criterion not met), analyte-absent, or not verifiable (no criterion, or no mapped group); unsupported entries were demoted below all others and recall and the unsupported-assertion rate re-scored. The engine's own top-5 was passed through the same verifier. Protocol and predictions were committed before computation; no LLM call was made (</w:t>
+        <w:t xml:space="preserve"> behind the LLM: each entry of the 400 stored blind readings was mapped to a label group and checked against its own panel as supported, contradicted (defining analyte present, criterion not met), analyte-absent, or not verifiable (no criterion, or no mapped group); unsupported entries were demoted below all others and recall and the unsupported-assertion rate re-scored. The engine's own top-5 was passed through the same verifier. A </w:t>
+      </w:r>
+      <w:r>
+        <w:rPr>
+          <w:i/>
+        </w:rPr>
+        <w:t>verified consensus</w:t>
+      </w:r>
+      <w:r>
+        <w:t xml:space="preserve"> arm was then specified with one parameter-free rule—reciprocal-rank fusion (k = 0) of the engine's ranking with the LLM entries the verifier marked supported, all other LLM entries discarded—with the registered rule that recall@5 below 62% would be reported as "not complementary". Protocols and predictions were committed before computation; no LLM call was made (</w:t>
       </w:r>
       <w:r>
         <w:rPr>
           <w:rFonts w:ascii="Consolas" w:hAnsi="Consolas"/>
         </w:rPr>
         <w:t>eval/verifier/</w:t>
+      </w:r>
+      <w:r>
+        <w:t xml:space="preserve">, </w:t>
+      </w:r>
+      <w:r>
+        <w:rPr>
+          <w:rFonts w:ascii="Consolas" w:hAnsi="Consolas"/>
+        </w:rPr>
+        <w:t>eval/consensus/</w:t>
       </w:r>
       <w:r>
         <w:t>).</w:t>
@@ -599,7 +617,7 @@
     </w:p>
     <w:p>
       <w:r>
-        <w:t>Table 6 reports four properties run on both systems. Re-expressing 40 panels in SI units left the engine's top-5 set identical in 40/40 (mean Jaccard 1.00) and the LLM's in 8/40 (0.72); shuffling order and adding distractors, 35/40 (0.96) versus 10/40 (0.73). The LLM figures are measured against its first reading from an earlier session and therefore include its test–retest variability (κ 0.69); the engine's are deterministic. The first engine run gave 36/40 on SI units, and all four discrepancies traced to one defect the in-process suite had not reached: a record mirrored under a legacy internal identifier kept its reported unit, so a normal bilirubin of 9 µmol/L was compared with an 8 mg/dL panic threshold, raising a false critical alert and a spurious cholestasis entry. The fix (v8.2) has a regression test that fails before and passes after it; the frozen v7 numbers are untouched. On the creatinine ladder the engine violated monotonicity in 2/20 stays at the ×2.0 step (logged, not changed); the LLM's 0/20 is not blind because the ladder step was visible to it. After removal of the defining analyte, the target diagnosis remained at rank ≤ 5 in 3/40 engine and 14/40 LLM panels; restricted post hoc to the 29 panels with no redundant analyte left, 1/29 versus 4/29. In the earlier blinded NHANES test (40 guideline-healthy adults), the engine asserted no disease and the LLM four (Table 6; Supplementary Note 13).</w:t>
+        <w:t>Table 6 reports four properties run on both systems. SI units left the engine's top-5 identical in 40/40 panels (Jaccard 1.00) and the LLM's in 8/40 (0.72); shuffled order with distractors, 35/40 (0.96) versus 10/40 (0.73). The LLM figures are measured against its first reading from an earlier session and so include its test–retest variability (κ 0.69); the engine's are deterministic. The first engine run gave 36/40 on SI units; all four discrepancies traced to one defect the in-process suite had not reached—a record mirrored under a legacy internal identifier kept its reported unit, so a normal bilirubin of 9 µmol/L met an 8 mg/dL panic threshold. The fix (v8.2) has a regression test that fails before and passes after it; the frozen v7 numbers are untouched. The engine violated creatinine monotonicity in 2/20 ladders at ×2.0 (logged, not changed; the LLM's 0/20 is not blind because the step was visible). After removal of the defining analyte, the target remained at rank ≤ 5 in 3/40 engine and 14/40 LLM panels (1/29 versus 4/29 with no redundant analyte left, post hoc). In the earlier blinded NHANES test the engine asserted no disease in 40 guideline-healthy adults and the LLM four (Supplementary Note 13).</w:t>
       </w:r>
     </w:p>
     <w:p>
@@ -610,12 +628,12 @@
         <w:rPr>
           <w:color w:val="303030"/>
         </w:rPr>
-        <w:t>3.9 The engine's criteria as an executable verifier behind the LLM</w:t>
+        <w:t>3.9 The engine's criteria as a verifier behind the LLM, and a pre-specified negative result</w:t>
       </w:r>
     </w:p>
     <w:p>
       <w:r>
-        <w:t>Of 2,424 LLM entries, 1,636 mapped to a group with a criterion (1,439 supported, 182 contradicted, 15 analyte-absent); 788 were not verifiable (Table 7). Among mapped top-5 entries, 140/1,486 (9.4%) were unsupported—below the registered 15–30%—10 of them without the defining analyte in the panel; the engine's own top-5 failed the same proxy criteria in 233/1,518 (15.3%; registered 5–15%) but never without the analyte (0/1,518). Demoting unsupported LLM entries left recall@5 unchanged (59.6 → 59.4%, paired difference −0.2, 95% CI −0.5 to 0.0) and raised recall@1 by 1.2 points (28.2 → 29.4%, CI 0.2–2.3, p = 0.014), halving the unsupported share to 5.7% (registered &lt; 5%); removing them cost 1.2 points at rank 5. Of 197 demoted entries 10 were clinician labels (5.1%; registered ≤ 10%): five synonym-map artefacts (respiratory acidosis matched by "acidosis"; compound names) and five borderline values (glucose 134 mg/dL, creatinine 0.94, INR 1.4, two early-DKA calls with bicarbonate 24 or absent); post hoc, the respiratory-acidosis artefact alone lowers the LLM's raw rate to 7.1%. The engine's failures concentrate in the diabetes/hyperglycaemia groups (criterion stricter than its hyperglycaemia rule) and in renal entries ranked from the urea:creatinine ratio at creatinine 0.9–1.2 mg/dL (Supplementary Note 14). Two of five registered predictions were met.</w:t>
+        <w:t>Of 2,424 LLM entries, 1,636 mapped to a group with a criterion (1,439 supported, 182 contradicted, 15 analyte-absent); 788 were not verifiable (Table 7). Among mapped top-5 entries 140/1,486 (9.4%) were unsupported—below the registered 15–30%—10 of them without the defining analyte in the panel; the engine's own top-5 failed the same proxy criteria in 233/1,518 (15.3%; registered 5–15%), mostly where its hyperglycaemia and prerenal rules are more permissive than the criterion, but never without the analyte (0/1,518). Demoting unsupported LLM entries left recall@5 unchanged (59.6 → 59.4%; paired −0.2, 95% CI −0.5 to 0.0), raised recall@1 by 1.2 points (CI 0.2–2.3, p = 0.014) and halved the unsupported share to 5.7% (registered &lt; 5%); removing them cost 1.2 points at rank 5. Of 197 demoted entries 10 were clinician labels (5.1%; registered ≤ 10%)—five synonym-map artefacts (respiratory acidosis matched by "acidosis"), five borderline values (Supplementary Note 14). A parameter-free fusion of the engine's ranking with the supported LLM entries then gave recall@1/5/10 of 21.8/61.2/76.3%: below the registered 62% at rank 5 (+0.6 versus the engine, CI −2.2 to 3.4), worse than both at rank 1, better only at rank 10 (+4.5, CI 2.2–6.8) and on criterion-met labels (82.1% versus 77.9/81.0%), while outcome-type labels fell from 51.9% to 42.7%. The mechanism is structural: the filter admits only the verifiable, so every second vote goes to criterion-defined groups and the constellation-ranked syndromes are displaced. Per protocol the systems are reported as not complementary under this rule; no other rule was tried.</w:t>
       </w:r>
     </w:p>
     <w:p>
@@ -645,7 +663,7 @@
         <w:t>behind</w:t>
       </w:r>
       <w:r>
-        <w:t xml:space="preserve"> the LLM: demoting entries the panel does not support removed 40% of its unsupported top-5 assertions at no recall cost (Section 3.9)—and flagged the engine's own output more often, so executable verification is a check on both systems, not a privilege of one. But they establish logical consistency, not correctness—a mistranscribed threshold passes every invariant—and the concordance audit shows why correctness is hard to reach: the limiting factor was not rater effort but locator granularity. Organisation-level URLs and generic standards make 92% of rules uncheckable, and where checking was possible the error was usually attribution. Audit protocols for such rule bases should require the verbatim source sentence for every verdict, and auditable registries should carry section- or table-level locators; both are planned for release 15, with re-sourcing or retirement of the 46 sampled generic-standard citations and correction of the five anchor attribution errors. Concordance is necessary, not sufficient: an independent clinical audit is the next step and outside this paper. Both tools transfer without change to any rule base whose records carry analyte, operator, threshold, unit, population and locator—including rule sets generated by retrieval-augmented LLM pipelines—and the benchmark scripts run unchanged on the credentialed full eICU and MIMIC-IV releases.</w:t>
+        <w:t xml:space="preserve"> the LLM: demoting entries the panel does not support removed 40% of its unsupported top-5 assertions at no recall cost (Section 3.9)—and flagged the engine's own output more often, so executable verification is a check on both systems, not a privilege of one. Fusing the two through the verifier did not help at rank 5 (Section 3.9): filtering admits only the verifiable, and the engine's residual advantage lies precisely in the outcome syndromes no single criterion verifies—a pre-specified negative result that bounds what "neuro-symbolic" combination can add on this reference. But they establish logical consistency, not correctness—a mistranscribed threshold passes every invariant—and the concordance audit shows why correctness is hard to reach: the limiting factor was not rater effort but locator granularity. Organisation-level URLs and generic standards make 92% of rules uncheckable, and where checking was possible the error was usually attribution. Audit protocols for such rule bases should require the verbatim source sentence for every verdict, and auditable registries should carry section- or table-level locators; both are planned for release 15, with re-sourcing or retirement of the 46 sampled generic-standard citations and correction of the five anchor attribution errors. Concordance is necessary, not sufficient: an independent clinical audit is the next step and outside this paper. Both tools transfer without change to any rule base whose records carry analyte, operator, threshold, unit, population and locator—including rule sets generated by retrieval-augmented LLM pipelines—and the benchmark scripts run unchanged on the credentialed full eICU and MIMIC-IV releases.</w:t>
       </w:r>
     </w:p>
     <w:p>
@@ -8586,7 +8604,7 @@
         <w:rPr>
           <w:sz w:val="20"/>
         </w:rPr>
-        <w:t xml:space="preserve"> Unsupported = contradicted or analyte-absent among entries mapped to a group with a criterion; recall against clinician labels (596) with stay-clustered bootstrap; protocol and predictions committed before computation.</w:t>
+        <w:t xml:space="preserve"> Unsupported = contradicted or analyte-absent among entries mapped to a group with a criterion; recall against clinician labels (596) with stay-clustered bootstrap; protocols and predictions committed before computation. ᵃEntry-level count (an entry mapping to several groups is unsupported only if all its verifiable groups are); the consensus column is counted per group, under which the LLM's raw rate is 179/1,512 (11.8%).</w:t>
       </w:r>
     </w:p>
     <w:tbl>
@@ -8597,11 +8615,12 @@
         <w:tblLook w:firstColumn="1" w:firstRow="1" w:lastColumn="0" w:lastRow="0" w:noHBand="0" w:noVBand="1" w:val="04A0"/>
       </w:tblPr>
       <w:tblGrid>
-        <w:gridCol w:w="1881"/>
-        <w:gridCol w:w="1881"/>
-        <w:gridCol w:w="1881"/>
-        <w:gridCol w:w="1881"/>
-        <w:gridCol w:w="1881"/>
+        <w:gridCol w:w="1568"/>
+        <w:gridCol w:w="1568"/>
+        <w:gridCol w:w="1568"/>
+        <w:gridCol w:w="1568"/>
+        <w:gridCol w:w="1568"/>
+        <w:gridCol w:w="1568"/>
       </w:tblGrid>
       <w:tr>
         <w:trPr>
@@ -8610,7 +8629,7 @@
         </w:trPr>
         <w:tc>
           <w:tcPr>
-            <w:tcW w:type="dxa" w:w="1881"/>
+            <w:tcW w:type="dxa" w:w="1568"/>
           </w:tcPr>
           <w:p>
             <w:pPr>
@@ -8633,7 +8652,7 @@
         </w:tc>
         <w:tc>
           <w:tcPr>
-            <w:tcW w:type="dxa" w:w="1881"/>
+            <w:tcW w:type="dxa" w:w="1568"/>
           </w:tcPr>
           <w:p>
             <w:pPr>
@@ -8656,7 +8675,7 @@
         </w:tc>
         <w:tc>
           <w:tcPr>
-            <w:tcW w:type="dxa" w:w="1881"/>
+            <w:tcW w:type="dxa" w:w="1568"/>
           </w:tcPr>
           <w:p>
             <w:pPr>
@@ -8679,7 +8698,7 @@
         </w:tc>
         <w:tc>
           <w:tcPr>
-            <w:tcW w:type="dxa" w:w="1881"/>
+            <w:tcW w:type="dxa" w:w="1568"/>
           </w:tcPr>
           <w:p>
             <w:pPr>
@@ -8702,7 +8721,7 @@
         </w:tc>
         <w:tc>
           <w:tcPr>
-            <w:tcW w:type="dxa" w:w="1881"/>
+            <w:tcW w:type="dxa" w:w="1568"/>
           </w:tcPr>
           <w:p>
             <w:pPr>
@@ -8720,6 +8739,29 @@
                 <w:sz w:val="17"/>
               </w:rPr>
               <w:t>Engine v7</w:t>
+            </w:r>
+          </w:p>
+        </w:tc>
+        <w:tc>
+          <w:tcPr>
+            <w:tcW w:type="dxa" w:w="1568"/>
+          </w:tcPr>
+          <w:p>
+            <w:pPr>
+              <w:keepNext/>
+              <w:spacing w:line="240" w:lineRule="auto" w:after="0"/>
+            </w:pPr>
+            <w:r>
+              <w:rPr>
+                <w:b/>
+              </w:rPr>
+            </w:r>
+            <w:r>
+              <w:rPr>
+                <w:b/>
+                <w:sz w:val="17"/>
+              </w:rPr>
+              <w:t>Verified consensus (Section 3.9)</w:t>
             </w:r>
           </w:p>
         </w:tc>
@@ -8730,7 +8772,7 @@
         </w:trPr>
         <w:tc>
           <w:tcPr>
-            <w:tcW w:type="dxa" w:w="1881"/>
+            <w:tcW w:type="dxa" w:w="1568"/>
           </w:tcPr>
           <w:p>
             <w:pPr>
@@ -8748,7 +8790,7 @@
         </w:tc>
         <w:tc>
           <w:tcPr>
-            <w:tcW w:type="dxa" w:w="1881"/>
+            <w:tcW w:type="dxa" w:w="1568"/>
           </w:tcPr>
           <w:p>
             <w:pPr>
@@ -8760,13 +8802,13 @@
               <w:rPr>
                 <w:sz w:val="17"/>
               </w:rPr>
-              <w:t>140/1,486 (9.4%)</w:t>
-            </w:r>
-          </w:p>
-        </w:tc>
-        <w:tc>
-          <w:tcPr>
-            <w:tcW w:type="dxa" w:w="1881"/>
+              <w:t>140/1,486 (9.4%)ᵃ</w:t>
+            </w:r>
+          </w:p>
+        </w:tc>
+        <w:tc>
+          <w:tcPr>
+            <w:tcW w:type="dxa" w:w="1568"/>
           </w:tcPr>
           <w:p>
             <w:pPr>
@@ -8784,7 +8826,7 @@
         </w:tc>
         <w:tc>
           <w:tcPr>
-            <w:tcW w:type="dxa" w:w="1881"/>
+            <w:tcW w:type="dxa" w:w="1568"/>
           </w:tcPr>
           <w:p>
             <w:pPr>
@@ -8802,7 +8844,7 @@
         </w:tc>
         <w:tc>
           <w:tcPr>
-            <w:tcW w:type="dxa" w:w="1881"/>
+            <w:tcW w:type="dxa" w:w="1568"/>
           </w:tcPr>
           <w:p>
             <w:pPr>
@@ -8815,6 +8857,24 @@
                 <w:sz w:val="17"/>
               </w:rPr>
               <w:t>233/1,518 (15.3%)</w:t>
+            </w:r>
+          </w:p>
+        </w:tc>
+        <w:tc>
+          <w:tcPr>
+            <w:tcW w:type="dxa" w:w="1568"/>
+          </w:tcPr>
+          <w:p>
+            <w:pPr>
+              <w:keepNext/>
+              <w:spacing w:line="240" w:lineRule="auto" w:after="0"/>
+            </w:pPr>
+            <w:r/>
+            <w:r>
+              <w:rPr>
+                <w:sz w:val="17"/>
+              </w:rPr>
+              <w:t>209/1,581 (13.2%)</w:t>
             </w:r>
           </w:p>
         </w:tc>
@@ -8825,7 +8885,7 @@
         </w:trPr>
         <w:tc>
           <w:tcPr>
-            <w:tcW w:type="dxa" w:w="1881"/>
+            <w:tcW w:type="dxa" w:w="1568"/>
           </w:tcPr>
           <w:p>
             <w:pPr>
@@ -8843,7 +8903,7 @@
         </w:tc>
         <w:tc>
           <w:tcPr>
-            <w:tcW w:type="dxa" w:w="1881"/>
+            <w:tcW w:type="dxa" w:w="1568"/>
           </w:tcPr>
           <w:p>
             <w:pPr>
@@ -8861,7 +8921,7 @@
         </w:tc>
         <w:tc>
           <w:tcPr>
-            <w:tcW w:type="dxa" w:w="1881"/>
+            <w:tcW w:type="dxa" w:w="1568"/>
           </w:tcPr>
           <w:p>
             <w:pPr>
@@ -8879,7 +8939,7 @@
         </w:tc>
         <w:tc>
           <w:tcPr>
-            <w:tcW w:type="dxa" w:w="1881"/>
+            <w:tcW w:type="dxa" w:w="1568"/>
           </w:tcPr>
           <w:p>
             <w:pPr>
@@ -8897,7 +8957,25 @@
         </w:tc>
         <w:tc>
           <w:tcPr>
-            <w:tcW w:type="dxa" w:w="1881"/>
+            <w:tcW w:type="dxa" w:w="1568"/>
+          </w:tcPr>
+          <w:p>
+            <w:pPr>
+              <w:keepNext/>
+              <w:spacing w:line="240" w:lineRule="auto" w:after="0"/>
+            </w:pPr>
+            <w:r/>
+            <w:r>
+              <w:rPr>
+                <w:sz w:val="17"/>
+              </w:rPr>
+              <w:t>0</w:t>
+            </w:r>
+          </w:p>
+        </w:tc>
+        <w:tc>
+          <w:tcPr>
+            <w:tcW w:type="dxa" w:w="1568"/>
           </w:tcPr>
           <w:p>
             <w:pPr>
@@ -8920,7 +8998,7 @@
         </w:trPr>
         <w:tc>
           <w:tcPr>
-            <w:tcW w:type="dxa" w:w="1881"/>
+            <w:tcW w:type="dxa" w:w="1568"/>
           </w:tcPr>
           <w:p>
             <w:pPr>
@@ -8938,7 +9016,7 @@
         </w:tc>
         <w:tc>
           <w:tcPr>
-            <w:tcW w:type="dxa" w:w="1881"/>
+            <w:tcW w:type="dxa" w:w="1568"/>
           </w:tcPr>
           <w:p>
             <w:pPr>
@@ -8956,7 +9034,7 @@
         </w:tc>
         <w:tc>
           <w:tcPr>
-            <w:tcW w:type="dxa" w:w="1881"/>
+            <w:tcW w:type="dxa" w:w="1568"/>
           </w:tcPr>
           <w:p>
             <w:pPr>
@@ -8974,7 +9052,7 @@
         </w:tc>
         <w:tc>
           <w:tcPr>
-            <w:tcW w:type="dxa" w:w="1881"/>
+            <w:tcW w:type="dxa" w:w="1568"/>
           </w:tcPr>
           <w:p>
             <w:pPr>
@@ -8992,7 +9070,7 @@
         </w:tc>
         <w:tc>
           <w:tcPr>
-            <w:tcW w:type="dxa" w:w="1881"/>
+            <w:tcW w:type="dxa" w:w="1568"/>
           </w:tcPr>
           <w:p>
             <w:pPr>
@@ -9005,6 +9083,24 @@
                 <w:sz w:val="17"/>
               </w:rPr>
               <w:t>24.0</w:t>
+            </w:r>
+          </w:p>
+        </w:tc>
+        <w:tc>
+          <w:tcPr>
+            <w:tcW w:type="dxa" w:w="1568"/>
+          </w:tcPr>
+          <w:p>
+            <w:pPr>
+              <w:keepNext/>
+              <w:spacing w:line="240" w:lineRule="auto" w:after="0"/>
+            </w:pPr>
+            <w:r/>
+            <w:r>
+              <w:rPr>
+                <w:sz w:val="17"/>
+              </w:rPr>
+              <w:t>21.8</w:t>
             </w:r>
           </w:p>
         </w:tc>
@@ -9015,7 +9111,7 @@
         </w:trPr>
         <w:tc>
           <w:tcPr>
-            <w:tcW w:type="dxa" w:w="1881"/>
+            <w:tcW w:type="dxa" w:w="1568"/>
           </w:tcPr>
           <w:p>
             <w:pPr>
@@ -9033,7 +9129,7 @@
         </w:tc>
         <w:tc>
           <w:tcPr>
-            <w:tcW w:type="dxa" w:w="1881"/>
+            <w:tcW w:type="dxa" w:w="1568"/>
           </w:tcPr>
           <w:p>
             <w:pPr>
@@ -9051,7 +9147,7 @@
         </w:tc>
         <w:tc>
           <w:tcPr>
-            <w:tcW w:type="dxa" w:w="1881"/>
+            <w:tcW w:type="dxa" w:w="1568"/>
           </w:tcPr>
           <w:p>
             <w:pPr>
@@ -9069,7 +9165,7 @@
         </w:tc>
         <w:tc>
           <w:tcPr>
-            <w:tcW w:type="dxa" w:w="1881"/>
+            <w:tcW w:type="dxa" w:w="1568"/>
           </w:tcPr>
           <w:p>
             <w:pPr>
@@ -9087,7 +9183,7 @@
         </w:tc>
         <w:tc>
           <w:tcPr>
-            <w:tcW w:type="dxa" w:w="1881"/>
+            <w:tcW w:type="dxa" w:w="1568"/>
           </w:tcPr>
           <w:p>
             <w:pPr>
@@ -9100,6 +9196,24 @@
                 <w:sz w:val="17"/>
               </w:rPr>
               <w:t>60.7</w:t>
+            </w:r>
+          </w:p>
+        </w:tc>
+        <w:tc>
+          <w:tcPr>
+            <w:tcW w:type="dxa" w:w="1568"/>
+          </w:tcPr>
+          <w:p>
+            <w:pPr>
+              <w:keepNext/>
+              <w:spacing w:line="240" w:lineRule="auto" w:after="0"/>
+            </w:pPr>
+            <w:r/>
+            <w:r>
+              <w:rPr>
+                <w:sz w:val="17"/>
+              </w:rPr>
+              <w:t>61.2 (vs engine +0.6; −2.2 to 3.4)</w:t>
             </w:r>
           </w:p>
         </w:tc>
@@ -9110,7 +9224,7 @@
         </w:trPr>
         <w:tc>
           <w:tcPr>
-            <w:tcW w:type="dxa" w:w="1881"/>
+            <w:tcW w:type="dxa" w:w="1568"/>
           </w:tcPr>
           <w:p>
             <w:pPr>
@@ -9128,7 +9242,7 @@
         </w:tc>
         <w:tc>
           <w:tcPr>
-            <w:tcW w:type="dxa" w:w="1881"/>
+            <w:tcW w:type="dxa" w:w="1568"/>
           </w:tcPr>
           <w:p>
             <w:pPr>
@@ -9146,7 +9260,7 @@
         </w:tc>
         <w:tc>
           <w:tcPr>
-            <w:tcW w:type="dxa" w:w="1881"/>
+            <w:tcW w:type="dxa" w:w="1568"/>
           </w:tcPr>
           <w:p>
             <w:pPr>
@@ -9164,7 +9278,7 @@
         </w:tc>
         <w:tc>
           <w:tcPr>
-            <w:tcW w:type="dxa" w:w="1881"/>
+            <w:tcW w:type="dxa" w:w="1568"/>
           </w:tcPr>
           <w:p>
             <w:pPr>
@@ -9182,7 +9296,7 @@
         </w:tc>
         <w:tc>
           <w:tcPr>
-            <w:tcW w:type="dxa" w:w="1881"/>
+            <w:tcW w:type="dxa" w:w="1568"/>
           </w:tcPr>
           <w:p>
             <w:pPr>
@@ -9195,6 +9309,24 @@
                 <w:sz w:val="17"/>
               </w:rPr>
               <w:t>72.0</w:t>
+            </w:r>
+          </w:p>
+        </w:tc>
+        <w:tc>
+          <w:tcPr>
+            <w:tcW w:type="dxa" w:w="1568"/>
+          </w:tcPr>
+          <w:p>
+            <w:pPr>
+              <w:keepNext/>
+              <w:spacing w:line="240" w:lineRule="auto" w:after="0"/>
+            </w:pPr>
+            <w:r/>
+            <w:r>
+              <w:rPr>
+                <w:sz w:val="17"/>
+              </w:rPr>
+              <w:t>76.3 (vs engine +4.5; 2.2 to 6.8)</w:t>
             </w:r>
           </w:p>
         </w:tc>
@@ -9205,7 +9337,7 @@
         </w:trPr>
         <w:tc>
           <w:tcPr>
-            <w:tcW w:type="dxa" w:w="1881"/>
+            <w:tcW w:type="dxa" w:w="1568"/>
           </w:tcPr>
           <w:p>
             <w:pPr>
@@ -9222,7 +9354,7 @@
         </w:tc>
         <w:tc>
           <w:tcPr>
-            <w:tcW w:type="dxa" w:w="1881"/>
+            <w:tcW w:type="dxa" w:w="1568"/>
           </w:tcPr>
           <w:p>
             <w:pPr>
@@ -9239,7 +9371,7 @@
         </w:tc>
         <w:tc>
           <w:tcPr>
-            <w:tcW w:type="dxa" w:w="1881"/>
+            <w:tcW w:type="dxa" w:w="1568"/>
           </w:tcPr>
           <w:p>
             <w:pPr>
@@ -9256,7 +9388,7 @@
         </w:tc>
         <w:tc>
           <w:tcPr>
-            <w:tcW w:type="dxa" w:w="1881"/>
+            <w:tcW w:type="dxa" w:w="1568"/>
           </w:tcPr>
           <w:p>
             <w:pPr>
@@ -9273,7 +9405,24 @@
         </w:tc>
         <w:tc>
           <w:tcPr>
-            <w:tcW w:type="dxa" w:w="1881"/>
+            <w:tcW w:type="dxa" w:w="1568"/>
+          </w:tcPr>
+          <w:p>
+            <w:pPr>
+              <w:spacing w:line="240" w:lineRule="auto" w:after="0"/>
+            </w:pPr>
+            <w:r/>
+            <w:r>
+              <w:rPr>
+                <w:sz w:val="17"/>
+              </w:rPr>
+              <w:t>—</w:t>
+            </w:r>
+          </w:p>
+        </w:tc>
+        <w:tc>
+          <w:tcPr>
+            <w:tcW w:type="dxa" w:w="1568"/>
           </w:tcPr>
           <w:p>
             <w:pPr>
@@ -9304,7 +9453,7 @@
     </w:p>
     <w:p>
       <w:r>
-        <w:t>Notes: Note 1 SAP and amendments; Table S1 engine change log C1–C16 with sources; Table S2 quarantine criteria and outcomes (rounds 1 and 2); Note 2 LLM comparison protocol; Table S3 participant flow and baseline characteristics; Note 3 fusion/Theory-of-Evidence algorithm and consistency identities; Table S4 subgroup recall; Table S5 next-test utility (engine v5.3, superseded metric); Tables S6–S6c calibration, recalibration, decision curves, multiplicity and panel-size sensitivity; Table S7 survey-weighted NHANES AUROC; Table S8 per-group calibration; Table S9 label-mapping audit (400 stays); Table S10 registry count reconciliation; Table S11 precision/F1/NDCG, alert burden, per-group PPV and prevalence baseline; Table S12 fusion-weight sensitivity; Table S12b historical comparisons (superseded); Table S13 participant flow for the UCI cohorts; Table S15 open vs proprietary components; Table S16 sepsis companion model; Note 4 regression gate; Note 5 definitions, audits and completed TRIPOD+AI checklist; Note 6 version manifest; Note 7 evidence triage of twelve proposals; Note 8 source-concordance audit; Notes 9–12 material moved from the main text; Note 13 black-box property-conformance benchmark (engine and LLM on identical perturbed panels); Note 14 executable verifier behind the LLM; Fig. S1 provenance audit; Fig. S2 per-release eICU metrics; Fig. S3 per-group panel-supported recall; Fig. S4 per-group calibration; Fig. S5 context-echo analysis; Fig. S6 historical LLM comparison vs engine v5.1; Fig. S7 participant flow; Data 1 per-stay outputs and LLM prompts/outputs.</w:t>
+        <w:t>Notes: Note 1 SAP and amendments; Table S1 engine change log C1–C16 with sources; Table S2 quarantine criteria and outcomes (rounds 1 and 2); Note 2 LLM comparison protocol; Table S3 participant flow and baseline characteristics; Note 3 fusion/Theory-of-Evidence algorithm and consistency identities; Table S4 subgroup recall; Table S5 next-test utility (engine v5.3, superseded metric); Tables S6–S6c calibration, recalibration, decision curves, multiplicity and panel-size sensitivity; Table S7 survey-weighted NHANES AUROC; Table S8 per-group calibration; Table S9 label-mapping audit (400 stays); Table S10 registry count reconciliation; Table S11 precision/F1/NDCG, alert burden, per-group PPV and prevalence baseline; Table S12 fusion-weight sensitivity; Table S12b historical comparisons (superseded); Table S13 participant flow for the UCI cohorts; Table S15 open vs proprietary components; Table S16 sepsis companion model; Note 4 regression gate; Note 5 definitions, audits and completed TRIPOD+AI checklist; Note 6 version manifest; Note 7 evidence triage of twelve proposals; Note 8 source-concordance audit; Notes 9–12 material moved from the main text; Note 13 black-box property-conformance benchmark (engine and LLM on identical perturbed panels); Note 14 executable verifier behind the LLM and verified-consensus arm; Fig. S1 provenance audit; Fig. S2 per-release eICU metrics; Fig. S3 per-group panel-supported recall; Fig. S4 per-group calibration; Fig. S5 context-echo analysis; Fig. S6 historical LLM comparison vs engine v5.1; Fig. S7 participant flow; Data 1 per-stay outputs and LLM prompts/outputs.</w:t>
       </w:r>
     </w:p>
     <w:p>

</xml_diff>

<commit_message>
R6: registry composition disclosed (73 % co_* templates); Methods 2.6 / Results 3.10 activity-guided provenance audit; Supplementary Note 15; abstract, highlights, discussion, limitations, conclusion updated
</commit_message>
<xml_diff>
--- a/docs/paper1/v7/Paper1_Hemoglyph_CMPB_EN_v7_R6.docx
+++ b/docs/paper1/v7/Paper1_Hemoglyph_CMPB_EN_v7_R6.docx
@@ -105,7 +105,7 @@
     </w:p>
     <w:p>
       <w:r>
-        <w:t>- Frozen source-concordance protocol: 92% of sampled rules unverifiable by locator</w:t>
+        <w:t>- Frozen provenance audits: 92% of rules unverifiable; 1.1% of rules drive output</w:t>
       </w:r>
     </w:p>
     <w:p>
@@ -137,7 +137,7 @@
         <w:t>Background and Objective:</w:t>
       </w:r>
       <w:r>
-        <w:t xml:space="preserve"> LLM-drafted rule bases are not auditable when rules cannot be checked against sources and engines are validated only on vignettes. We evaluate three verification methods—executable invariants, a frozen source-concordance protocol and a hash-frozen one-shot benchmark—on Hemoglyph, an offline engine ranking a cited differential from a laboratory panel with 33,183 guideline-transcribed rules (99.2% AI-drafted), untrained on outcomes.</w:t>
+        <w:t xml:space="preserve"> LLM-drafted rule bases are not auditable when rules cannot be checked against sources and engines are validated only on vignettes. We evaluate three verification methods—executable invariants, a frozen source-concordance protocol and a hash-frozen one-shot benchmark—on Hemoglyph, an offline engine ranking a cited differential from a laboratory panel with 33,183 executable rules (99.2% AI-drafted; 73% of them generated two-analyte pattern templates), untrained on outcomes.</w:t>
       </w:r>
     </w:p>
     <w:p>
@@ -148,7 +148,7 @@
         <w:t>Methods:</w:t>
       </w:r>
       <w:r>
-        <w:t xml:space="preserve"> Property-based tests check invariants (determinism, unit/presentation invariance, monotonicity, absent analyte, context) on randomised panels, as a black box on real panels given identically to engine and LLM, and as a verifier behind the LLM. A frozen protocol labels 200 sampled rules concordant, discordant or unresolvable against their locator. Under a hash-frozen plan with two one-shot quarantine rounds, benchmarks covered the eICU-CRD demo (2,314 ICU stays), 9,000 NHANES adults, 14,420 sepsis patients and external cohorts, with ablation and a blinded comparison with an unnamed frontier LLM (400 stays).</w:t>
+        <w:t xml:space="preserve"> Property-based tests check invariants (determinism, unit/presentation invariance, monotonicity, absent analyte, context) on randomised panels, as a black box on real panels given identically to engine and LLM, and as a verifier behind the LLM. A frozen protocol labels 200 sampled rules concordant, discordant or unresolvable against their locator; an activity log over 3,814 real panels then identifies the rules that actually drive output and a second frozen sample of 100 of them is audited. Under a hash-frozen plan with two one-shot quarantine rounds, benchmarks covered the eICU-CRD demo (2,314 ICU stays), 9,000 NHANES adults, 14,420 sepsis patients and external cohorts, with ablation and a blinded comparison with an unnamed frontier LLM (400 stays).</w:t>
       </w:r>
     </w:p>
     <w:p>
@@ -159,7 +159,7 @@
         <w:t>Results:</w:t>
       </w:r>
       <w:r>
-        <w:t xml:space="preserve"> The invariants exposed a ranking defect missed by 353 vignettes. Of 200 audited rules, 92% (95% CI 87.4–95.1) were unresolvable from their locators and ≥7.5% (4.6–12.0) discordant. 60.8% (58.7–62.9) of clinician-listed ICU diagnoses ranked in the top five (prevalence baseline 51.3%). NHANES AUROCs reproduced across cycles (0.88–0.99); sepsis prediction failed as pre-specified. Engine and LLM were at recall@5 parity (60.7% vs 59.6%, p = 0.54); the LLM led at rank 1. On identical perturbed panels SI units left the engine's top-5 unchanged in 40/40 versus 8/40 (LLM), a diagnosis was asserted without its defining analyte in 3/40 versus 14/40, and a unit defect was exposed and fixed. The engine's criteria, used as a verifier, removed 40% of the LLM's unsupported top-5 assertions at no recall cost and flagged the engine's own output more often. Ablation placed the result in 272 curated anchors, not the AI-drafted bulk.</w:t>
+        <w:t xml:space="preserve"> The invariants exposed a ranking defect missed by 353 vignettes. Of 200 audited rules, 92% (95% CI 87.4–95.1) were unresolvable from their locators and ≥7.5% (4.6–12.0) discordant. Only 364 rules (1.1%) ever placed a diagnosis in a top-10 differential on real panels; of 100 sampled from these, 6 were verbatim concordant, 2 discordant and 92 unresolvable. 60.8% (58.7–62.9) of clinician-listed ICU diagnoses ranked in the top five (prevalence baseline 51.3%). NHANES AUROCs reproduced across cycles (0.88–0.99); sepsis prediction failed as pre-specified. Engine and LLM were at recall@5 parity (60.7% vs 59.6%, p = 0.54); the LLM led at rank 1. On identical perturbed panels SI units left the engine's top-5 unchanged in 40/40 versus 8/40 (LLM), a diagnosis was asserted without its defining analyte in 3/40 versus 14/40, and a unit defect was exposed and fixed. The engine's criteria, used as a verifier, removed 40% of the LLM's unsupported top-5 assertions at no recall cost and flagged the engine's own output more often. Ablation placed the result in 272 curated anchors, not the AI-drafted bulk.</w:t>
       </w:r>
     </w:p>
     <w:p>
@@ -243,7 +243,16 @@
     </w:p>
     <w:p>
       <w:r>
-        <w:t>Hemoglyph processes a panel in five stages (Fig. 1): normalisation (UCUM units, aliases, age/sex reference intervals, 100 derived indices); a rule layer over registry 14.1.0 (33,183 executable leaves, each a record with a machine-evaluable condition on at least one analyte, a population gate, an evidence role—diagnostic criterion weight 6, supportive or screening weight 3—a disease identifier and a source locator; release-by-release counts in Supplementary Table S10); an expert syndrome layer (~900 multi-analyte constellations with anchor strengths 0.95/0.88/0.80/0.72/0.45 and context predicates); fixed-weight fusion (0.35 rule engine, 0.25 Bayesian, 0.20 fuzzy, 0.10 knowledge graph, 0.10 risk models, set by judgement and never tuned on evaluation data; sensitivity in Table 1) with an expert floor (the fused score cannot fall below 0.90 × the rule-layer vote, so learned layers modulate but never veto a guideline rule); and ranking hygiene (causal attribution through a disease–finding explanation graph, covering-diagnosis suppression, KDIGO chronicity [19], ADA glycaemic criteria [20], UDMI acuity [21], maximum 25 entries). The Bayesian layer has 75 disease nodes with hand-coded priors and likelihood ratios from cited diagnostic-accuracy literature; no parameter was fitted to any patient record. Engine changes between releases (C1–C16) are dated in Supplementary Table S1; no version-control history exists for the development period, so "no change was outcome-fitted" is a documented process claim, not a verified one.</w:t>
+        <w:t>Hemoglyph processes a panel in five stages (Fig. 1): normalisation (UCUM units, aliases, age/sex reference intervals, 100 derived indices); a rule layer over registry 14.1.0 (33,183 executable leaves, each a record with a machine-evaluable condition on at least one analyte, a population gate, an evidence role—diagnostic criterion weight 6, supportive or screening weight 3—a disease identifier and a source locator; release-by-release counts in Supplementary Table S10; 24,293 of these rules (73.2%) belong to 4,026 generated two-analyte co-occurrence pattern entities (</w:t>
+      </w:r>
+      <w:r>
+        <w:rPr>
+          <w:rFonts w:ascii="Consolas" w:hAnsi="Consolas"/>
+        </w:rPr>
+        <w:t>co_*</w:t>
+      </w:r>
+      <w:r>
+        <w:t>), ranked below diseases in the differential and citing only a generic standards page, and 8,890 are attached to 2,502 disease, finding, allergy, drug-level or serology entities—a composition first quantified by the audit of Section 2.6); an expert syndrome layer (~900 multi-analyte constellations with anchor strengths 0.95/0.88/0.80/0.72/0.45 and context predicates); fixed-weight fusion (0.35 rule engine, 0.25 Bayesian, 0.20 fuzzy, 0.10 knowledge graph, 0.10 risk models, set by judgement and never tuned on evaluation data; sensitivity in Table 1) with an expert floor (the fused score cannot fall below 0.90 × the rule-layer vote, so learned layers modulate but never veto a guideline rule); and ranking hygiene (causal attribution through a disease–finding explanation graph, covering-diagnosis suppression, KDIGO chronicity [19], ADA glycaemic criteria [20], UDMI acuity [21], maximum 25 entries). The Bayesian layer has 75 disease nodes with hand-coded priors and likelihood ratios from cited diagnostic-accuracy literature; no parameter was fitted to any patient record. Engine changes between releases (C1–C16) are dated in Supplementary Table S1; no version-control history exists for the development period, so "no change was outcome-fitted" is a documented process claim, not a verified one.</w:t>
       </w:r>
     </w:p>
     <w:p>
@@ -455,6 +464,49 @@
     </w:p>
     <w:p>
       <w:pPr>
+        <w:pStyle w:val="Heading2"/>
+      </w:pPr>
+      <w:r>
+        <w:rPr>
+          <w:color w:val="303030"/>
+        </w:rPr>
+        <w:t>2.6 Verification method 4: activity-guided provenance audit</w:t>
+      </w:r>
+    </w:p>
+    <w:p>
+      <w:r>
+        <w:t>Because a rule base is verified in proportion to effort, we asked which rules the engine actually uses. A protocol frozen before any run (</w:t>
+      </w:r>
+      <w:r>
+        <w:rPr>
+          <w:rFonts w:ascii="Consolas" w:hAnsi="Consolas"/>
+        </w:rPr>
+        <w:t>eval/provenance/PROTOCOL.md</w:t>
+      </w:r>
+      <w:r>
+        <w:t xml:space="preserve">; registered expectations for core size, anchor share and audit yield) logged with the current harness (registry 14.2.0, whose executable count and rule layer equal v7's), for every rule on 3,814 real panels (the 2,314 eICU stays and 1,500 NHANES 2015–18 adults, seed 20261027), whether it fired and whether its disease entered the top-10 differential. Rules that contributed at least once form the </w:t>
+      </w:r>
+      <w:r>
+        <w:rPr>
+          <w:i/>
+        </w:rPr>
+        <w:t>active core</w:t>
+      </w:r>
+      <w:r>
+        <w:t xml:space="preserve">; ≥ 10 times, the </w:t>
+      </w:r>
+      <w:r>
+        <w:rPr>
+          <w:i/>
+        </w:rPr>
+        <w:t>hot core</w:t>
+      </w:r>
+      <w:r>
+        <w:t>. Each active rule's cited locator was then fetched (HTML/PDF; Europe PMC and PubMed for DOIs) and searched automatically for its threshold next to an analyte term; finally 100 active rules not in the Section 2.4 sample were drawn (seed 20261028) and labelled under the Section 2.4 rules by the same single AI rater, with a verbatim quote and document location required for every concordant or discordant label, multi-leaf rules concordant only when every leaf is stated, and strict-versus-inclusive boundary mismatches labelled discordant. No rule or locator was changed.</w:t>
+      </w:r>
+    </w:p>
+    <w:p>
+      <w:pPr>
         <w:pStyle w:val="Heading1"/>
       </w:pPr>
       <w:r>
@@ -638,6 +690,22 @@
     </w:p>
     <w:p>
       <w:pPr>
+        <w:pStyle w:val="Heading2"/>
+      </w:pPr>
+      <w:r>
+        <w:rPr>
+          <w:color w:val="303030"/>
+        </w:rPr>
+        <w:t>3.10 Activity-guided provenance audit</w:t>
+      </w:r>
+    </w:p>
+    <w:p>
+      <w:r>
+        <w:t>On 3,814 real panels 1,991 rules fired and 364 (1.1%) ever placed a diagnosis in a top-10 differential; 174 did so ten or more times; 31,192 (94.0%) never fired. The active core holds 46 of the 272 curated anchors and 105 generated pattern templates; its first-cited source is a resolved DOI for 10.4% of rules against 0.8% registry-wide. Automated search located the rule's threshold in a document reached from the registry locator for 8 of 364 active rules; 120 locators were organisation landing pages, 63 blocked or 404, 150 reached a page without the statement. In the fresh sample of 100 active rules, 6 were concordant (ADA 2026 diabetes and prediabetes criteria, ADA/EASD 2024 DKA severity and HHS criteria, BSG 2021 iron-deficiency anaemia), 2 discordant (an HbA1c "&gt; 5.7%" pattern against an inclusive 5.7–6.4% range; CK "≥ 1000" against "&gt; 1000 U/L" in a systematic review) and 92 unresolvable (95% CI 85.0–95.9; 88.6% among the 70 non-template rules), of which at least 18 cite a specific document that does not address the rule's analyte, 30 an organisation page and 5 a WHO URL returning 404. None of the four registered expectations was met (Supplementary Note 15).</w:t>
+      </w:r>
+    </w:p>
+    <w:p>
+      <w:pPr>
         <w:pStyle w:val="Heading1"/>
       </w:pPr>
       <w:r>
@@ -668,7 +736,7 @@
     </w:p>
     <w:p>
       <w:r>
-        <w:t>The benchmark numbers measure the reference standard at least as much as the engine; three observations locate the ceiling. First, a quarter of admission-level problem-list entries were not inferable from the first panel at all; the panel-supported subset is recovered at 78.0% (k = 5) and 91.8% (k = 10). Second, supervised models trained on the labels did not exceed 0.82 AUROC for outcome-defined groups and a prevalence baseline overtakes any method at k = 10, so no laboratory-only system can score much higher on this reference. Third, of the 85.8% of top-5 assertions not on the problem list, 54.8% satisfy the group's laboratory criterion in the same panel and only 12.6% are criterion-negative—coded precision (14.2%) is a lower bound, 69.0% an upper bound. Where the engine genuinely loses (sepsis, bleeding, withdrawal, CKD without a second creatinine) the label is an outcome learned from hidden correlates or needs longitudinal data—an argument for hybrid designs; part of the loss was chosen, since withdrawing single-creatinine CKD assertions to comply with KDIGO cost three points of recall@5. The ablation locates the result in the rule vote and the curated syndrome constellations, written by a non-clinician from guideline criteria; the 33,000-rule bulk adds one to three points, so Hemoglyph is guideline-</w:t>
+        <w:t>The benchmark numbers measure the reference standard at least as much as the engine; three observations locate the ceiling. First, a quarter of admission-level problem-list entries were not inferable from the first panel at all; the panel-supported subset is recovered at 78.0% (k = 5) and 91.8% (k = 10). Second, supervised models trained on the labels did not exceed 0.82 AUROC for outcome-defined groups and a prevalence baseline overtakes any method at k = 10, so no laboratory-only system can score much higher on this reference. Third, of the 85.8% of top-5 assertions not on the problem list, 54.8% satisfy the group's laboratory criterion in the same panel and only 12.6% are criterion-negative—coded precision (14.2%) is a lower bound, 69.0% an upper bound. Where the engine genuinely loses (sepsis, bleeding, withdrawal, CKD without a second creatinine) the label is an outcome learned from hidden correlates or needs longitudinal data—an argument for hybrid designs; part of the loss was chosen, since withdrawing single-creatinine CKD assertions to comply with KDIGO cost three points of recall@5. The ablation locates the result in the rule vote and the curated syndrome constellations, written by a non-clinician from guideline criteria; the 33,000-rule bulk adds one to three points and 94% of it never fired on 3,814 real panels, so Hemoglyph is guideline-</w:t>
       </w:r>
       <w:r>
         <w:rPr>
@@ -677,7 +745,7 @@
         <w:t>transcribed</w:t>
       </w:r>
       <w:r>
-        <w:t>, not guideline-derived. The contribution of such an engine is therefore not accuracy beyond what the reference permits but a property no LLM or trained model offers: every output carries a rule identifier, threshold and source, runs offline in about one second without a GPU, and is verifiable by executable invariants before release. Our design also addresses criticisms of recent LLM benchmarks—unstable metrics, leakage and post-hoc selection [28,33]: releases were frozen with manifests, quarantine data were run once, the failed round and the weakened criteria are disclosed, and the LLM's test–retest variability (κ 0.69) exceeded the between-system difference. Compared with Isabel and DXplain [13–16,34], this study isolates laboratory-only reasoning on more than 20,000 encounters and releases its knowledge base under an open licence; the per-entry rule identifier and source are consistent with the transparency principle of the FDA's January 2026 clinical-decision-support guidance, without any regulatory claim.</w:t>
+        <w:t>, not guideline-derived, and its effective rule base is a few hundred rules whose provenance can now be repaired one by one—the activity log converts an unauditable registry into a tractable verification queue, although the first 100 rules on that queue show the same failure modes as the bulk. The contribution of such an engine is therefore not accuracy beyond what the reference permits but a property no LLM or trained model offers: every output carries a rule identifier, threshold and source, runs offline in about one second without a GPU, and is verifiable by executable invariants before release. Our design also addresses criticisms of recent LLM benchmarks—unstable metrics, leakage and post-hoc selection [28,33]: releases were frozen with manifests, quarantine data were run once, the failed round and the weakened criteria are disclosed, and the LLM's test–retest variability (κ 0.69) exceeded the between-system difference. Compared with Isabel and DXplain [13–16,34], this study isolates laboratory-only reasoning on more than 20,000 encounters and releases its knowledge base under an open licence; the per-entry rule identifier and source are consistent with the transparency principle of the FDA's January 2026 clinical-decision-support guidance, without any regulatory claim.</w:t>
       </w:r>
     </w:p>
     <w:p>
@@ -693,7 +761,7 @@
     </w:p>
     <w:p>
       <w:r>
-        <w:t>No clinician audited the rules or adjudicated outputs; the concordance audit is single-rater, by a declared AI agent, without inter-rater reliability. The components that carry the result were written by a non-clinician first author; 34 sources lack a locator; Bayesian priors are hand-coded without a per-value citation table; no version-control history exists for the development period. Only the open demo subsets of eICU and MIMIC-IV were used, with admission-level problem lists and ICD codes as reference standards. The LLM comparison is an author-run self-baseline through a platform that does not disclose the model, with two prompts, no retrieval augmentation and no clinician adjudication, and the model's training data may include the public eICU demo. Quarantine criteria were weakened after round 1; the panel-supported metric is post hoc; NHANES laboratory-defined labels overlap the inputs; raw scores are uncalibrated; external cohorts are small; the OCR front end, Iranian populations and non-English laboratory conventions were not evaluated. The verifier's criteria are proxies and its synonym map is coarse, so its verdicts bound rather than measure unsupported assertion. The first author is a secondary-school student with a financial interest in the commercial product, and the system, including 99.2% of the rules, was developed with AI-agent assistance. Hemoglyph is a research prototype with no regulatory clearance.</w:t>
+        <w:t>No clinician audited the rules or adjudicated outputs; both concordance audits are single-rater, by a declared AI agent, without inter-rater reliability. Nearly three quarters of the executable rules are generated two-analyte templates whose citation is a generic standards page; the activity log is specific to the analyte coverage of the two corpora used, so "dormant" means dormant on these panels. The components that carry the result were written by a non-clinician first author; 34 sources lack a locator; Bayesian priors are hand-coded without a per-value citation table; no version-control history exists for the development period. Only the open demo subsets of eICU and MIMIC-IV were used, with admission-level problem lists and ICD codes as reference standards. The LLM comparison is an author-run self-baseline through a platform that does not disclose the model, with two prompts, no retrieval augmentation and no clinician adjudication, and the model's training data may include the public eICU demo. Quarantine criteria were weakened after round 1; the panel-supported metric is post hoc; NHANES laboratory-defined labels overlap the inputs; raw scores are uncalibrated; external cohorts are small; the OCR front end, Iranian populations and non-English laboratory conventions were not evaluated. The verifier's criteria are proxies and its synonym map is coarse, so its verdicts bound rather than measure unsupported assertion. The first author is a secondary-school student with a financial interest in the commercial product, and the system, including 99.2% of the rules, was developed with AI-agent assistance. Hemoglyph is a research prototype with no regulatory clearance.</w:t>
       </w:r>
     </w:p>
     <w:p>
@@ -709,7 +777,7 @@
     </w:p>
     <w:p>
       <w:r>
-        <w:t>Executable invariants, a frozen source-concordance protocol and a hash-frozen one-shot benchmark are three low-cost, reproducible methods for verifying an AI-drafted clinical rule base. A rule engine whose every output carries a rule identifier, threshold and source can be audited in ways a language model cannot—and can audit the language model's output in turn. Applied to Hemoglyph the methods found defects that vignettes had missed, showed that provenance granularity rather than rule count limits auditability, and placed an untrained, traceable engine at parity with a frontier LLM on a blinded laboratory-panel task close to the ceiling the reference standard allows. The limits—an unaudited rule base, outcome-defined syndromes, uncalibrated scores—are stated so that they can be measured and closed.</w:t>
+        <w:t>Executable invariants, a frozen source-concordance protocol and a hash-frozen one-shot benchmark are three low-cost, reproducible methods for verifying an AI-drafted clinical rule base. A rule engine whose every output carries a rule identifier, threshold and source can be audited in ways a language model cannot—and can audit the language model's output in turn. Applied to Hemoglyph the methods found defects that vignettes had missed, showed that provenance granularity rather than rule count limits auditability and that 1.1% of the rules carry the output, and placed an untrained, traceable engine at parity with a frontier LLM on a blinded laboratory-panel task close to the ceiling the reference standard allows. The limits—an unaudited rule base, outcome-defined syndromes, uncalibrated scores—are stated so that they can be measured and closed.</w:t>
       </w:r>
     </w:p>
     <w:p>
@@ -9453,7 +9521,7 @@
     </w:p>
     <w:p>
       <w:r>
-        <w:t>Notes: Note 1 SAP and amendments; Table S1 engine change log C1–C16 with sources; Table S2 quarantine criteria and outcomes (rounds 1 and 2); Note 2 LLM comparison protocol; Table S3 participant flow and baseline characteristics; Note 3 fusion/Theory-of-Evidence algorithm and consistency identities; Table S4 subgroup recall; Table S5 next-test utility (engine v5.3, superseded metric); Tables S6–S6c calibration, recalibration, decision curves, multiplicity and panel-size sensitivity; Table S7 survey-weighted NHANES AUROC; Table S8 per-group calibration; Table S9 label-mapping audit (400 stays); Table S10 registry count reconciliation; Table S11 precision/F1/NDCG, alert burden, per-group PPV and prevalence baseline; Table S12 fusion-weight sensitivity; Table S12b historical comparisons (superseded); Table S13 participant flow for the UCI cohorts; Table S15 open vs proprietary components; Table S16 sepsis companion model; Note 4 regression gate; Note 5 definitions, audits and completed TRIPOD+AI checklist; Note 6 version manifest; Note 7 evidence triage of twelve proposals; Note 8 source-concordance audit; Notes 9–12 material moved from the main text; Note 13 black-box property-conformance benchmark (engine and LLM on identical perturbed panels); Note 14 executable verifier behind the LLM and verified-consensus arm; Fig. S1 provenance audit; Fig. S2 per-release eICU metrics; Fig. S3 per-group panel-supported recall; Fig. S4 per-group calibration; Fig. S5 context-echo analysis; Fig. S6 historical LLM comparison vs engine v5.1; Fig. S7 participant flow; Data 1 per-stay outputs and LLM prompts/outputs.</w:t>
+        <w:t>Notes: Note 1 SAP and amendments; Table S1 engine change log C1–C16 with sources; Table S2 quarantine criteria and outcomes (rounds 1 and 2); Note 2 LLM comparison protocol; Table S3 participant flow and baseline characteristics; Note 3 fusion/Theory-of-Evidence algorithm and consistency identities; Table S4 subgroup recall; Table S5 next-test utility (engine v5.3, superseded metric); Tables S6–S6c calibration, recalibration, decision curves, multiplicity and panel-size sensitivity; Table S7 survey-weighted NHANES AUROC; Table S8 per-group calibration; Table S9 label-mapping audit (400 stays); Table S10 registry count reconciliation; Table S11 precision/F1/NDCG, alert burden, per-group PPV and prevalence baseline; Table S12 fusion-weight sensitivity; Table S12b historical comparisons (superseded); Table S13 participant flow for the UCI cohorts; Table S15 open vs proprietary components; Table S16 sepsis companion model; Note 4 regression gate; Note 5 definitions, audits and completed TRIPOD+AI checklist; Note 6 version manifest; Note 7 evidence triage of twelve proposals; Note 8 source-concordance audit; Notes 9–12 material moved from the main text; Note 13 black-box property-conformance benchmark (engine and LLM on identical perturbed panels); Note 14 executable verifier behind the LLM and verified-consensus arm; Note 15 activity-guided provenance audit; Fig. S1 provenance audit; Fig. S2 per-release eICU metrics; Fig. S3 per-group panel-supported recall; Fig. S4 per-group calibration; Fig. S5 context-echo analysis; Fig. S6 historical LLM comparison vs engine v5.1; Fig. S7 participant flow; Data 1 per-stay outputs and LLM prompts/outputs.</w:t>
       </w:r>
     </w:p>
     <w:p>

</xml_diff>

<commit_message>
Verification ledger (Note 18): per-rule join of the four methods; correct CORE-arm definition wording (curated/quote-verified/convention, not active core) in manuscript, cover letter, Note 16, RESULTS_AUDIT
</commit_message>
<xml_diff>
--- a/docs/paper1/v7/Paper1_Hemoglyph_CMPB_EN_v7_R6.docx
+++ b/docs/paper1/v7/Paper1_Hemoglyph_CMPB_EN_v7_R6.docx
@@ -11,7 +11,7 @@
           <w:b/>
           <w:sz w:val="32"/>
         </w:rPr>
-        <w:t>Verification and provenance auditing of an AI-drafted clinical rule base: executable invariants, a source-concordance protocol and a frozen laboratory-panel benchmark for an offline interpretation engine</w:t>
+        <w:t>Hemoglyph: an offline, guideline-traceable laboratory-panel interpretation engine with 33,183 rules, 99.2% AI-drafted, and four methods for verifying it against its sources, executable invariants and a frontier LLM</w:t>
       </w:r>
     </w:p>
     <w:p>
@@ -19,7 +19,7 @@
         <w:rPr>
           <w:i/>
         </w:rPr>
-        <w:t>Original research article. Revision R6 (2026-10-27), formatted for Computer Methods and Programs in Biomedicine. Research prototype — not approved or intended for clinical use.</w:t>
+        <w:t>Original research article. Revision R7 (2026-10-28), formatted for Computer Methods and Programs in Biomedicine. Research prototype — not approved or intended for clinical use.</w:t>
       </w:r>
     </w:p>
     <w:p>
@@ -95,12 +95,12 @@
     </w:p>
     <w:p>
       <w:r>
-        <w:t>- Property-based invariants for a clinical rule engine, run on every release</w:t>
+        <w:t>- Hemoglyph: open, offline engine ranking a source-cited differential from lab panels</w:t>
       </w:r>
     </w:p>
     <w:p>
       <w:r>
-        <w:t>- The invariants found a ranking defect that 353 hand-written vignettes had missed</w:t>
+        <w:t>- Property-based invariants found a ranking defect that 353 vignettes had missed</w:t>
       </w:r>
     </w:p>
     <w:p>
@@ -110,12 +110,12 @@
     </w:p>
     <w:p>
       <w:r>
-        <w:t>- Untrained, traceable engine at recall@5 parity with an unnamed frontier LLM</w:t>
+        <w:t>- Unit-invariant in 40/40 panels vs 8/40 for an LLM; suite released as LabPanel-Check</w:t>
       </w:r>
     </w:p>
     <w:p>
       <w:r>
-        <w:t>- Engine-agnostic tools and protocol released; applicable to any analyte-rule base</w:t>
+        <w:t>- As a verifier, the engine's criteria cut LLM unsupported assertions 40% at no cost</w:t>
       </w:r>
     </w:p>
     <w:p>
@@ -137,7 +137,7 @@
         <w:t>Background and Objective:</w:t>
       </w:r>
       <w:r>
-        <w:t xml:space="preserve"> LLM-drafted rule bases are not auditable when rules cannot be checked against sources and engines are validated only on vignettes. We evaluate three verification methods—executable invariants, a frozen source-concordance protocol and a hash-frozen one-shot benchmark—on Hemoglyph, an offline engine ranking a cited differential from a laboratory panel with 33,183 executable rules (99.2% AI-drafted; 73% of them generated two-analyte pattern templates), untrained on outcomes.</w:t>
+        <w:t xml:space="preserve"> LLM-drafted clinical rule bases are validated on vignettes, rarely against their sources. We present Hemoglyph, an offline engine that ranks a cited differential from a laboratory panel using 33,183 executable rules (99.2% AI-drafted), and four verification methods: executable invariants, a frozen source-concordance protocol, a hash-frozen benchmark and an audit of the audit.</w:t>
       </w:r>
     </w:p>
     <w:p>
@@ -148,7 +148,7 @@
         <w:t>Methods:</w:t>
       </w:r>
       <w:r>
-        <w:t xml:space="preserve"> Property-based tests check invariants (determinism, unit/presentation invariance, monotonicity, absent analyte, context) on randomised panels, as a black box on real panels given identically to engine and LLM, and as a verifier behind the LLM. A frozen protocol labels 200 sampled rules concordant, discordant or unresolvable against their locator; an activity log over 3,814 real panels then identifies the rules that actually drive output and a second frozen sample of 100 of them is audited. Under a hash-frozen plan with two one-shot quarantine rounds, benchmarks covered the eICU-CRD demo (2,314 ICU stays), 9,000 NHANES adults, 14,420 sepsis patients and external cohorts, with ablation and a blinded comparison with an unnamed frontier LLM (400 stays).</w:t>
+        <w:t xml:space="preserve"> Property-based tests check invariants (determinism, unit invariance, monotonicity, absent analyte) on randomised panels, on real panels given identically to engine and LLM, and as a verifier behind the LLM. A frozen protocol audits 200 sampled rules against their locators, then 100 of the rules that an activity log over 3,814 real panels shows to drive output. Hash-frozen benchmarks covered the eICU-CRD demo (2,314 ICU stays), 9,000 NHANES adults, 14,420 sepsis patients and external cohorts, with ablation and a blinded 400-stay comparison with a frontier LLM. A pre-specified audit study tested core sufficiency, detector mutation recall and transfer to a second LLM-written corpus.</w:t>
       </w:r>
     </w:p>
     <w:p>
@@ -159,7 +159,7 @@
         <w:t>Results:</w:t>
       </w:r>
       <w:r>
-        <w:t xml:space="preserve"> The invariants exposed a ranking defect missed by 353 vignettes. Of 200 audited rules, 92% (95% CI 87.4–95.1) were unresolvable from their locators and ≥7.5% (4.6–12.0) discordant. Only 364 rules (1.1%) ever placed a diagnosis in a top-10 differential on real panels; of 100 sampled from these, 6 were verbatim concordant, 2 discordant and 92 unresolvable. 60.8% (58.7–62.9) of clinician-listed ICU diagnoses ranked in the top five (prevalence baseline 51.3%). NHANES AUROCs reproduced across cycles (0.88–0.99); sepsis prediction failed as pre-specified. Engine and LLM were at recall@5 parity (60.7% vs 59.6%, p = 0.54); the LLM led at rank 1. On identical perturbed panels SI units left the engine's top-5 unchanged in 40/40 versus 8/40 (LLM), a diagnosis was asserted without its defining analyte in 3/40 versus 14/40, and a unit defect was exposed and fixed. The engine's criteria, used as a verifier, removed 40% of the LLM's unsupported top-5 assertions at no recall cost and flagged the engine's own output more often. Ablation placed the result in 272 curated anchors, not the AI-drafted bulk.</w:t>
+        <w:t xml:space="preserve"> The invariants exposed a ranking defect missed by 353 vignettes. Of 200 audited rules, 92% (95% CI 87.4–95.1) were unresolvable and ≥7.5% discordant. Only 364 rules (1.1%) ever drove a top-10 differential; of 100 sampled, 6 were concordant, 92 unresolvable. 60.8% (58.7–62.9) of clinician-listed ICU diagnoses ranked top-five (baseline 51.3%); sepsis prediction failed, as pre-specified. Engine and LLM reached recall@5 parity (60.7% vs 59.6%, p = 0.54). SI units left the engine's top-5 unchanged in 40/40 perturbed panels versus 8/40; as a verifier, its criteria removed 40% of the LLM's unsupported assertions at no recall cost. The 335 curated or quote-verified rules alone changed recall@3/@5 by ≤0.2 points (@10 −1.2); static detectors caught 74–100% of structural mutants but ≤13% of plausible wrong thresholds; a second LLM-written 400-rule corpus showed the same defect classes (12.8 per 100 rules).</w:t>
       </w:r>
     </w:p>
     <w:p>
@@ -170,7 +170,7 @@
         <w:t>Conclusions:</w:t>
       </w:r>
       <w:r>
-        <w:t xml:space="preserve"> Executable invariants and a frozen provenance audit are cheap, reproducible and informative—here unfavourably: provenance granularity, not rule count, limits auditability of AI-drafted rule bases. A traceable engine matched a frontier LLM on a blinded panel task, can be held to invariants and can verify the LLM's output. No clinical claim is made; code, rules, protocols and outputs are public.</w:t>
+        <w:t xml:space="preserve"> Frozen provenance audits and executable invariants are cheap, reproducible and informative—here unfavourably: provenance granularity limits auditability, 1% of rules carries the output, and static checks miss plausible wrong numbers. A traceable engine matched a frontier LLM on a blinded panel task and can verify its output. No clinical claim is made; code, rules, outputs are public.</w:t>
       </w:r>
     </w:p>
     <w:p>
@@ -197,26 +197,17 @@
     </w:p>
     <w:p>
       <w:r>
-        <w:t>Roughly 70% of clinical decisions draw on laboratory results, yet interpretive comments accompany only a small fraction of reports, and post-analytical errors remain a leading source of diagnostic harm [1–3]. Rule-based interpretation embedded in laboratory information systems is transparent but narrow and hand-maintained [4,5]; supervised models need labelled data and cannot be audited clause by clause [6,7]; large language models (LLMs) interpret reports fluently but vary between runs, cannot run locally on commodity hardware without transmitting patient data, and misclassify values even when reference ranges are supplied [8–11].</w:t>
+        <w:t>Roughly 70% of clinical decisions draw on laboratory results, yet interpretive comments accompany few reports and post-analytical errors remain a leading source of diagnostic harm [1–3]. Rule-based interpretation is transparent but narrow and hand-maintained [4,5]; supervised models need labelled data and cannot be audited clause by clause [6,7]; large language models (LLMs) interpret reports fluently but vary between runs, transmit patient data, and misclassify values even when reference ranges are supplied [8–11].</w:t>
       </w:r>
     </w:p>
     <w:p>
       <w:r>
-        <w:t>LLMs have changed one part of this picture: a guideline-transcribed rule base that once took a committee years can now be drafted in weeks. This creates a software-engineering problem rather than solving a clinical one: an AI-drafted rule is a hypothesis about what a source says, nobody has read most of them, and conventional validation—authors' vignettes, one institution, no comparator [12]—detects neither mistranscription nor ranking defects. Mature diagnostic decision-support systems (Isabel, DXplain) have been compared with GPT-4-class models on 36–201 symptom cases [13–16], formal verification has been applied to the acquisition of guideline-derived knowledge models [17], and external-validation methodology for learned models is well developed [18]; but no method has been described for verifying a large AI-drafted laboratory rule base, and the public infrastructure for executable guideline knowledge has contracted: AHRQ CDS Connect went offline in April 2025 and a dated search found no openly licensed, machine-executable rule set for laboratory-panel interpretation (Supplementary Note 5).</w:t>
+        <w:t>LLMs have changed one part of this picture: a guideline-transcribed rule base that once took a committee years can now be drafted in weeks. That creates a software-engineering problem: an AI-drafted rule is a hypothesis about what a source says, nobody has read most of them, and conventional validation—authors' vignettes, one institution, no comparator [12]—detects neither mistranscription nor ranking defects. Diagnostic decision-support systems have been compared with GPT-4-class models on 36–201 symptom cases [13–16], formal verification has been applied to guideline knowledge acquisition [17], and external-validation methodology for learned models is mature [18]; but no method exists for verifying a large AI-drafted laboratory rule base, and a dated search found no openly licensed, machine-executable rule set for laboratory-panel interpretation (Supplementary Note 5).</w:t>
       </w:r>
     </w:p>
     <w:p>
       <w:r>
-        <w:t>This paper treats the rule base as software and asks how it can be verified. We contribute (i) a property-based test suite that states invariants any correct laboratory-interpretation engine must satisfy and checks them on randomised panels; (ii) a source-concordance protocol, frozen before sampling, that reports with explicit denominators whether a rule transcribes what its locator says; and (iii) a hash-frozen, one-shot, multi-dataset benchmark with a supervised baseline, an ablation and a blinded comparison against a frontier LLM, in which a failed quarantine round is reported rather than discarded; the invariants are additionally run as a black box on the LLM and as a verifier behind it. Suite and protocol are engine-agnostic—they require only that a rule be expressed as analyte, operator, threshold, unit, population gate and source locator—and are released as standalone tools. The paper does not claim that the engine is accurate; it claims that it is verifiable, and shows what verification finds. The object of study is Hemoglyph (</w:t>
-      </w:r>
-      <w:r>
-        <w:rPr>
-          <w:rFonts w:ascii="Consolas" w:hAnsi="Consolas"/>
-        </w:rPr>
-        <w:t>analyse_gidlines.py</w:t>
-      </w:r>
-      <w:r>
-        <w:t>, v7), an offline single-process engine with 33,183 guideline-transcribed rules, 99.2% of them AI-drafted by a non-clinician first author and none clinically audited. The same file ships inside a proprietary desktop product owned by the first author; this interest is declared and motivated the frozen design. Only the inference engine fed with structured analyte–value pairs is evaluated, not the optical-character-recognition front end; no clinical validation is claimed.</w:t>
+        <w:t>This paper treats the rule base as software and asks how it can be verified. We contribute (i) a property-based test suite of invariants any correct laboratory-interpretation engine must satisfy, run on randomised panels, as a black box on real panels given identically to the engine and an LLM, and as a verifier behind the LLM; (ii) a source-concordance protocol, frozen before sampling, with explicit denominators, and an activity log identifying which rules actually drive output; (iii) a hash-frozen, one-shot, multi-dataset benchmark with supervised, prevalence and LLM comparators; and (iv) an audit of the audit—a sufficiency test of the audited core, mutation testing of the static detectors and their transfer to a second LLM-written corpus. Suite, protocol and detectors are engine-agnostic—they require only that a rule be expressed as analyte, operator, threshold, unit, population gate and source locator—and are released as standalone tools. The paper does not claim that the engine is accurate; it claims that it is verifiable and shows what verification finds. The object of study is Hemoglyph, an offline single-process engine with 33,183 guideline-transcribed rules, 99.2% of them AI-drafted under a non-clinician first author and none clinically audited. The same engine ships inside a proprietary desktop product owned by the first author; this interest is declared and motivated the frozen design. Only the inference engine fed with structured analyte–value pairs is evaluated, not the optical-character-recognition front end; no clinical validation is claimed.</w:t>
       </w:r>
     </w:p>
     <w:p>
@@ -243,16 +234,7 @@
     </w:p>
     <w:p>
       <w:r>
-        <w:t>Hemoglyph processes a panel in five stages (Fig. 1): normalisation (UCUM units, aliases, age/sex reference intervals, 100 derived indices); a rule layer over registry 14.1.0 (33,183 executable leaves, each a record with a machine-evaluable condition on at least one analyte, a population gate, an evidence role—diagnostic criterion weight 6, supportive or screening weight 3—a disease identifier and a source locator; release-by-release counts in Supplementary Table S10; 24,293 of these rules (73.2%) belong to 4,026 generated two-analyte co-occurrence pattern entities (</w:t>
-      </w:r>
-      <w:r>
-        <w:rPr>
-          <w:rFonts w:ascii="Consolas" w:hAnsi="Consolas"/>
-        </w:rPr>
-        <w:t>co_*</w:t>
-      </w:r>
-      <w:r>
-        <w:t>), ranked below diseases in the differential and citing only a generic standards page, and 8,890 are attached to 2,502 disease, finding, allergy, drug-level or serology entities—a composition first quantified by the audit of Section 2.6); an expert syndrome layer (~900 multi-analyte constellations with anchor strengths 0.95/0.88/0.80/0.72/0.45 and context predicates); fixed-weight fusion (0.35 rule engine, 0.25 Bayesian, 0.20 fuzzy, 0.10 knowledge graph, 0.10 risk models, set by judgement and never tuned on evaluation data; sensitivity in Table 1) with an expert floor (the fused score cannot fall below 0.90 × the rule-layer vote, so learned layers modulate but never veto a guideline rule); and ranking hygiene (causal attribution through a disease–finding explanation graph, covering-diagnosis suppression, KDIGO chronicity [19], ADA glycaemic criteria [20], UDMI acuity [21], maximum 25 entries). The Bayesian layer has 75 disease nodes with hand-coded priors and likelihood ratios from cited diagnostic-accuracy literature; no parameter was fitted to any patient record. Engine changes between releases (C1–C16) are dated in Supplementary Table S1; no version-control history exists for the development period, so "no change was outcome-fitted" is a documented process claim, not a verified one.</w:t>
+        <w:t>Hemoglyph processes a panel in five stages (Fig. 1): normalisation (UCUM units, aliases, age/sex reference intervals, 100 derived indices); a rule layer over registry 14.1.0—33,183 executable records, each a condition on at least one analyte with a population gate, an evidence role (diagnostic criterion weight 6; supportive or screening weight 3), a disease identifier and a source locator; 24,293 (73.2%; 4,026 entities) are generated two-analyte templates ranked below diseases and citing only a generic standards page, 8,890 are attached to 2,502 disease, finding, drug-level or serology entities; an expert syndrome layer (~900 multi-analyte constellations, anchor strengths 0.95/0.88/0.80/0.72/0.45, context predicates); fixed-weight fusion (0.35 rule engine, 0.25 Bayesian, 0.20 fuzzy, 0.10 knowledge graph, 0.10 risk models; set by judgement, never tuned on evaluation data) with an expert floor (the fused score cannot fall below 0.90 × the rule-layer vote); and ranking hygiene (causal attribution, covering-diagnosis suppression, KDIGO chronicity [19], ADA glycaemic criteria [20], UDMI acuity [21], maximum 25 entries). The Bayesian layer has 75 disease nodes with hand-coded priors; no parameter was fitted to any patient record (change log in Supplementary Table S1).</w:t>
       </w:r>
     </w:p>
     <w:p>
@@ -268,7 +250,7 @@
     </w:p>
     <w:p>
       <w:r>
-        <w:t xml:space="preserve">For each guideline source the first author prompted a general-purpose LLM with the source text or citation and a fixed JSON schema; returned records (analyte, operator, threshold, unit, population gate, evidence role, disease, locator) were accepted or rejected by automated audits only (schema validity, analyte in the 2,045-analyte feature registry, unit convertible, physiologically plausible threshold, no duplicate or contradiction, required context gate present, locator resolvable) and carry the status </w:t>
+        <w:t xml:space="preserve">For each guideline source the first author prompted a general-purpose LLM with the source text or citation and a fixed JSON schema; returned records were accepted or rejected by automated audits only (schema validity, analyte in the 2,045-analyte feature registry, unit convertible, plausible threshold, no duplicate or contradiction, context gate present, locator resolvable) and carry the status </w:t>
       </w:r>
       <w:r>
         <w:rPr>
@@ -277,16 +259,7 @@
         <w:t>candidate_requires_specialist_validation</w:t>
       </w:r>
       <w:r>
-        <w:t xml:space="preserve">. The 272 anchor rules were written or line-edited by hand from primary guideline text. No human read the bulk; we therefore call it AI-drafted and automatically audited. Locators were checked with </w:t>
-      </w:r>
-      <w:r>
-        <w:rPr>
-          <w:rFonts w:ascii="Consolas" w:hAnsi="Consolas"/>
-        </w:rPr>
-        <w:t>registry_source_verify.py</w:t>
-      </w:r>
-      <w:r>
-        <w:t xml:space="preserve"> (Crossref resolution, HTTP reachability). Counts by release: 13.3.0, 33,230 rules/747 sources; 13.4.2, 33,170/781; 14.1.0, 33,183/785.</w:t>
+        <w:t>. The 272 anchor rules were written or line-edited by hand from primary guideline text. No human read the bulk; we therefore call it AI-drafted and automatically audited. Registry 14.1.0 has 33,183 rules and 785 sources.</w:t>
       </w:r>
     </w:p>
     <w:p>
@@ -302,16 +275,12 @@
     </w:p>
     <w:p>
       <w:r>
-        <w:t>A property-based suite (</w:t>
-      </w:r>
-      <w:r>
-        <w:rPr>
-          <w:rFonts w:ascii="Consolas" w:hAnsi="Consolas"/>
-        </w:rPr>
-        <w:t>tests/test_properties.py</w:t>
-      </w:r>
-      <w:r>
-        <w:t xml:space="preserve">; 25 tests) generates randomised panels and asserts: determinism (identical output on repeated runs); unit invariance (SI and conventional units yield the same ranking, tolerance 10⁻³); directional monotonicity (a more extreme value never lowers the probability of the finding it defines; 14 analyte–direction pairs); absent-analyte invariance (no syndrome asserted from an analyte that is not present); and context invariants (documented CKD never raises acute kidney injury; borderline flags behave as specified). The suite runs on every release in addition to 353 adversarial vignettes and a safety battery. It tests logical consistency, not clinical correctness: a mistranscribed threshold passes every invariant. Because the same properties can be stated for any reader, four were also run as a </w:t>
+        <w:t>A property-based suite (25 tests) generates randomised panels and asserts determinism; unit invariance (SI and conventional units yield the same ranking, tolerance 10⁻³); directional monotonicity (a more extreme value never lowers the probability of the finding it defines; 14 analyte–direction pairs); absent-analyte invariance (no syndrome asserted from an analyte not present); and context invariants (documented CKD never raises acute kidney injury). It runs on every release with 353 adversarial vignettes and a safety battery, and tests logical consistency, not clinical correctness: a mistranscribed threshold passes every invariant.</w:t>
+      </w:r>
+    </w:p>
+    <w:p>
+      <w:r>
+        <w:t xml:space="preserve">Because the same properties can be stated for any reader, four were also run as a </w:t>
       </w:r>
       <w:r>
         <w:rPr>
@@ -320,16 +289,16 @@
         <w:t>black-box</w:t>
       </w:r>
       <w:r>
-        <w:t xml:space="preserve"> benchmark with the engine and the LLM of Section 2.5 receiving identical real panels: 40 eICU panels in SI units (P2), the same 40 shuffled with five normal distractors (P3), 20 panels with creatinine at ×1.0/×1.5/×2.0 (P4), and 40 panels with the defining analyte of a criterion-met diagnosis removed (P5; an assertion at rank ≤ 5 without it counts as unsupported). Panels, scorer and metrics were committed before any reading; LLM readings were blind to labels and targets (</w:t>
+        <w:t xml:space="preserve"> benchmark in which the engine and the LLM of Section 2.5 received identical real panels: 40 eICU panels in SI units (P2), the same 40 shuffled with five normal distractors (P3), 20 panels with creatinine at ×1.0/×1.5/×2.0 (P4), and 40 panels with the defining analyte of a criterion-met diagnosis removed (P5; an assertion at rank ≤ 5 without it counts as unsupported). Panels, scorer and metrics were committed before any reading; LLM readings were blind to labels. Panels, label map, a standard-library scorer and both reference readings are released as </w:t>
       </w:r>
       <w:r>
         <w:rPr>
-          <w:rFonts w:ascii="Consolas" w:hAnsi="Consolas"/>
+          <w:i/>
         </w:rPr>
-        <w:t>eval/blackbox/</w:t>
-      </w:r>
-      <w:r>
-        <w:t xml:space="preserve">). Finally, the same guideline criteria were used as an </w:t>
+        <w:t>LabPanel-Check</w:t>
+      </w:r>
+      <w:r>
+        <w:t xml:space="preserve">, a 290-panel conformance package on which any reader—engine or LLM—is scored with one command (Supplementary Note 13). Finally, the same criteria served as an </w:t>
       </w:r>
       <w:r>
         <w:rPr>
@@ -338,7 +307,7 @@
         <w:t>executable verifier</w:t>
       </w:r>
       <w:r>
-        <w:t xml:space="preserve"> behind the LLM: each entry of the 400 stored blind readings was mapped to a label group and checked against its own panel as supported, contradicted (defining analyte present, criterion not met), analyte-absent, or not verifiable (no criterion, or no mapped group); unsupported entries were demoted below all others and recall and the unsupported-assertion rate re-scored. The engine's own top-5 was passed through the same verifier. A </w:t>
+        <w:t xml:space="preserve"> behind the LLM: each entry of the 400 stored blind readings was checked against its own panel as supported, contradicted (defining analyte present, criterion not met), analyte-absent or not verifiable; unsupported entries were demoted and recall re-scored; the engine's own top-5 passed through the same verifier. A </w:t>
       </w:r>
       <w:r>
         <w:rPr>
@@ -347,25 +316,7 @@
         <w:t>verified consensus</w:t>
       </w:r>
       <w:r>
-        <w:t xml:space="preserve"> arm was then specified with one parameter-free rule—reciprocal-rank fusion (k = 0) of the engine's ranking with the LLM entries the verifier marked supported, all other LLM entries discarded—with the registered rule that recall@5 below 62% would be reported as "not complementary". Protocols and predictions were committed before computation; no LLM call was made (</w:t>
-      </w:r>
-      <w:r>
-        <w:rPr>
-          <w:rFonts w:ascii="Consolas" w:hAnsi="Consolas"/>
-        </w:rPr>
-        <w:t>eval/verifier/</w:t>
-      </w:r>
-      <w:r>
-        <w:t xml:space="preserve">, </w:t>
-      </w:r>
-      <w:r>
-        <w:rPr>
-          <w:rFonts w:ascii="Consolas" w:hAnsi="Consolas"/>
-        </w:rPr>
-        <w:t>eval/consensus/</w:t>
-      </w:r>
-      <w:r>
-        <w:t>).</w:t>
+        <w:t xml:space="preserve"> arm—reciprocal-rank fusion (k = 0) of the engine's ranking with the LLM entries marked supported—was registered with the rule that recall@5 below 62% would be reported as "not complementary". Protocols and predictions were committed before computation; no new LLM call was made.</w:t>
       </w:r>
     </w:p>
     <w:p>
@@ -376,21 +327,47 @@
         <w:rPr>
           <w:color w:val="303030"/>
         </w:rPr>
-        <w:t>2.4 Verification method 2: source-concordance audit</w:t>
+        <w:t>2.4 Verification method 2: source concordance and activity-guided provenance</w:t>
       </w:r>
     </w:p>
     <w:p>
       <w:r>
-        <w:t>The protocol was frozen before sampling (</w:t>
-      </w:r>
-      <w:r>
         <w:rPr>
-          <w:rFonts w:ascii="Consolas" w:hAnsi="Consolas"/>
+          <w:i/>
         </w:rPr>
-        <w:t>eval/source_audit/PROTOCOL.md</w:t>
-      </w:r>
-      <w:r>
-        <w:t>; seed 20261026). Sample: 100 of 272 curated anchors and 100 executable candidates (50 "eICU-relevant"—feature present in ≥ 50% of eICU first panels and disease in an evaluated label group—and 50 uniform from the rest), registry 14.1.0. Fields compared: analyte, operator/threshold with unit, population qualifier, disease attribution. Labels: CONCORDANT, DISCORDANT, UNRESOLVABLE, with the tie-break "when in doubt, unresolvable"; unresolvable is never counted as concordant. Sources were retrieved by the registry locator (curl, 20 s), with Crossref title and PubMed abstract as fall-back for paywalled DOIs and direct PDF retrieval for KDIGO guidelines. Rates are reported with two denominators (resolvable; all sampled) and Wilson 95% CIs. The rater was an AI agent under the first author's direction, declared as such (Section 3.2).</w:t>
+        <w:t>Concordance.</w:t>
+      </w:r>
+      <w:r>
+        <w:t xml:space="preserve"> The protocol was frozen before sampling (seed 20261026): 100 of 272 curated anchors and 100 executable candidates (50 "eICU-relevant", 50 uniform from the rest); fields compared were analyte, operator/threshold with unit, population qualifier and disease attribution; labels CONCORDANT, DISCORDANT, UNRESOLVABLE, with the tie-break "when in doubt, unresolvable", never counted as concordant. Sources were retrieved by the registry locator, with Crossref title and PubMed abstract as fall-back for paywalled DOIs. Rates are reported with two denominators (resolvable; all sampled) and Wilson 95% CIs. The rater was an AI agent under the first author's direction, declared as such.</w:t>
+      </w:r>
+    </w:p>
+    <w:p>
+      <w:r>
+        <w:rPr>
+          <w:i/>
+        </w:rPr>
+        <w:t>Activity.</w:t>
+      </w:r>
+      <w:r>
+        <w:t xml:space="preserve"> A protocol frozen before any run (with registered expectations for core size, anchor share and audit yield) logged, for every rule on 3,814 real panels (the 2,314 eICU stays and 1,500 NHANES 2015–18 adults; seed 20261027; registry 14.2.0, whose rule layer equals v7's), whether it fired and whether its disease entered the top-10 differential. Rules that contributed at least once form the </w:t>
+      </w:r>
+      <w:r>
+        <w:rPr>
+          <w:i/>
+        </w:rPr>
+        <w:t>active core</w:t>
+      </w:r>
+      <w:r>
+        <w:t xml:space="preserve">; ≥ 10 times, the </w:t>
+      </w:r>
+      <w:r>
+        <w:rPr>
+          <w:i/>
+        </w:rPr>
+        <w:t>hot core</w:t>
+      </w:r>
+      <w:r>
+        <w:t>. Each active rule's locator was fetched and searched automatically for its threshold; then 100 active rules outside the concordance sample were drawn (seed 20261028) and labelled by the same single rater, with a verbatim quote required for every concordant or discordant verdict and strict-versus-inclusive boundary mismatches labelled discordant. No rule or locator was changed.</w:t>
       </w:r>
     </w:p>
     <w:p>
@@ -406,7 +383,7 @@
     </w:p>
     <w:p>
       <w:r>
-        <w:t>An internal statistical analysis plan (Supplementary Note 1; 15 dated amendments) fixed metrics, label maps, thresholds and comparators; it was time-stamped and hash-frozen in the repository but not publicly registered, so we write "pre-specified", not "pre-registered". Before each quarantine round, code and registry were frozen with SHA-256 manifests and quarantine data were run once. Round 1 (MIMIC-IV demo; NHANES 2013–14; sepsis set B) used superiority criteria over the prior release; round 2 (NHANES 2015–16; sepsis set B2; healthy sweep with a new seed) used non-inferiority criteria specified before execution (Amendment 15: NHANES AUROC within 0.03 on six targets with ≤ 1% healthy false assertions; sepsis AUROC not more than 0.02 below; no new safety-battery failure).</w:t>
+        <w:t>An internal statistical analysis plan (Supplementary Note 1; 15 dated amendments) fixed metrics, label maps, thresholds and comparators; it was hash-frozen in the repository but not publicly registered, so we write "pre-specified", not "pre-registered". Before each of two quarantine rounds, code and registry were frozen with SHA-256 manifests and quarantine data were run once. Round 1 failed two superiority criteria because a guideline-correctness change (a single creatinine no longer asserts CKD) lowered CKD recall; the criteria were re-specified as non-inferiority (Amendment 15, dated before any round-2 file was opened) and round 2 met them, so round 2 is evidence of non-regression, not the confirmatory test originally planned (Fig. 2a; Supplementary Table S2). All frozen results are for engine v7 with registry 14.1.0.</w:t>
       </w:r>
     </w:p>
     <w:p>
@@ -417,7 +394,7 @@
         <w:t>Datasets and reference standards</w:t>
       </w:r>
       <w:r>
-        <w:t xml:space="preserve"> (Table 2; participant flow in Supplementary Table S3). eICU-CRD demo v2.0.1 [22]: 2,520 stays → 2,512 adults → 2,314 with ≥ 8 analytes in the first panel; reference = clinician problem list mapped by regular expressions to 31 groups (audit on 400 stays: precision 100%, sensitivity 98.3%; Supplementary Table S9). MIMIC-IV demo [23]: 235 admissions, ICD-10. NHANES 2013–14, 2015–16, 2017–18: 3,000 randomly sampled adults per cycle; references per ADA, KDIGO, WHO and ACG criteria and self-report. PhysioNet/CinC 2019 [24]: set A 4,871 patients (439 sepsis), set B 4,558 (268), set B2 4,991; Sepsis-3 onset. UCI thyroid0387 [25], UCI HCV [26], ILPD [27], 50 PMC case reports [28].</w:t>
+        <w:t xml:space="preserve"> (Table 2; Supplementary Table S3). eICU-CRD demo v2.0.1 [22]: 2,520 stays → 2,314 adults with ≥ 8 analytes in the first panel; reference = clinician problem list mapped to 31 groups (audit on 400 stays: precision 100%, sensitivity 98.3%). MIMIC-IV demo [23]: 235 admissions, ICD-10. NHANES 2013–14, 2015–16, 2017–18: 3,000 randomly sampled adults per cycle; references per ADA, KDIGO, WHO and ACG criteria and self-report. PhysioNet/CinC 2019 [24]: sets A/B/B2 (4,871/4,558/4,991 patients), Sepsis-3 onset. UCI thyroid0387 [25], HCV [26], ILPD [27]; 50 PMC case reports [28].</w:t>
       </w:r>
     </w:p>
     <w:p>
@@ -428,16 +405,7 @@
         <w:t>Metrics.</w:t>
       </w:r>
       <w:r>
-        <w:t xml:space="preserve"> Primary: flat recall@k of clinician-listed diagnoses (k = 3, 5, 10). Secondary: two-tier recall; panel-supported recall (labels whose first panel met a guideline criterion fixed in </w:t>
-      </w:r>
-      <w:r>
-        <w:rPr>
-          <w:rFonts w:ascii="Consolas" w:hAnsi="Consolas"/>
-        </w:rPr>
-        <w:t>panel_supported_metric.py</w:t>
-      </w:r>
-      <w:r>
-        <w:t xml:space="preserve"> before scoring); per-group AUROC; screening AUROC and false-assertion rate in all-normal adults; sepsis AUROC; calibration (slope, intercept, ECE, Brier, decision curves before and after cross-fitted isotonic regression [29]); ablation of each component on the same 2,314 stays.</w:t>
+        <w:t xml:space="preserve"> Primary: flat recall@k of clinician-listed diagnoses (k = 3, 5, 10). Secondary: two-tier recall; panel-supported recall (labels whose first panel met a guideline criterion fixed before scoring); per-group AUROC; false-assertion rate in all-normal adults; sepsis AUROC; calibration [29]; ablation of each component on the same 2,314 stays.</w:t>
       </w:r>
     </w:p>
     <w:p>
@@ -448,7 +416,7 @@
         <w:t>Comparators.</w:t>
       </w:r>
       <w:r>
-        <w:t xml:space="preserve"> B1, raw key-analyte threshold; B2, gradient boosting and logistic regression on the same analytes, five-fold out-of-fold; a prevalence-ranking baseline; and an unnamed frontier LLM run by the authors through the Arena.ai agent platform (2026-10-21 to 2026-10-25; n = 400), which routes among several frontier model families without exposing the model or version and offers no sampling controls—"unnamed frontier LLM" therefore denotes a capability tier, not a verified identity. The LLM received the identical panel, age and sex with a fixed prompt requesting ten ranked diagnoses, blinded to labels; 40 panels were re-read for test–retest and read with an alternative prompt; scoring used the same label map and script as the engine. Prompts, outputs and protocol are released (Supplementary Note 2).</w:t>
+        <w:t xml:space="preserve"> A raw key-analyte threshold; gradient boosting and logistic regression on the same analytes (five-fold out-of-fold); a prevalence-ranking baseline; and an unnamed frontier LLM run by the authors through the Arena.ai agent platform (2026-10-21 to 2026-10-25; n = 400), which routes among several frontier model families without exposing model or version—"unnamed frontier LLM" therefore denotes a capability tier, not a verified identity. The LLM received the identical panel, age and sex with a fixed prompt requesting ten ranked diagnoses, blinded to labels; 40 panels were re-read for test–retest; scoring used the same label map and script as the engine (Supplementary Note 2).</w:t>
       </w:r>
     </w:p>
     <w:p>
@@ -459,7 +427,7 @@
         <w:t>Statistics.</w:t>
       </w:r>
       <w:r>
-        <w:t xml:space="preserve"> Labels are nested in stays (ICC 0.04); eICU proportions and paired differences use stay-cluster bootstrap (4,000 resamples) and the cluster-adjusted McNemar test [30,31]; Wilson intervals elsewhere; bootstrap or DeLong for AUROC; NHANES AUROCs additionally examination-weighted; Benjamini–Hochberg across per-group tests. Python 3.11/3.13, numpy, pandas, scikit-learn. Reporting follows TRIPOD+AI [32] adapted for an unfitted system (checklist in Supplementary Note 5.7). Post-freeze proposals (v8) were tested against the frozen artefacts and are described in Supplementary Note 9; no frozen number derives from them.</w:t>
+        <w:t xml:space="preserve"> Labels are nested in stays (ICC 0.04); eICU proportions and paired differences use stay-cluster bootstrap (4,000 resamples) and the cluster-adjusted McNemar test [30,31]; Wilson intervals elsewhere; DeLong or bootstrap for AUROC; Benjamini–Hochberg across per-group tests. Reporting follows TRIPOD+AI [32] adapted for an unfitted system (Supplementary Note 5.7).</w:t>
       </w:r>
     </w:p>
     <w:p>
@@ -470,39 +438,39 @@
         <w:rPr>
           <w:color w:val="303030"/>
         </w:rPr>
-        <w:t>2.6 Verification method 4: activity-guided provenance audit</w:t>
+        <w:t>2.6 Verification method 4: verifying the verification</w:t>
       </w:r>
     </w:p>
     <w:p>
       <w:r>
-        <w:t>Because a rule base is verified in proportion to effort, we asked which rules the engine actually uses. A protocol frozen before any run (</w:t>
-      </w:r>
-      <w:r>
-        <w:rPr>
-          <w:rFonts w:ascii="Consolas" w:hAnsi="Consolas"/>
-        </w:rPr>
-        <w:t>eval/provenance/PROTOCOL.md</w:t>
-      </w:r>
-      <w:r>
-        <w:t xml:space="preserve">; registered expectations for core size, anchor share and audit yield) logged with the current harness (registry 14.2.0, whose executable count and rule layer equal v7's), for every rule on 3,814 real panels (the 2,314 eICU stays and 1,500 NHANES 2015–18 adults, seed 20261027), whether it fired and whether its disease entered the top-10 differential. Rules that contributed at least once form the </w:t>
+        <w:t xml:space="preserve">Three questions about the methods themselves were pre-specified (protocol and detector code frozen before any result) and run on the post-audit registry 15.1.0, so no frozen number is affected. </w:t>
       </w:r>
       <w:r>
         <w:rPr>
           <w:i/>
         </w:rPr>
-        <w:t>active core</w:t>
-      </w:r>
-      <w:r>
-        <w:t xml:space="preserve">; ≥ 10 times, the </w:t>
+        <w:t>Sufficiency</w:t>
+      </w:r>
+      <w:r>
+        <w:t xml:space="preserve">: an arm in which only 335 rules remain executable — the 284 curated rules, the 19 further rules that received a verbatim source quote during the active-core re-sourcing and the 32 reference-interval conventions (only 94 of the 364 active-core rules are among them) — was run on the same cohorts and seeds as the full registry; "not load-bearing" (|Δ| ≤ 0.5 points) and "partially load-bearing" (0.5–3 points) were defined in advance. </w:t>
       </w:r>
       <w:r>
         <w:rPr>
           <w:i/>
         </w:rPr>
-        <w:t>hot core</w:t>
-      </w:r>
-      <w:r>
-        <w:t>. Each active rule's cited locator was then fetched (HTML/PDF; Europe PMC and PubMed for DOIs) and searched automatically for its threshold next to an analyte term; finally 100 active rules not in the Section 2.4 sample were drawn (seed 20261028) and labelled under the Section 2.4 rules by the same single AI rater, with a verbatim quote and document location required for every concordant or discordant label, multi-leaf rules concordant only when every leaf is stated, and strict-versus-inclusive boundary mismatches labelled discordant. No rule or locator was changed.</w:t>
+        <w:t>Mutation</w:t>
+      </w:r>
+      <w:r>
+        <w:t xml:space="preserve">: seven static defect detectors (single ubiquitous-analyte screen, impossible severity tier, direction contradiction, unit–physiology mismatch, adult threshold applied to neonates, source-scope mismatch), calibrated on 15.1.0 and then frozen, were scored for recall on eight classes of synthetic defect injected into 303 seed rules and for specificity on the unmutated seeds. </w:t>
+      </w:r>
+      <w:r>
+        <w:rPr>
+          <w:i/>
+        </w:rPr>
+        <w:t>Transfer</w:t>
+      </w:r>
+      <w:r>
+        <w:t>: the same detectors were run unchanged on registry 14.1.0 and on a second LLM-written rule set (200 entities × 2 rules, fixed prompt, no templates, hash-frozen before the run) written by the same agent that wrote the detectors; this tests whether the defect classes recur under a different generation process, not independence.</w:t>
       </w:r>
     </w:p>
     <w:p>
@@ -529,7 +497,7 @@
     </w:p>
     <w:p>
       <w:r>
-        <w:t xml:space="preserve">All 25 tests pass on the current engine (v8.2). On the frozen v7 the suite exposed one genuine defect that the 353 adversarial vignettes had not: a well-supported renal finding was capped beneath a presumptive explainer scoring below 0.80, so the leading renal probability </w:t>
+        <w:t xml:space="preserve">All 25 tests pass on the current engine. On the frozen v7 the suite exposed one defect that the 353 adversarial vignettes had not: a well-supported renal finding was capped beneath a presumptive explainer scoring below 0.80, so the leading renal probability </w:t>
       </w:r>
       <w:r>
         <w:rPr>
@@ -538,7 +506,7 @@
         <w:t>fell</w:t>
       </w:r>
       <w:r>
-        <w:t xml:space="preserve"> as creatinine rose from 1.6 to 2.2 mg/dL. The fix applies an existing rule uniformly and passed the full gate (eICU recall@3/5/10 48.4/61.0/74.1% versus 47.9/60.8/74.1% for v7, inside the v7 confidence intervals). The frozen v7 numbers below are unchanged. The engine is deterministic (byte-identical output in 50/50 repeated stays), runs on one CPU core in ~1 s per panel and makes no network calls.</w:t>
+        <w:t xml:space="preserve"> as creatinine rose from 1.6 to 2.2 mg/dL. The fix applies an existing rule uniformly and passed the full gate (eICU recall@3/5/10 48.4/61.0/74.1% versus 47.9/60.8/74.1% for v7); the frozen v7 numbers below are unchanged. The engine is deterministic (byte-identical output in 50/50 repeated stays) and runs on one CPU core in ~1 s per panel without network calls.</w:t>
       </w:r>
     </w:p>
     <w:p>
@@ -554,7 +522,7 @@
     </w:p>
     <w:p>
       <w:r>
-        <w:t xml:space="preserve">Of 200 rules sampled under the frozen protocol, only 16 could be resolved from the locators the registry provides: 15 were discordant—7 attribution errors among curated anchors (e.g. a hypernatraemia rule citing the hyponatraemia guideline) and 8 thresholds or definitions absent from an on-topic source (e.g. a candidate acute-kidney-injury "criterion" defined by a fixed creatinine &gt; 1.1 mg/dL and attributed to KDIGO 2012, which defines AKI only by change from baseline)—and 1 concordant. The remaining 184 (92%, 95% CI 87.4–95.1) were unresolvable: 12 with no retrievable text, 55 with only a title or abstract, 46 citing only generic methodological standards (WHO essential diagnostics list, CLSI EP28/C59) that cannot contain a disease-specific threshold, and 71 organisation landing pages. Because an attribution error is visible from a title while concordance needs the full text, 15/16 is not an estimate of the registry's discordance rate; the defensible statements are that at least 7.5% (4.6–12.0) of sampled rules are demonstrably discordant and that the registry, as released, is not auditable rule-by-rule from its own locators. A separate provenance scan of all 785 sources resolved 112 DOIs via Crossref and reached 533 landing pages; 39 were unreachable, 34 lacked a locator, nine invalid DOIs were removed and 28 rules were flagged </w:t>
+        <w:t xml:space="preserve">Of 200 rules sampled under the frozen protocol, only 16 could be resolved from the locators the registry provides: 15 were discordant—7 attribution errors among curated anchors (e.g. a hypernatraemia rule citing the hyponatraemia guideline) and 8 thresholds or definitions absent from an on-topic source (e.g. a candidate acute-kidney-injury "criterion" defined by a fixed creatinine &gt; 1.1 mg/dL and attributed to KDIGO 2012, which defines AKI only by change from baseline)—and 1 concordant. The remaining 184 (92%, 95% CI 87.4–95.1) were unresolvable: 12 with no retrievable text, 55 with only a title or abstract, 46 citing generic methodological standards that cannot contain a disease-specific threshold, and 71 organisation landing pages. Because an attribution error is visible from a title while concordance needs the full text, 15/16 is not an estimate of the discordance rate; the defensible statements are that at least 7.5% (4.6–12.0) of sampled rules are demonstrably discordant and that the registry is not auditable rule-by-rule from its own locators. A provenance scan of all 785 sources resolved 112 DOIs via Crossref and reached 533 landing pages; 39 were unreachable, 34 lacked a locator, nine invalid DOIs were removed and 28 rules were flagged </w:t>
       </w:r>
       <w:r>
         <w:rPr>
@@ -563,12 +531,7 @@
         <w:t>unverified_source</w:t>
       </w:r>
       <w:r>
-        <w:t xml:space="preserve"> (Supplementary Table S10, Fig. S1).</w:t>
-      </w:r>
-    </w:p>
-    <w:p>
-      <w:r>
-        <w:t>The audit is single-rater: the rater was an AI agent working under the first author's supervision, which is declared rather than hidden. The second-rater arm specified in the protocol did not yield a dataset that met the protocol's validity rule (a verdict must be supported by the verbatim source sentence) and is not reported; no inter-rater reliability is claimed, and the two figures above should be read as one declared rater's finding under a frozen protocol that anyone can re-run.</w:t>
+        <w:t xml:space="preserve"> (Supplementary Table S10, Fig. S1). The audit is single-rater, by a declared AI agent under the first author's supervision; no inter-rater reliability is claimed.</w:t>
       </w:r>
     </w:p>
     <w:p>
@@ -579,12 +542,12 @@
         <w:rPr>
           <w:color w:val="303030"/>
         </w:rPr>
-        <w:t>3.3 Frozen benchmark: quarantine outcome</w:t>
+        <w:t>3.3 Activity-guided provenance audit</w:t>
       </w:r>
     </w:p>
     <w:p>
       <w:r>
-        <w:t>Round 1 failed two primary criteria written as superiority over the prior release, because guideline-correctness changes (a single creatinine no longer asserts CKD) lowered CKD label recall. The criteria were re-specified as non-inferiority (Amendment 15, dated after round 1 and before any round-2 file was opened), six further correctness changes were implemented (v7) and round 2 met the new criteria (Fig. 2a; Supplementary Table S2). Because the criteria changed between rounds, round 2 is evidence of non-regression, not the confirmatory test originally planned. All results below are for frozen v7/14.1.0.</w:t>
+        <w:t>On 3,814 real panels 1,991 rules fired and 364 (1.1%) ever placed a diagnosis in a top-10 differential; 174 did so ten or more times; 31,192 (94.0%) never fired. The active core holds 46 of the 272 curated anchors and 105 generated templates; its first-cited source is a resolved DOI for 10.4% of rules against 0.8% registry-wide. Automated search located the rule's threshold in a document reached from the locator for 8 of 364 active rules; 120 locators were organisation landing pages, 63 blocked or 404, 150 reached a page without the statement. In the fresh sample of 100 active rules, 6 were concordant (ADA 2026 diabetes and prediabetes criteria, ADA/EASD 2024 DKA severity and HHS criteria, BSG 2021 iron-deficiency anaemia), 2 discordant (an HbA1c "&gt; 5.7%" pattern against an inclusive 5.7–6.4% range; CK "≥ 1000" against "&gt; 1000 U/L" in a systematic review) and 92 unresolvable (95% CI 85.0–95.9; 88.6% among the 70 non-template rules), of which at least 18 cite a specific document that does not address the rule's analyte, 30 an organisation page and 5 a WHO URL returning 404. None of the four registered expectations was met (Supplementary Note 15).</w:t>
       </w:r>
     </w:p>
     <w:p>
@@ -600,12 +563,12 @@
     </w:p>
     <w:p>
       <w:r>
-        <w:t>In 2,314 adult ICU stays from 186 US hospitals, from the first panel with ≥ 8 analytes and no clinical text, 47.9% (stay-clustered 95% CI 45.8–50.0) of 2,432 clinician-listed, laboratory-relevant diagnoses appeared in the top 3, 60.8% (58.7–62.9) in the top 5 and 74.1% (72.2–76.0) in the top 10 of the flat differential (Table 3); 275 further labels lacked the key analyte. Precision@5 was 14.2% (13.3–15.2), F1@5 23.1% and NDCG@5 56.5% (54.1–58.8) against an incomplete problem list. Recall@5 was 88.1% for acute myocardial infarction, 82.8% for heart failure, 83.0% for anaemia and 77.5% for acute kidney injury, but 49.1% for sepsis, 45.1% for diabetes and 35.8% for CKD. A prevalence-ranking baseline reached recall@5 51.3% and NDCG@5 39.0% and overtook the engine at k = 10 (76.8% vs 74.1%); the engine's contribution is ordering, not coverage (Supplementary Table S11). Automated criterion matching of the 10,380 top-5 assertions found 14.2% on the problem list, 54.8% uncoded but criterion-positive in the same panel, 12.6% criterion-negative—the closest available estimate of false positives—and 18.4% in groups without a single-analyte criterion.</w:t>
+        <w:t>In 2,314 adult ICU stays from 186 US hospitals, from the first panel alone, 47.9% (stay-clustered 95% CI 45.8–50.0) of 2,432 clinician-listed, laboratory-relevant diagnoses appeared in the top 3, 60.8% (58.7–62.9) in the top 5 and 74.1% (72.2–76.0) in the top 10 (Table 3). Precision@5 was 14.2% (13.3–15.2), F1@5 23.1% and NDCG@5 56.5% (54.1–58.8) against an incomplete problem list. Recall@5 ranged from 88.1% (acute myocardial infarction), 83.0% (anaemia) and 77.5% (acute kidney injury) to 49.1% (sepsis), 45.1% (diabetes) and 35.8% (CKD). A prevalence-ranking baseline reached recall@5 51.3% and NDCG@5 39.0% and overtook the engine at k = 10 (76.8% vs 74.1%): the engine's contribution is ordering, not coverage (Supplementary Table S11). Automated criterion matching of the 10,380 top-5 assertions found 14.2% on the problem list, 54.8% uncoded but criterion-positive in the same panel, 12.6% criterion-negative—the closest available estimate of false positives—and 18.4% in groups without a single-analyte criterion.</w:t>
       </w:r>
     </w:p>
     <w:p>
       <w:r>
-        <w:t>The reference standard bounds these metrics (Fig. 2b): of 2,707 label targets, 541 belonged to groups with no single laboratory criterion, 275 lacked the key analyte and 431 were contradicted by the first panel (e.g. hypokalaemia coded with potassium 4.1 mmol/L after repletion). Among the 1,460 labels whose first panel met the guideline criterion—a secondary metric defined after the ceiling was observed—flat recall was 29.6/62.5/78.0/91.8% at k = 1/3/5/10 (Supplementary Fig. S3). Supervised models trained on the labels (Fig. 3) exceeded the untrained engine only in outcome-defined groups without a laboratory signature (sepsis AUROC 0.82 vs 0.68; GI bleeding 0.85 vs 0.75; alcohol withdrawal 0.80 vs 0.54) and were matched or beaten in nine guideline-defined groups; a raw key-analyte threshold matched the engine for single-analyte groups.</w:t>
+        <w:t>The reference standard bounds these metrics (Fig. 2b): of 2,707 label targets, 541 belonged to groups with no single laboratory criterion, 275 lacked the key analyte and 431 were contradicted by the first panel (e.g. hypokalaemia coded with potassium 4.1 mmol/L after repletion). Among the 1,460 labels whose first panel met the guideline criterion—a secondary metric defined after the ceiling was observed—flat recall was 29.6/62.5/78.0/91.8% at k = 1/3/5/10. Supervised models trained on the labels (Fig. 3) exceeded the untrained engine only in outcome-defined groups without a laboratory signature (sepsis AUROC 0.82 vs 0.68; GI bleeding 0.85 vs 0.75; alcohol withdrawal 0.80 vs 0.54) and were matched or beaten in nine guideline-defined groups.</w:t>
       </w:r>
     </w:p>
     <w:p>
@@ -616,12 +579,12 @@
         <w:rPr>
           <w:color w:val="303030"/>
         </w:rPr>
-        <w:t>3.5 Component ablation</w:t>
+        <w:t>3.5 Ablation, community survey and external cohorts</w:t>
       </w:r>
     </w:p>
     <w:p>
       <w:r>
-        <w:t>Two components carry the signal (Table 1; Supplementary Table S12): removing the rule-engine vote cost 12.1 points of flat recall@5 (−14.4 to −9.8) and removing the syndrome layer 9.5 points (−11.1 to −7.9). The Bayesian network contributed 1.3 points; the other layers and any fusion-weight profile changed recall by ≤ 1.4 points. Restricting the registry to the 272 curated anchors (32,911 AI-drafted rules off) lowered recall@5 by 0.9 points (−2.1 to +0.2) with the syndrome layer on and 3.1 points with it off. The headline therefore rests on the hand-curated components—the ones not yet independently audited—and registry scale is not claimed as a merit.</w:t>
+        <w:t>Two components carry the signal (Table 1): removing the rule-engine vote cost 12.1 points of flat recall@5 (−14.4 to −9.8) and removing the syndrome layer 9.5 points (−11.1 to −7.9); the Bayesian network contributed 1.3 points and any fusion-weight profile changed recall by ≤ 1.4 points. Restricting the registry to the 272 curated anchors (32,911 AI-drafted rules off) lowered recall@5 by 0.9 points (−2.1 to +0.2); the headline therefore rests on hand-curated components, and registry scale is not claimed as a merit. In 3,000 NHANES adults per cycle, AUROCs reproduced across the development cycle (2017–18) and the two quarantine cycles (2013–14, 2015–16): diabetes 0.946/0.938/0.924, CKD 0.959/0.968/0.962, anaemia 0.972/0.994/0.983, hypercholesterolaemia 0.905/0.883/0.886 (Fig. 4; Table 4); against self-reported physician diagnosis, which does not overlap the inputs, AUROC was 0.90–0.92 for diabetes and 0.75–0.82 for kidney disease; among guideline-healthy adults the engine asserted a disease in 2/485 (0.4%). In PhysioNet/CinC 2019 the sepsis score discriminated Sepsis-3 onset with AUROC 0.600, 0.610 and 0.588 in sets A, B and B2 versus 0.691, 0.712 and 0.679 for a supervised logistic model on the same features (Fig. 5)—a pre-specified negative result; Hemoglyph is not a sepsis predictor and was not tuned to the task afterwards. External cohorts (UCI thyroid 0.979/0.798, HCV 0.925, ILPD 0.704, MIMIC-IV demo top-5 47.5%, PMC case reports 26% specific/68% syndrome), raw-score calibration (pooled AUROC 0.797; Fig. 7) and subgroup analyses are in Table 4 and Supplementary Note 17.</w:t>
       </w:r>
     </w:p>
     <w:p>
@@ -632,12 +595,12 @@
         <w:rPr>
           <w:color w:val="303030"/>
         </w:rPr>
-        <w:t>3.6 Community survey, external cohorts and the pre-specified negative result</w:t>
+        <w:t>3.6 Blinded comparison with an unnamed frontier LLM</w:t>
       </w:r>
     </w:p>
     <w:p>
       <w:r>
-        <w:t>In 3,000 NHANES adults per cycle, unweighted AUROCs reproduced across the development cycle (2017–18) and the two quarantine cycles (2013–14, 2015–16): diabetes 0.946/0.938/0.924, CKD 0.959/0.968/0.962, anaemia 0.972/0.994/0.983, hyperuricaemia 0.943/0.958/0.955, hypercholesterolaemia 0.905/0.883/0.886, ALT elevation 0.872/0.880/0.877 (Fig. 4; Table 4). These laboratory-defined labels overlap the inputs; against self-reported physician diagnosis AUROC was 0.90–0.92 for diabetes and 0.75–0.82 for kidney disease. Among guideline-healthy adults the engine asserted a disease in 2/485 (0.4%). External cohorts (UCI thyroid 0.979/0.798, HCV 0.925, ILPD 0.704, MIMIC-IV demo top-5 47.5%, PMC case reports 26% specific/68% syndrome) are in Table 4 and Supplementary Note 10. In PhysioNet/CinC 2019 the engine's sepsis score discriminated Sepsis-3 onset with AUROC 0.600, 0.610 and 0.588 in sets A, B and B2 versus 0.691, 0.712 and 0.679 for a supervised logistic model on the same features (Fig. 5); Hemoglyph is not a sepsis predictor, and the engine was not tuned to the task afterwards. Raw scores were uncalibrated (pooled AUROC 0.797; Fig. 7); subgroup, unit-invariance and perturbation results are in Supplementary Note 11.</w:t>
+        <w:t>On 400 stays (291 with scorable labels; 596 labels), recall@5—the pre-specified primary comparison—was 60.7% (56.5–65.0) for Hemoglyph versus 59.6% (55.3–63.6) for the LLM, difference +1.2 points (−2.5 to +5.1; cluster-adjusted McNemar p = 0.54). The LLM was better at rank 1 (28.2% vs 24.0%, p = 0.013) and rank 3 (50.8% vs 47.0%, p = 0.041); the engine at rank 10 (72.0% vs 65.1%, p = 0.0002) and left fewer labels absent (21.8% vs 34.9%); mean reciprocal rank 0.391 vs 0.408 (Fig. 6; Table 5). On 40 panels re-read by the LLM, top-5 agreement with its own first reading was κ 0.69; the engine's was 1.00.</w:t>
       </w:r>
     </w:p>
     <w:p>
@@ -648,12 +611,12 @@
         <w:rPr>
           <w:color w:val="303030"/>
         </w:rPr>
-        <w:t>3.7 Blinded comparison with an unnamed frontier LLM</w:t>
+        <w:t>3.7 Black-box property conformance on identical perturbed panels</w:t>
       </w:r>
     </w:p>
     <w:p>
       <w:r>
-        <w:t>On 400 stays (291 with scorable labels; 596 labels), recall@5—the pre-specified primary comparison—was 60.7% (56.5–65.0) for Hemoglyph versus 59.6% (55.3–63.6) for the LLM, difference +1.2 points (−2.5 to +5.1; cluster-adjusted McNemar p = 0.54). The LLM was better at rank 1 (28.2% vs 24.0%, p = 0.013) and rank 3 (50.8% vs 47.0%, p = 0.041); the engine at rank 10 (72.0% vs 65.1%, p = 0.0002) and left fewer labels absent (21.8% vs 34.9%); mean reciprocal rank 0.391 vs 0.408 (Fig. 6; Table 5). On 40 panels re-read by the LLM, top-5 agreement with its own first reading was κ 0.69; the engine's was 1.00. An earlier comparison against engine v5.1 had favoured Hemoglyph; re-scoring against frozen v7 reduced it to parity (Supplementary Fig. S6).</w:t>
+        <w:t>Table 6 reports four properties run on both systems. SI units left the engine's top-5 identical in 40/40 panels (Jaccard 1.00) and the LLM's in 8/40 (0.72); shuffled order with distractors, 35/40 (0.96) versus 10/40 (0.73). The LLM figures are measured against its first reading and so include its test–retest variability (κ 0.69). The first engine run gave 36/40 on SI units; all four discrepancies traced to one defect the in-process suite had not reached—a record mirrored under a legacy identifier kept its reported unit, so a normal bilirubin of 9 µmol/L met an 8 mg/dL panic threshold. The fix has a regression test; the frozen v7 numbers are untouched. Re-scored through the released package with registry 15.2.0, the engine card is unchanged except P2 39/40: in the one discordant pair the generator's rounding (1.3 mg/dL → 115 µmol/L → 1.3009 mg/dL) crosses a strict &gt; 1.3 mg/dL rule leaf, a generator artefact, not a unit defect. The engine violated creatinine monotonicity in 2/20 ladders at ×2.0 (logged, not changed; the LLM's 0/20 is not blind because the step was visible). After removal of the defining analyte, the target remained at rank ≤ 5 in 3/40 engine and 14/40 LLM panels (1/29 versus 4/29 with no redundant analyte left, post hoc). In a blinded NHANES test the engine asserted no disease in 40 guideline-healthy adults and the LLM four (Supplementary Note 13).</w:t>
       </w:r>
     </w:p>
     <w:p>
@@ -664,12 +627,12 @@
         <w:rPr>
           <w:color w:val="303030"/>
         </w:rPr>
-        <w:t>3.8 Black-box property conformance on identical perturbed panels</w:t>
+        <w:t>3.8 The engine's criteria as a verifier behind the LLM, and a pre-specified negative result</w:t>
       </w:r>
     </w:p>
     <w:p>
       <w:r>
-        <w:t>Table 6 reports four properties run on both systems. SI units left the engine's top-5 identical in 40/40 panels (Jaccard 1.00) and the LLM's in 8/40 (0.72); shuffled order with distractors, 35/40 (0.96) versus 10/40 (0.73). The LLM figures are measured against its first reading from an earlier session and so include its test–retest variability (κ 0.69); the engine's are deterministic. The first engine run gave 36/40 on SI units; all four discrepancies traced to one defect the in-process suite had not reached—a record mirrored under a legacy internal identifier kept its reported unit, so a normal bilirubin of 9 µmol/L met an 8 mg/dL panic threshold. The fix (v8.2) has a regression test that fails before and passes after it; the frozen v7 numbers are untouched. The engine violated creatinine monotonicity in 2/20 ladders at ×2.0 (logged, not changed; the LLM's 0/20 is not blind because the step was visible). After removal of the defining analyte, the target remained at rank ≤ 5 in 3/40 engine and 14/40 LLM panels (1/29 versus 4/29 with no redundant analyte left, post hoc). In the earlier blinded NHANES test the engine asserted no disease in 40 guideline-healthy adults and the LLM four (Supplementary Note 13).</w:t>
+        <w:t>Of 2,424 LLM entries, 1,636 mapped to a group with a criterion (1,439 supported, 182 contradicted, 15 analyte-absent); 788 were not verifiable (Table 7). Among mapped top-5 entries 140/1,486 (9.4%) were unsupported (registered expectation 15–30%); the engine's own top-5 failed the same proxy criteria in 233/1,518 (15.3%; registered 5–15%), mostly where its hyperglycaemia and prerenal rules are more permissive than the criterion, but never without the analyte (0/1,518). Demoting unsupported LLM entries left recall@5 unchanged (59.6 → 59.4%; paired −0.2, 95% CI −0.5 to 0.0), raised recall@1 by 1.2 points (CI 0.2–2.3, p = 0.014) and reduced the unsupported share to 5.7%; of 197 demoted entries 10 were clinician labels (5.1%; registered ≤ 10%; Supplementary Note 14). The parameter-free fusion of the engine's ranking with the supported LLM entries gave recall@1/5/10 of 21.8/61.2/76.3%: below the registered 62% at rank 5 (+0.6 versus the engine, CI −2.2 to 3.4), worse than both at rank 1, better only at rank 10 (+4.5, CI 2.2–6.8) and on criterion-met labels (82.1% versus 77.9/81.0%), while outcome-type labels fell from 51.9% to 42.7%: the filter admits only the verifiable, so constellation-ranked syndromes are displaced. Per protocol the systems are reported as not complementary; no other rule was tried.</w:t>
       </w:r>
     </w:p>
     <w:p>
@@ -680,12 +643,91 @@
         <w:rPr>
           <w:color w:val="303030"/>
         </w:rPr>
-        <w:t>3.9 The engine's criteria as a verifier behind the LLM, and a pre-specified negative result</w:t>
+        <w:t>3.9 Verifying the verification</w:t>
       </w:r>
     </w:p>
     <w:p>
       <w:r>
-        <w:t>Of 2,424 LLM entries, 1,636 mapped to a group with a criterion (1,439 supported, 182 contradicted, 15 analyte-absent); 788 were not verifiable (Table 7). Among mapped top-5 entries 140/1,486 (9.4%) were unsupported—below the registered 15–30%—10 of them without the defining analyte in the panel; the engine's own top-5 failed the same proxy criteria in 233/1,518 (15.3%; registered 5–15%), mostly where its hyperglycaemia and prerenal rules are more permissive than the criterion, but never without the analyte (0/1,518). Demoting unsupported LLM entries left recall@5 unchanged (59.6 → 59.4%; paired −0.2, 95% CI −0.5 to 0.0), raised recall@1 by 1.2 points (CI 0.2–2.3, p = 0.014) and halved the unsupported share to 5.7% (registered &lt; 5%); removing them cost 1.2 points at rank 5. Of 197 demoted entries 10 were clinician labels (5.1%; registered ≤ 10%)—five synonym-map artefacts (respiratory acidosis matched by "acidosis"), five borderline values (Supplementary Note 14). A parameter-free fusion of the engine's ranking with the supported LLM entries then gave recall@1/5/10 of 21.8/61.2/76.3%: below the registered 62% at rank 5 (+0.6 versus the engine, CI −2.2 to 3.4), worse than both at rank 1, better only at rank 10 (+4.5, CI 2.2–6.8) and on criterion-met labels (82.1% versus 77.9/81.0%), while outcome-type labels fell from 51.9% to 42.7%. The mechanism is structural: the filter admits only the verifiable, so every second vote goes to criterion-defined groups and the constellation-ranked syndromes are displaced. Per protocol the systems are reported as not complementary under this rule; no other rule was tried.</w:t>
+        <w:rPr>
+          <w:i/>
+        </w:rPr>
+        <w:t>Sufficiency.</w:t>
+      </w:r>
+      <w:r>
+        <w:t xml:space="preserve"> With only the 335 curated, quote-verified or convention rules executable, eICU flat recall@3/@5/@10 was 47.8/61.2/73.1% against 48.0/61.2/74.3% for the full 15.1.0 registry, two-tier recall@1/@3/@5 32.3/60.9/70.1% against 33.3/62.3/72.4%, mean per-label AUROC 0.761 against 0.766, with NHANES AUROCs identical and healthy-adult false assertions 0/51 in both arms. Paired differences were significant only at @10 (p = 0.005; grouped@10 p = 3.8 × 10⁻⁵), driven by diabetes and renal pattern templates: under the pre-stated thresholds the other 30,735 executable rules are not load-bearing at @3/@5 and partially load-bearing at @10 and in the two-tier metric. </w:t>
+      </w:r>
+      <w:r>
+        <w:rPr>
+          <w:i/>
+        </w:rPr>
+        <w:t>Mutation.</w:t>
+      </w:r>
+      <w:r>
+        <w:t xml:space="preserve"> Detector recall was 1.00 for inverted or impossible tiers (301/301), 0.98 for multi-analyte rules collapsed to a single ubiquitous analyte (138/141), 0.74 for unit substitution (113/152), 0.55 for thresholds pushed outside physiological limits (40/73), 0.46 for random source substitution (40/88), 0.13 for operator flips (36/274) and 0.003 for plausible threshold changes (1/303); specificity on unmutated seeds was 0.974, and four of the eight flagged seeds were real defects (an adult haemoglobin threshold under a neonatal population gate). These, with 126 unit-label and 14 source errors found during calibration, were corrected in registry 15.2.0 under a written protocol, with every eICU and NHANES gate count identical before and after. </w:t>
+      </w:r>
+      <w:r>
+        <w:rPr>
+          <w:i/>
+        </w:rPr>
+        <w:t>Transfer.</w:t>
+      </w:r>
+      <w:r>
+        <w:t xml:space="preserve"> Per 100 rules, any-detector density was 23.6 (95% CI 22.8–24.5) in registry 14.1.0 (dominated by template classes release 15 retired), 1.3 (1.0–1.6) in 15.1.0 (the calibration set) and 12.8 (9.8–16.4) in the second LLM-written corpus, where single-analyte screens (6.0) and adult thresholds without a population gate (3.3) predominated; 37 of 51 flags were true defects, 8 false positives and 6 undetermined (Supplementary Note 16).</w:t>
+      </w:r>
+    </w:p>
+    <w:p>
+      <w:r>
+        <w:rPr>
+          <w:i/>
+        </w:rPr>
+        <w:t>Ledger.</w:t>
+      </w:r>
+      <w:r>
+        <w:t xml:space="preserve"> A per-rule verification ledger (Supplementary Note 18; </w:t>
+      </w:r>
+      <w:r>
+        <w:rPr>
+          <w:rFonts w:ascii="Consolas" w:hAnsi="Consolas"/>
+        </w:rPr>
+        <w:t>eval/verification_ledger/build_ledger.py</w:t>
+      </w:r>
+      <w:r>
+        <w:t>) joins the four methods, without any new measurement, for the 605 rules that are curated, active-core or sufficiency-arm members, and assigns each one label under a fixed precedence. Of the 272 anchors, 18 are quote-verified, 8 carry a discordant verdict (7 uncorrected), 101 cite a reachable but unchecked source and 141 are unresolvable or sampled as such; of the 364 active-core rules, 145 were retired under the 15.0.0 protocol, 37 are quote-verified and 157 unresolvable; the executable invariants reach the analyte of 104 of the 219 active-core rules still executable. Eight rules with a recorded discordant verdict and five with an open detector flag are unchanged in 15.2.0 and are listed as the input to the next registry protocol.</w:t>
+      </w:r>
+    </w:p>
+    <w:p>
+      <w:pPr>
+        <w:pStyle w:val="Heading1"/>
+      </w:pPr>
+      <w:r>
+        <w:rPr>
+          <w:color w:val="000000"/>
+        </w:rPr>
+        <w:t>4. Discussion</w:t>
+      </w:r>
+    </w:p>
+    <w:p>
+      <w:r>
+        <w:t>Each of the four methods produced information that conventional validation had not: two engine defects that 353 adversarial vignettes missed; a rule base that cannot be audited from its own locators, with at least 7.5% of sampled rules discordant; an output carried by 1.1% of rules that fail in the same way as the bulk; recall@5 parity with a frontier LLM while a prevalence baseline reached 51%, so the engine's contribution is ordering (NDCG@5 56.5% vs 39.0%) and specificity, not coverage; and an audit of the audit showing that the audited core reproduces the primary results, that static detectors catch structural defects but not plausible wrong numbers, and that a second LLM-written rule set shows the same defect classes.</w:t>
+      </w:r>
+    </w:p>
+    <w:p>
+      <w:r>
+        <w:t xml:space="preserve">Executable invariants are a genuine advantage of a rule engine over an LLM: they can be stated, run on every release and violated only visibly. On identical panels the engine held unit and presentation invariance where the LLM's output changed in most panels, and the same test found two engine defects—which is the point: a violated invariant is a bug report with a reproducer, whereas an LLM's changed answer is not actionable. The criteria also work as a verifier </w:t>
+      </w:r>
+      <w:r>
+        <w:rPr>
+          <w:i/>
+        </w:rPr>
+        <w:t>behind</w:t>
+      </w:r>
+      <w:r>
+        <w:t xml:space="preserve"> the LLM, removing 40% of its unsupported top-5 assertions at no recall cost while flagging the engine's own output more often; fusing the two did not help at rank 5, because filtering admits only the verifiable while the engine's residual advantage lies in outcome syndromes no single criterion verifies. Invariants establish consistency, not correctness: a mistranscribed threshold passes every invariant, and the mutation study quantifies this (recall 0.003 for a plausible wrong number). The concordance audit shows why correctness is hard to reach: the limiting factor was not rater effort but locator granularity—organisation-level URLs and generic standards make 92% of rules uncheckable, and where checking was possible the error was usually attribution. Audit protocols should therefore require the verbatim source sentence for every verdict, and auditable registries should carry section- or table-level locators; an independent clinical audit is the next step. All four tools transfer unchanged to any rule base whose records carry analyte, operator, threshold, unit, population and locator, and the benchmark scripts run unchanged on the credentialed full eICU and MIMIC-IV releases.</w:t>
+      </w:r>
+    </w:p>
+    <w:p>
+      <w:r>
+        <w:t>The benchmark numbers measure the reference standard at least as much as the engine. A quarter of problem-list entries were not inferable from the first panel; the panel-supported subset is recovered at 78.0% (k = 5) and 91.8% (k = 10), supervised models did not exceed 0.82 AUROC for outcome-defined groups, and a prevalence baseline overtakes any method at k = 10, so no laboratory-only system can score much higher on this reference. Of the 85.8% of top-5 assertions not on the problem list, 54.8% satisfy the group's criterion in the same panel and only 12.6% are criterion-negative—coded precision (14.2%) is a lower bound, 69.0% an upper bound. Where the engine loses (sepsis, bleeding, withdrawal, CKD without a second creatinine) the label is an outcome learned from hidden correlates or needs longitudinal data; part of the loss was chosen, since withdrawing single-creatinine CKD assertions to comply with KDIGO cost three points of recall@5. Ablation and sufficiency agree that the result lives in the rule vote and a few hundred curated constellations and core rules; the bulk adds one to three points and 94% of it never fired, so the activity log converts an unauditable registry into a tractable verification queue. The contribution of such an engine is therefore not accuracy beyond what the reference permits but a property no LLM or trained model offers: every output carries a rule identifier, threshold and source, runs offline in about one second, and is verifiable before release. The design also answers criticisms of recent LLM benchmarks—unstable metrics, leakage and post-hoc selection [28,33]: releases were frozen with manifests, quarantine data were run once, the failed round is disclosed, and the LLM's test–retest variability (κ 0.69) exceeded the between-system difference. Unlike Isabel and DXplain studies [13–16,34], this study isolates laboratory-only reasoning on more than 20,000 encounters and releases its knowledge base under an open licence; the per-entry rule identifier and source are consistent with the transparency principle of the FDA's January 2026 clinical-decision-support guidance, without any regulatory claim.</w:t>
       </w:r>
     </w:p>
     <w:p>
@@ -696,12 +738,12 @@
         <w:rPr>
           <w:color w:val="303030"/>
         </w:rPr>
-        <w:t>3.10 Activity-guided provenance audit</w:t>
+        <w:t>4.1 Limitations</w:t>
       </w:r>
     </w:p>
     <w:p>
       <w:r>
-        <w:t>On 3,814 real panels 1,991 rules fired and 364 (1.1%) ever placed a diagnosis in a top-10 differential; 174 did so ten or more times; 31,192 (94.0%) never fired. The active core holds 46 of the 272 curated anchors and 105 generated pattern templates; its first-cited source is a resolved DOI for 10.4% of rules against 0.8% registry-wide. Automated search located the rule's threshold in a document reached from the registry locator for 8 of 364 active rules; 120 locators were organisation landing pages, 63 blocked or 404, 150 reached a page without the statement. In the fresh sample of 100 active rules, 6 were concordant (ADA 2026 diabetes and prediabetes criteria, ADA/EASD 2024 DKA severity and HHS criteria, BSG 2021 iron-deficiency anaemia), 2 discordant (an HbA1c "&gt; 5.7%" pattern against an inclusive 5.7–6.4% range; CK "≥ 1000" against "&gt; 1000 U/L" in a systematic review) and 92 unresolvable (95% CI 85.0–95.9; 88.6% among the 70 non-template rules), of which at least 18 cite a specific document that does not address the rule's analyte, 30 an organisation page and 5 a WHO URL returning 404. None of the four registered expectations was met (Supplementary Note 15).</w:t>
+        <w:t>No clinician audited the rules or adjudicated outputs; both concordance audits are single-rater, by a declared AI agent, without inter-rater reliability. Nearly three quarters of the executable rules are generated two-analyte templates citing a generic standards page; "dormant" means dormant on the analyte coverage of the two corpora used. The components that carry the result were written by a non-clinician first author; 34 sources lack a locator; Bayesian priors are hand-coded without a per-value citation table; no version-control history exists for the development period. Only the open demo subsets of eICU and MIMIC-IV were used, with problem lists and ICD codes as reference standards. The LLM comparison is an author-run self-baseline through a platform that does not disclose the model, without retrieval augmentation or clinician adjudication, and the model's training data may include the public eICU demo. Quarantine criteria were weakened after round 1; the panel-supported metric is post hoc; NHANES laboratory-defined labels overlap the inputs; raw scores are uncalibrated; external cohorts are small; the OCR front end, Iranian populations and non-English laboratory conventions were not evaluated. The verifier's criteria are proxies and its synonym map is coarse, so its verdicts bound rather than measure unsupported assertion. The static detectors were calibrated on the registry they then scored, the second LLM-written corpus was produced by the same agent that wrote them, and they are blind to plausible wrong thresholds by construction. The first author is a secondary-school student with a financial interest in the commercial product, and the system, including 99.2% of the rules, was developed with AI-agent assistance. Hemoglyph is a research prototype with no regulatory clearance.</w:t>
       </w:r>
     </w:p>
     <w:p>
@@ -712,56 +754,12 @@
         <w:rPr>
           <w:color w:val="000000"/>
         </w:rPr>
-        <w:t>4. Discussion</w:t>
+        <w:t>5. Conclusion</w:t>
       </w:r>
     </w:p>
     <w:p>
       <w:r>
-        <w:t>Three methods were applied to an AI-drafted clinical rule base, and each produced information that conventional validation had not. The invariant suite found a monotonicity defect that 353 adversarial vignettes missed, and its black-box variant found a unit-handling defect in a legacy alias path the in-process suite did not reach; the frozen concordance protocol showed that the rule base cannot be audited from its own locators and that at least 7.5% of sampled rules are discordant; the frozen benchmark showed an untrained, traceable engine at recall@5 parity with a frontier LLM while a prevalence baseline reached 51%—so the engine's measurable contribution is ordering (NDCG@5 56.5% vs 39.0%) and per-stay specificity, not coverage. Each method is cheap and reproducible from the repository.</w:t>
-      </w:r>
-    </w:p>
-    <w:p>
-      <w:r>
-        <w:t xml:space="preserve">The methodological lesson is about where verification stops. Executable invariants are a genuine advantage of a rule engine over an LLM: they can be stated, run on every release and violated only visibly; on identical panels the engine held unit and presentation invariance where the LLM's output changed in most panels (Section 3.8), and the same test found two engine defects—which is the point: a violated invariant is a bug report with a reproducer, whereas an LLM's changed answer is not actionable. The criteria also work as a verifier </w:t>
-      </w:r>
-      <w:r>
-        <w:rPr>
-          <w:i/>
-        </w:rPr>
-        <w:t>behind</w:t>
-      </w:r>
-      <w:r>
-        <w:t xml:space="preserve"> the LLM: demoting entries the panel does not support removed 40% of its unsupported top-5 assertions at no recall cost (Section 3.9)—and flagged the engine's own output more often, so executable verification is a check on both systems, not a privilege of one. Fusing the two through the verifier did not help at rank 5 (Section 3.9): filtering admits only the verifiable, and the engine's residual advantage lies precisely in the outcome syndromes no single criterion verifies—a pre-specified negative result that bounds what "neuro-symbolic" combination can add on this reference. But they establish logical consistency, not correctness—a mistranscribed threshold passes every invariant—and the concordance audit shows why correctness is hard to reach: the limiting factor was not rater effort but locator granularity. Organisation-level URLs and generic standards make 92% of rules uncheckable, and where checking was possible the error was usually attribution. Audit protocols for such rule bases should require the verbatim source sentence for every verdict, and auditable registries should carry section- or table-level locators; both are planned for release 15, with re-sourcing or retirement of the 46 sampled generic-standard citations and correction of the five anchor attribution errors. Concordance is necessary, not sufficient: an independent clinical audit is the next step and outside this paper. Both tools transfer without change to any rule base whose records carry analyte, operator, threshold, unit, population and locator—including rule sets generated by retrieval-augmented LLM pipelines—and the benchmark scripts run unchanged on the credentialed full eICU and MIMIC-IV releases.</w:t>
-      </w:r>
-    </w:p>
-    <w:p>
-      <w:r>
-        <w:t>The benchmark numbers measure the reference standard at least as much as the engine; three observations locate the ceiling. First, a quarter of admission-level problem-list entries were not inferable from the first panel at all; the panel-supported subset is recovered at 78.0% (k = 5) and 91.8% (k = 10). Second, supervised models trained on the labels did not exceed 0.82 AUROC for outcome-defined groups and a prevalence baseline overtakes any method at k = 10, so no laboratory-only system can score much higher on this reference. Third, of the 85.8% of top-5 assertions not on the problem list, 54.8% satisfy the group's laboratory criterion in the same panel and only 12.6% are criterion-negative—coded precision (14.2%) is a lower bound, 69.0% an upper bound. Where the engine genuinely loses (sepsis, bleeding, withdrawal, CKD without a second creatinine) the label is an outcome learned from hidden correlates or needs longitudinal data—an argument for hybrid designs; part of the loss was chosen, since withdrawing single-creatinine CKD assertions to comply with KDIGO cost three points of recall@5. The ablation locates the result in the rule vote and the curated syndrome constellations, written by a non-clinician from guideline criteria; the 33,000-rule bulk adds one to three points and 94% of it never fired on 3,814 real panels, so Hemoglyph is guideline-</w:t>
-      </w:r>
-      <w:r>
-        <w:rPr>
-          <w:i/>
-        </w:rPr>
-        <w:t>transcribed</w:t>
-      </w:r>
-      <w:r>
-        <w:t>, not guideline-derived, and its effective rule base is a few hundred rules whose provenance can now be repaired one by one—the activity log converts an unauditable registry into a tractable verification queue, although the first 100 rules on that queue show the same failure modes as the bulk. The contribution of such an engine is therefore not accuracy beyond what the reference permits but a property no LLM or trained model offers: every output carries a rule identifier, threshold and source, runs offline in about one second without a GPU, and is verifiable by executable invariants before release. Our design also addresses criticisms of recent LLM benchmarks—unstable metrics, leakage and post-hoc selection [28,33]: releases were frozen with manifests, quarantine data were run once, the failed round and the weakened criteria are disclosed, and the LLM's test–retest variability (κ 0.69) exceeded the between-system difference. Compared with Isabel and DXplain [13–16,34], this study isolates laboratory-only reasoning on more than 20,000 encounters and releases its knowledge base under an open licence; the per-entry rule identifier and source are consistent with the transparency principle of the FDA's January 2026 clinical-decision-support guidance, without any regulatory claim.</w:t>
-      </w:r>
-    </w:p>
-    <w:p>
-      <w:pPr>
-        <w:pStyle w:val="Heading2"/>
-      </w:pPr>
-      <w:r>
-        <w:rPr>
-          <w:color w:val="303030"/>
-        </w:rPr>
-        <w:t>4.1 Limitations</w:t>
-      </w:r>
-    </w:p>
-    <w:p>
-      <w:r>
-        <w:t>No clinician audited the rules or adjudicated outputs; both concordance audits are single-rater, by a declared AI agent, without inter-rater reliability. Nearly three quarters of the executable rules are generated two-analyte templates whose citation is a generic standards page; the activity log is specific to the analyte coverage of the two corpora used, so "dormant" means dormant on these panels. The components that carry the result were written by a non-clinician first author; 34 sources lack a locator; Bayesian priors are hand-coded without a per-value citation table; no version-control history exists for the development period. Only the open demo subsets of eICU and MIMIC-IV were used, with admission-level problem lists and ICD codes as reference standards. The LLM comparison is an author-run self-baseline through a platform that does not disclose the model, with two prompts, no retrieval augmentation and no clinician adjudication, and the model's training data may include the public eICU demo. Quarantine criteria were weakened after round 1; the panel-supported metric is post hoc; NHANES laboratory-defined labels overlap the inputs; raw scores are uncalibrated; external cohorts are small; the OCR front end, Iranian populations and non-English laboratory conventions were not evaluated. The verifier's criteria are proxies and its synonym map is coarse, so its verdicts bound rather than measure unsupported assertion. The first author is a secondary-school student with a financial interest in the commercial product, and the system, including 99.2% of the rules, was developed with AI-agent assistance. Hemoglyph is a research prototype with no regulatory clearance.</w:t>
+        <w:t>Executable invariants, a frozen source-concordance protocol with an activity log, a hash-frozen one-shot benchmark and an audit of the audit itself are four low-cost, reproducible methods for verifying an AI-drafted clinical rule base. A rule engine whose every output carries a rule identifier, threshold and source can be audited in ways a language model cannot—and can audit the language model's output in turn. Applied to Hemoglyph they found defects that vignettes had missed, showed that provenance granularity rather than rule count limits auditability, that 1.1% of the rules carry the output and that 335 curated or quote-verified rules reproduce the primary results alone, and that static checks cannot catch a plausible wrong number; and they placed an untrained, traceable engine at parity with a frontier LLM on a blinded laboratory-panel task close to the ceiling the reference standard allows. The limits—an unaudited rule base, outcome-defined syndromes, uncalibrated scores—are stated so that they can be measured and closed.</w:t>
       </w:r>
     </w:p>
     <w:p>
@@ -772,22 +770,6 @@
         <w:rPr>
           <w:color w:val="000000"/>
         </w:rPr>
-        <w:t>5. Conclusion</w:t>
-      </w:r>
-    </w:p>
-    <w:p>
-      <w:r>
-        <w:t>Executable invariants, a frozen source-concordance protocol and a hash-frozen one-shot benchmark are three low-cost, reproducible methods for verifying an AI-drafted clinical rule base. A rule engine whose every output carries a rule identifier, threshold and source can be audited in ways a language model cannot—and can audit the language model's output in turn. Applied to Hemoglyph the methods found defects that vignettes had missed, showed that provenance granularity rather than rule count limits auditability and that 1.1% of the rules carry the output, and placed an untrained, traceable engine at parity with a frontier LLM on a blinded laboratory-panel task close to the ceiling the reference standard allows. The limits—an unaudited rule base, outcome-defined syndromes, uncalibrated scores—are stated so that they can be measured and closed.</w:t>
-      </w:r>
-    </w:p>
-    <w:p>
-      <w:pPr>
-        <w:pStyle w:val="Heading1"/>
-      </w:pPr>
-      <w:r>
-        <w:rPr>
-          <w:color w:val="000000"/>
-        </w:rPr>
         <w:t>Acknowledgements and declarations</w:t>
       </w:r>
     </w:p>
@@ -934,7 +916,16 @@
         <w:t>eval/source_audit/</w:t>
       </w:r>
       <w:r>
-        <w:t>, and all evaluation scripts are available at github.com/sobahramisamani-droid under AGPL-3.0-or-later; rule registries under CC BY-SA 4.0. The frozen v7/14.1.0 snapshot with SHA-256 manifests will be archived on Zenodo with a DOI before publication.</w:t>
+        <w:t xml:space="preserve">, the LabPanel-Check conformance package </w:t>
+      </w:r>
+      <w:r>
+        <w:rPr>
+          <w:rFonts w:ascii="Consolas" w:hAnsi="Consolas"/>
+        </w:rPr>
+        <w:t>eval/labpanel_check/</w:t>
+      </w:r>
+      <w:r>
+        <w:t xml:space="preserve"> (290 panels, scorer, reference cards), and all evaluation scripts are available at github.com/sobahramisamani-droid under AGPL-3.0-or-later; rule registries under CC BY-SA 4.0. The frozen v7/14.1.0 snapshot with SHA-256 manifests will be archived on Zenodo with a DOI before publication.</w:t>
       </w:r>
     </w:p>
     <w:p>
@@ -5597,7 +5588,7 @@
           <w:b/>
           <w:sz w:val="20"/>
         </w:rPr>
-        <w:t>Table 3 | eICU-CRD demo (n = 2,314 stays), laboratory values only: recall of clinician-listed diagnoses by release.</w:t>
+        <w:t>Table 3 | eICU-CRD demo (n = 2,314 stays), laboratory values only: recall of clinician-listed diagnoses, frozen engine v7 (earlier releases in Supplementary Note 17).</w:t>
       </w:r>
     </w:p>
     <w:tbl>
@@ -5793,268 +5784,6 @@
           </w:tcPr>
           <w:p>
             <w:pPr>
-              <w:keepNext/>
-              <w:spacing w:line="240" w:lineRule="auto" w:after="0"/>
-            </w:pPr>
-            <w:r/>
-            <w:r>
-              <w:rPr>
-                <w:sz w:val="17"/>
-              </w:rPr>
-              <w:t>13.4.2 (product)</w:t>
-            </w:r>
-          </w:p>
-        </w:tc>
-        <w:tc>
-          <w:tcPr>
-            <w:tcW w:type="dxa" w:w="1344"/>
-          </w:tcPr>
-          <w:p>
-            <w:pPr>
-              <w:keepNext/>
-              <w:spacing w:line="240" w:lineRule="auto" w:after="0"/>
-            </w:pPr>
-            <w:r/>
-            <w:r>
-              <w:rPr>
-                <w:sz w:val="17"/>
-              </w:rPr>
-              <w:t>49.3</w:t>
-            </w:r>
-          </w:p>
-        </w:tc>
-        <w:tc>
-          <w:tcPr>
-            <w:tcW w:type="dxa" w:w="1344"/>
-          </w:tcPr>
-          <w:p>
-            <w:pPr>
-              <w:keepNext/>
-              <w:spacing w:line="240" w:lineRule="auto" w:after="0"/>
-            </w:pPr>
-            <w:r/>
-            <w:r>
-              <w:rPr>
-                <w:sz w:val="17"/>
-              </w:rPr>
-              <w:t>63.7</w:t>
-            </w:r>
-          </w:p>
-        </w:tc>
-        <w:tc>
-          <w:tcPr>
-            <w:tcW w:type="dxa" w:w="1344"/>
-          </w:tcPr>
-          <w:p>
-            <w:pPr>
-              <w:keepNext/>
-              <w:spacing w:line="240" w:lineRule="auto" w:after="0"/>
-            </w:pPr>
-            <w:r/>
-            <w:r>
-              <w:rPr>
-                <w:sz w:val="17"/>
-              </w:rPr>
-              <w:t>76.9</w:t>
-            </w:r>
-          </w:p>
-        </w:tc>
-        <w:tc>
-          <w:tcPr>
-            <w:tcW w:type="dxa" w:w="1344"/>
-          </w:tcPr>
-          <w:p>
-            <w:pPr>
-              <w:keepNext/>
-              <w:spacing w:line="240" w:lineRule="auto" w:after="0"/>
-            </w:pPr>
-            <w:r/>
-            <w:r>
-              <w:rPr>
-                <w:sz w:val="17"/>
-              </w:rPr>
-              <w:t>—</w:t>
-            </w:r>
-          </w:p>
-        </w:tc>
-        <w:tc>
-          <w:tcPr>
-            <w:tcW w:type="dxa" w:w="1344"/>
-          </w:tcPr>
-          <w:p>
-            <w:pPr>
-              <w:keepNext/>
-              <w:spacing w:line="240" w:lineRule="auto" w:after="0"/>
-            </w:pPr>
-            <w:r/>
-            <w:r>
-              <w:rPr>
-                <w:sz w:val="17"/>
-              </w:rPr>
-              <w:t>81.6 / 95.1</w:t>
-            </w:r>
-          </w:p>
-        </w:tc>
-        <w:tc>
-          <w:tcPr>
-            <w:tcW w:type="dxa" w:w="1344"/>
-          </w:tcPr>
-          <w:p>
-            <w:pPr>
-              <w:keepNext/>
-              <w:spacing w:line="240" w:lineRule="auto" w:after="0"/>
-            </w:pPr>
-            <w:r/>
-            <w:r>
-              <w:rPr>
-                <w:sz w:val="17"/>
-              </w:rPr>
-              <w:t>—</w:t>
-            </w:r>
-          </w:p>
-        </w:tc>
-      </w:tr>
-      <w:tr>
-        <w:trPr>
-          <w:cantSplit/>
-        </w:trPr>
-        <w:tc>
-          <w:tcPr>
-            <w:tcW w:type="dxa" w:w="1344"/>
-          </w:tcPr>
-          <w:p>
-            <w:pPr>
-              <w:keepNext/>
-              <w:spacing w:line="240" w:lineRule="auto" w:after="0"/>
-            </w:pPr>
-            <w:r/>
-            <w:r>
-              <w:rPr>
-                <w:sz w:val="17"/>
-              </w:rPr>
-              <w:t>14.1.0 + v6</w:t>
-            </w:r>
-          </w:p>
-        </w:tc>
-        <w:tc>
-          <w:tcPr>
-            <w:tcW w:type="dxa" w:w="1344"/>
-          </w:tcPr>
-          <w:p>
-            <w:pPr>
-              <w:keepNext/>
-              <w:spacing w:line="240" w:lineRule="auto" w:after="0"/>
-            </w:pPr>
-            <w:r/>
-            <w:r>
-              <w:rPr>
-                <w:sz w:val="17"/>
-              </w:rPr>
-              <w:t>48.5</w:t>
-            </w:r>
-          </w:p>
-        </w:tc>
-        <w:tc>
-          <w:tcPr>
-            <w:tcW w:type="dxa" w:w="1344"/>
-          </w:tcPr>
-          <w:p>
-            <w:pPr>
-              <w:keepNext/>
-              <w:spacing w:line="240" w:lineRule="auto" w:after="0"/>
-            </w:pPr>
-            <w:r/>
-            <w:r>
-              <w:rPr>
-                <w:sz w:val="17"/>
-              </w:rPr>
-              <w:t>60.8</w:t>
-            </w:r>
-          </w:p>
-        </w:tc>
-        <w:tc>
-          <w:tcPr>
-            <w:tcW w:type="dxa" w:w="1344"/>
-          </w:tcPr>
-          <w:p>
-            <w:pPr>
-              <w:keepNext/>
-              <w:spacing w:line="240" w:lineRule="auto" w:after="0"/>
-            </w:pPr>
-            <w:r/>
-            <w:r>
-              <w:rPr>
-                <w:sz w:val="17"/>
-              </w:rPr>
-              <w:t>74.1</w:t>
-            </w:r>
-          </w:p>
-        </w:tc>
-        <w:tc>
-          <w:tcPr>
-            <w:tcW w:type="dxa" w:w="1344"/>
-          </w:tcPr>
-          <w:p>
-            <w:pPr>
-              <w:keepNext/>
-              <w:spacing w:line="240" w:lineRule="auto" w:after="0"/>
-            </w:pPr>
-            <w:r/>
-            <w:r>
-              <w:rPr>
-                <w:sz w:val="17"/>
-              </w:rPr>
-              <w:t>71.7</w:t>
-            </w:r>
-          </w:p>
-        </w:tc>
-        <w:tc>
-          <w:tcPr>
-            <w:tcW w:type="dxa" w:w="1344"/>
-          </w:tcPr>
-          <w:p>
-            <w:pPr>
-              <w:keepNext/>
-              <w:spacing w:line="240" w:lineRule="auto" w:after="0"/>
-            </w:pPr>
-            <w:r/>
-            <w:r>
-              <w:rPr>
-                <w:sz w:val="17"/>
-              </w:rPr>
-              <w:t>78.0 / 91.8</w:t>
-            </w:r>
-          </w:p>
-        </w:tc>
-        <w:tc>
-          <w:tcPr>
-            <w:tcW w:type="dxa" w:w="1344"/>
-          </w:tcPr>
-          <w:p>
-            <w:pPr>
-              <w:keepNext/>
-              <w:spacing w:line="240" w:lineRule="auto" w:after="0"/>
-            </w:pPr>
-            <w:r/>
-            <w:r>
-              <w:rPr>
-                <w:sz w:val="17"/>
-              </w:rPr>
-              <w:t>88.9 / 97.2</w:t>
-            </w:r>
-          </w:p>
-        </w:tc>
-      </w:tr>
-      <w:tr>
-        <w:trPr>
-          <w:cantSplit/>
-        </w:trPr>
-        <w:tc>
-          <w:tcPr>
-            <w:tcW w:type="dxa" w:w="1344"/>
-          </w:tcPr>
-          <w:p>
-            <w:pPr>
               <w:spacing w:line="240" w:lineRule="auto" w:after="0"/>
             </w:pPr>
             <w:r/>
@@ -8829,7 +8558,7 @@
                 <w:b/>
                 <w:sz w:val="17"/>
               </w:rPr>
-              <w:t>Verified consensus (Section 3.9)</w:t>
+              <w:t>Verified consensus (Section 3.8)</w:t>
             </w:r>
           </w:p>
         </w:tc>
@@ -9521,7 +9250,7 @@
     </w:p>
     <w:p>
       <w:r>
-        <w:t>Notes: Note 1 SAP and amendments; Table S1 engine change log C1–C16 with sources; Table S2 quarantine criteria and outcomes (rounds 1 and 2); Note 2 LLM comparison protocol; Table S3 participant flow and baseline characteristics; Note 3 fusion/Theory-of-Evidence algorithm and consistency identities; Table S4 subgroup recall; Table S5 next-test utility (engine v5.3, superseded metric); Tables S6–S6c calibration, recalibration, decision curves, multiplicity and panel-size sensitivity; Table S7 survey-weighted NHANES AUROC; Table S8 per-group calibration; Table S9 label-mapping audit (400 stays); Table S10 registry count reconciliation; Table S11 precision/F1/NDCG, alert burden, per-group PPV and prevalence baseline; Table S12 fusion-weight sensitivity; Table S12b historical comparisons (superseded); Table S13 participant flow for the UCI cohorts; Table S15 open vs proprietary components; Table S16 sepsis companion model; Note 4 regression gate; Note 5 definitions, audits and completed TRIPOD+AI checklist; Note 6 version manifest; Note 7 evidence triage of twelve proposals; Note 8 source-concordance audit; Notes 9–12 material moved from the main text; Note 13 black-box property-conformance benchmark (engine and LLM on identical perturbed panels); Note 14 executable verifier behind the LLM and verified-consensus arm; Note 15 activity-guided provenance audit; Fig. S1 provenance audit; Fig. S2 per-release eICU metrics; Fig. S3 per-group panel-supported recall; Fig. S4 per-group calibration; Fig. S5 context-echo analysis; Fig. S6 historical LLM comparison vs engine v5.1; Fig. S7 participant flow; Data 1 per-stay outputs and LLM prompts/outputs.</w:t>
+        <w:t>Notes: Note 1 SAP and amendments; Table S1 engine change log C1–C16 with sources; Table S2 quarantine criteria and outcomes (rounds 1 and 2); Note 2 LLM comparison protocol; Table S3 participant flow and baseline characteristics; Note 3 fusion/Theory-of-Evidence algorithm and consistency identities; Table S4 subgroup recall; Table S5 next-test utility (engine v5.3, superseded metric); Tables S6–S6c calibration, recalibration, decision curves, multiplicity and panel-size sensitivity; Table S7 survey-weighted NHANES AUROC; Table S8 per-group calibration; Table S9 label-mapping audit (400 stays); Table S10 registry count reconciliation; Table S11 precision/F1/NDCG, alert burden, per-group PPV and prevalence baseline; Table S12 fusion-weight sensitivity; Table S12b historical comparisons (superseded); Table S13 participant flow for the UCI cohorts; Table S15 open vs proprietary components; Table S16 sepsis companion model; Note 4 regression gate; Note 5 definitions, audits and completed TRIPOD+AI checklist; Note 6 version manifest; Note 7 evidence triage of twelve proposals; Note 8 source-concordance audit; Notes 9–12 material moved from the main text; Note 13 black-box property-conformance benchmark (engine and LLM on identical perturbed panels); Note 14 executable verifier behind the LLM and verified-consensus arm; Note 15 activity-guided provenance audit; Note 16 audit study (core sufficiency, mutation testing, second LLM-written corpus); Note 18 per-rule verification ledger; Note 17 component ablation, community survey and external cohorts (R6 §3.5–3.6 verbatim) and earlier-release eICU rows; Fig. S1 provenance audit; Fig. S2 per-release eICU metrics; Fig. S3 per-group panel-supported recall; Fig. S4 per-group calibration; Fig. S5 context-echo analysis; Fig. S6 historical LLM comparison vs engine v5.1; Fig. S7 participant flow; Data 1 per-stay outputs and LLM prompts/outputs.</w:t>
       </w:r>
     </w:p>
     <w:p>
@@ -10259,6 +9988,631 @@
         <w:t>The knowledge base has not been audited rule-by-rule by clinicians, and the non-clinical source-concordance audit reported here shows that 92% of sampled rules cannot even be checked against their cited source from the locator provided, while at least 7.5% are demonstrably discordant; the components that carry the result—272 anchor rules and ~900 syndrome constellations—were written by a non-clinician first author; 34 sources lack a locator; the Bayesian priors are hand-coded without a per-value citation table. No version-control history exists for the development period, so the claim that no change was outcome-fitted rests on the dated change log. Only the open demo subsets of eICU and MIMIC-IV were used; the reference standards are admission-level problem lists and ICD codes, not adjudicated panel-level diagnoses. The LLM comparison is an author-run self-baseline through an agent platform that does not disclose the model, so it is not reproducible against a named model; it used two prompts, no retrieval augmentation and no clinician adjudication, and the model's training data may include the public eICU demo. The quarantine criteria were weakened after round 1 failed; the panel-supported metric is post hoc; the OCR front end was not evaluated; laboratory-defined NHANES labels overlap the inputs; raw scores are uncalibrated; the external cohorts are small and ILPD discrimination was modest. No clinician-in-the-loop evaluation was performed. Iranian populations and non-English laboratory conventions were not evaluated. The first author is a secondary-school student with a financial interest in the commercial product, and the system, including 99.2% of the rules, was developed with AI-agent assistance. Hemoglyph is a research prototype with no regulatory clearance.</w:t>
       </w:r>
     </w:p>
+    <w:p>
+      <w:pPr>
+        <w:pStyle w:val="Heading2"/>
+      </w:pPr>
+      <w:r>
+        <w:rPr>
+          <w:color w:val="303030"/>
+        </w:rPr>
+        <w:t>Supplementary Note 17 — Component ablation and community/external results; moved verbatim from the R6 main text (R7 condensation)</w:t>
+      </w:r>
+    </w:p>
+    <w:p>
+      <w:pPr>
+        <w:pStyle w:val="Heading3"/>
+      </w:pPr>
+      <w:r>
+        <w:rPr>
+          <w:color w:val="303030"/>
+        </w:rPr>
+        <w:t>R6 §3.5 Component ablation</w:t>
+      </w:r>
+    </w:p>
+    <w:p>
+      <w:r>
+        <w:t>Two components carry the signal (Table 1; Supplementary Table S12): removing the rule-engine vote cost 12.1 points of flat recall@5 (−14.4 to −9.8) and removing the syndrome layer 9.5 points (−11.1 to −7.9). The Bayesian network contributed 1.3 points; the other layers and any fusion-weight profile changed recall by ≤ 1.4 points. Restricting the registry to the 272 curated anchors (32,911 AI-drafted rules off) lowered recall@5 by 0.9 points (−2.1 to +0.2) with the syndrome layer on and 3.1 points with it off. The headline therefore rests on the hand-curated components, and registry scale is not claimed as a merit.</w:t>
+      </w:r>
+    </w:p>
+    <w:p>
+      <w:pPr>
+        <w:pStyle w:val="Heading3"/>
+      </w:pPr>
+      <w:r>
+        <w:rPr>
+          <w:color w:val="303030"/>
+        </w:rPr>
+        <w:t>R6 §3.6 Community survey, external cohorts and the pre-specified negative result</w:t>
+      </w:r>
+    </w:p>
+    <w:p>
+      <w:r>
+        <w:t>In 3,000 NHANES adults per cycle, unweighted AUROCs reproduced across the development cycle (2017–18) and the two quarantine cycles (2013–14, 2015–16): diabetes 0.946/0.938/0.924, CKD 0.959/0.968/0.962, anaemia 0.972/0.994/0.983, hyperuricaemia 0.943/0.958/0.955, hypercholesterolaemia 0.905/0.883/0.886, ALT elevation 0.872/0.880/0.877 (Fig. 4; Table 4). These laboratory-defined labels overlap the inputs; against self-reported physician diagnosis AUROC was 0.90–0.92 for diabetes and 0.75–0.82 for kidney disease. Among guideline-healthy adults the engine asserted a disease in 2/485 (0.4%). External cohorts (UCI thyroid 0.979/0.798, HCV 0.925, ILPD 0.704, MIMIC-IV demo top-5 47.5%, PMC case reports 26% specific/68% syndrome) are in Table 4 and Supplementary Note 10. In PhysioNet/CinC 2019 the engine's sepsis score discriminated Sepsis-3 onset with AUROC 0.600, 0.610 and 0.588 in sets A, B and B2 versus 0.691, 0.712 and 0.679 for a supervised logistic model on the same features (Fig. 5); Hemoglyph is not a sepsis predictor and was not tuned to the task afterwards. Raw scores were uncalibrated (pooled AUROC 0.797; Fig. 7); subgroup and robustness results are in Supplementary Note 11.</w:t>
+      </w:r>
+    </w:p>
+    <w:p>
+      <w:pPr>
+        <w:pStyle w:val="Heading3"/>
+      </w:pPr>
+      <w:r>
+        <w:rPr>
+          <w:color w:val="303030"/>
+        </w:rPr>
+        <w:t>Earlier releases on the same eICU cohort (rows removed from main-text Table 3)</w:t>
+      </w:r>
+    </w:p>
+    <w:tbl>
+      <w:tblPr>
+        <w:tblStyle w:val="TableGrid"/>
+        <w:tblW w:type="auto" w:w="0"/>
+        <w:jc w:val="center"/>
+        <w:tblLook w:firstColumn="1" w:firstRow="1" w:lastColumn="0" w:lastRow="0" w:noHBand="0" w:noVBand="1" w:val="04A0"/>
+      </w:tblPr>
+      <w:tblGrid>
+        <w:gridCol w:w="1344"/>
+        <w:gridCol w:w="1344"/>
+        <w:gridCol w:w="1344"/>
+        <w:gridCol w:w="1344"/>
+        <w:gridCol w:w="1344"/>
+        <w:gridCol w:w="1344"/>
+        <w:gridCol w:w="1344"/>
+      </w:tblGrid>
+      <w:tr>
+        <w:trPr>
+          <w:cantSplit/>
+          <w:tblHeader/>
+        </w:trPr>
+        <w:tc>
+          <w:tcPr>
+            <w:tcW w:type="dxa" w:w="1344"/>
+          </w:tcPr>
+          <w:p>
+            <w:pPr>
+              <w:keepNext/>
+              <w:spacing w:line="240" w:lineRule="auto" w:after="0"/>
+            </w:pPr>
+            <w:r>
+              <w:rPr>
+                <w:b/>
+              </w:rPr>
+            </w:r>
+            <w:r>
+              <w:rPr>
+                <w:b/>
+                <w:sz w:val="17"/>
+              </w:rPr>
+              <w:t>Release</w:t>
+            </w:r>
+          </w:p>
+        </w:tc>
+        <w:tc>
+          <w:tcPr>
+            <w:tcW w:type="dxa" w:w="1344"/>
+          </w:tcPr>
+          <w:p>
+            <w:pPr>
+              <w:keepNext/>
+              <w:spacing w:line="240" w:lineRule="auto" w:after="0"/>
+            </w:pPr>
+            <w:r>
+              <w:rPr>
+                <w:b/>
+              </w:rPr>
+            </w:r>
+            <w:r>
+              <w:rPr>
+                <w:b/>
+                <w:sz w:val="17"/>
+              </w:rPr>
+              <w:t>flat @3</w:t>
+            </w:r>
+          </w:p>
+        </w:tc>
+        <w:tc>
+          <w:tcPr>
+            <w:tcW w:type="dxa" w:w="1344"/>
+          </w:tcPr>
+          <w:p>
+            <w:pPr>
+              <w:keepNext/>
+              <w:spacing w:line="240" w:lineRule="auto" w:after="0"/>
+            </w:pPr>
+            <w:r>
+              <w:rPr>
+                <w:b/>
+              </w:rPr>
+            </w:r>
+            <w:r>
+              <w:rPr>
+                <w:b/>
+                <w:sz w:val="17"/>
+              </w:rPr>
+              <w:t>flat @5</w:t>
+            </w:r>
+          </w:p>
+        </w:tc>
+        <w:tc>
+          <w:tcPr>
+            <w:tcW w:type="dxa" w:w="1344"/>
+          </w:tcPr>
+          <w:p>
+            <w:pPr>
+              <w:keepNext/>
+              <w:spacing w:line="240" w:lineRule="auto" w:after="0"/>
+            </w:pPr>
+            <w:r>
+              <w:rPr>
+                <w:b/>
+              </w:rPr>
+            </w:r>
+            <w:r>
+              <w:rPr>
+                <w:b/>
+                <w:sz w:val="17"/>
+              </w:rPr>
+              <w:t>flat @10</w:t>
+            </w:r>
+          </w:p>
+        </w:tc>
+        <w:tc>
+          <w:tcPr>
+            <w:tcW w:type="dxa" w:w="1344"/>
+          </w:tcPr>
+          <w:p>
+            <w:pPr>
+              <w:keepNext/>
+              <w:spacing w:line="240" w:lineRule="auto" w:after="0"/>
+            </w:pPr>
+            <w:r>
+              <w:rPr>
+                <w:b/>
+              </w:rPr>
+            </w:r>
+            <w:r>
+              <w:rPr>
+                <w:b/>
+                <w:sz w:val="17"/>
+              </w:rPr>
+              <w:t>two-tier @5</w:t>
+            </w:r>
+          </w:p>
+        </w:tc>
+        <w:tc>
+          <w:tcPr>
+            <w:tcW w:type="dxa" w:w="1344"/>
+          </w:tcPr>
+          <w:p>
+            <w:pPr>
+              <w:keepNext/>
+              <w:spacing w:line="240" w:lineRule="auto" w:after="0"/>
+            </w:pPr>
+            <w:r>
+              <w:rPr>
+                <w:b/>
+              </w:rPr>
+            </w:r>
+            <w:r>
+              <w:rPr>
+                <w:b/>
+                <w:sz w:val="17"/>
+              </w:rPr>
+              <w:t>panel-supported @5 / @10 (n = 1,460)</w:t>
+            </w:r>
+          </w:p>
+        </w:tc>
+        <w:tc>
+          <w:tcPr>
+            <w:tcW w:type="dxa" w:w="1344"/>
+          </w:tcPr>
+          <w:p>
+            <w:pPr>
+              <w:keepNext/>
+              <w:spacing w:line="240" w:lineRule="auto" w:after="0"/>
+            </w:pPr>
+            <w:r>
+              <w:rPr>
+                <w:b/>
+              </w:rPr>
+            </w:r>
+            <w:r>
+              <w:rPr>
+                <w:b/>
+                <w:sz w:val="17"/>
+              </w:rPr>
+              <w:t>two-tier panel-supported @5 / @10</w:t>
+            </w:r>
+          </w:p>
+        </w:tc>
+      </w:tr>
+      <w:tr>
+        <w:trPr>
+          <w:cantSplit/>
+        </w:trPr>
+        <w:tc>
+          <w:tcPr>
+            <w:tcW w:type="dxa" w:w="1344"/>
+          </w:tcPr>
+          <w:p>
+            <w:pPr>
+              <w:keepNext/>
+              <w:spacing w:line="240" w:lineRule="auto" w:after="0"/>
+            </w:pPr>
+            <w:r/>
+            <w:r>
+              <w:rPr>
+                <w:sz w:val="17"/>
+              </w:rPr>
+              <w:t>13.4.2 (product)</w:t>
+            </w:r>
+          </w:p>
+        </w:tc>
+        <w:tc>
+          <w:tcPr>
+            <w:tcW w:type="dxa" w:w="1344"/>
+          </w:tcPr>
+          <w:p>
+            <w:pPr>
+              <w:keepNext/>
+              <w:spacing w:line="240" w:lineRule="auto" w:after="0"/>
+            </w:pPr>
+            <w:r/>
+            <w:r>
+              <w:rPr>
+                <w:sz w:val="17"/>
+              </w:rPr>
+              <w:t>49.3</w:t>
+            </w:r>
+          </w:p>
+        </w:tc>
+        <w:tc>
+          <w:tcPr>
+            <w:tcW w:type="dxa" w:w="1344"/>
+          </w:tcPr>
+          <w:p>
+            <w:pPr>
+              <w:keepNext/>
+              <w:spacing w:line="240" w:lineRule="auto" w:after="0"/>
+            </w:pPr>
+            <w:r/>
+            <w:r>
+              <w:rPr>
+                <w:sz w:val="17"/>
+              </w:rPr>
+              <w:t>63.7</w:t>
+            </w:r>
+          </w:p>
+        </w:tc>
+        <w:tc>
+          <w:tcPr>
+            <w:tcW w:type="dxa" w:w="1344"/>
+          </w:tcPr>
+          <w:p>
+            <w:pPr>
+              <w:keepNext/>
+              <w:spacing w:line="240" w:lineRule="auto" w:after="0"/>
+            </w:pPr>
+            <w:r/>
+            <w:r>
+              <w:rPr>
+                <w:sz w:val="17"/>
+              </w:rPr>
+              <w:t>76.9</w:t>
+            </w:r>
+          </w:p>
+        </w:tc>
+        <w:tc>
+          <w:tcPr>
+            <w:tcW w:type="dxa" w:w="1344"/>
+          </w:tcPr>
+          <w:p>
+            <w:pPr>
+              <w:keepNext/>
+              <w:spacing w:line="240" w:lineRule="auto" w:after="0"/>
+            </w:pPr>
+            <w:r/>
+            <w:r>
+              <w:rPr>
+                <w:sz w:val="17"/>
+              </w:rPr>
+              <w:t>—</w:t>
+            </w:r>
+          </w:p>
+        </w:tc>
+        <w:tc>
+          <w:tcPr>
+            <w:tcW w:type="dxa" w:w="1344"/>
+          </w:tcPr>
+          <w:p>
+            <w:pPr>
+              <w:keepNext/>
+              <w:spacing w:line="240" w:lineRule="auto" w:after="0"/>
+            </w:pPr>
+            <w:r/>
+            <w:r>
+              <w:rPr>
+                <w:sz w:val="17"/>
+              </w:rPr>
+              <w:t>81.6 / 95.1</w:t>
+            </w:r>
+          </w:p>
+        </w:tc>
+        <w:tc>
+          <w:tcPr>
+            <w:tcW w:type="dxa" w:w="1344"/>
+          </w:tcPr>
+          <w:p>
+            <w:pPr>
+              <w:keepNext/>
+              <w:spacing w:line="240" w:lineRule="auto" w:after="0"/>
+            </w:pPr>
+            <w:r/>
+            <w:r>
+              <w:rPr>
+                <w:sz w:val="17"/>
+              </w:rPr>
+              <w:t>—</w:t>
+            </w:r>
+          </w:p>
+        </w:tc>
+      </w:tr>
+      <w:tr>
+        <w:trPr>
+          <w:cantSplit/>
+        </w:trPr>
+        <w:tc>
+          <w:tcPr>
+            <w:tcW w:type="dxa" w:w="1344"/>
+          </w:tcPr>
+          <w:p>
+            <w:pPr>
+              <w:keepNext/>
+              <w:spacing w:line="240" w:lineRule="auto" w:after="0"/>
+            </w:pPr>
+            <w:r/>
+            <w:r>
+              <w:rPr>
+                <w:sz w:val="17"/>
+              </w:rPr>
+              <w:t>14.1.0 + v6</w:t>
+            </w:r>
+          </w:p>
+        </w:tc>
+        <w:tc>
+          <w:tcPr>
+            <w:tcW w:type="dxa" w:w="1344"/>
+          </w:tcPr>
+          <w:p>
+            <w:pPr>
+              <w:keepNext/>
+              <w:spacing w:line="240" w:lineRule="auto" w:after="0"/>
+            </w:pPr>
+            <w:r/>
+            <w:r>
+              <w:rPr>
+                <w:sz w:val="17"/>
+              </w:rPr>
+              <w:t>48.5</w:t>
+            </w:r>
+          </w:p>
+        </w:tc>
+        <w:tc>
+          <w:tcPr>
+            <w:tcW w:type="dxa" w:w="1344"/>
+          </w:tcPr>
+          <w:p>
+            <w:pPr>
+              <w:keepNext/>
+              <w:spacing w:line="240" w:lineRule="auto" w:after="0"/>
+            </w:pPr>
+            <w:r/>
+            <w:r>
+              <w:rPr>
+                <w:sz w:val="17"/>
+              </w:rPr>
+              <w:t>60.8</w:t>
+            </w:r>
+          </w:p>
+        </w:tc>
+        <w:tc>
+          <w:tcPr>
+            <w:tcW w:type="dxa" w:w="1344"/>
+          </w:tcPr>
+          <w:p>
+            <w:pPr>
+              <w:keepNext/>
+              <w:spacing w:line="240" w:lineRule="auto" w:after="0"/>
+            </w:pPr>
+            <w:r/>
+            <w:r>
+              <w:rPr>
+                <w:sz w:val="17"/>
+              </w:rPr>
+              <w:t>74.1</w:t>
+            </w:r>
+          </w:p>
+        </w:tc>
+        <w:tc>
+          <w:tcPr>
+            <w:tcW w:type="dxa" w:w="1344"/>
+          </w:tcPr>
+          <w:p>
+            <w:pPr>
+              <w:keepNext/>
+              <w:spacing w:line="240" w:lineRule="auto" w:after="0"/>
+            </w:pPr>
+            <w:r/>
+            <w:r>
+              <w:rPr>
+                <w:sz w:val="17"/>
+              </w:rPr>
+              <w:t>71.7</w:t>
+            </w:r>
+          </w:p>
+        </w:tc>
+        <w:tc>
+          <w:tcPr>
+            <w:tcW w:type="dxa" w:w="1344"/>
+          </w:tcPr>
+          <w:p>
+            <w:pPr>
+              <w:keepNext/>
+              <w:spacing w:line="240" w:lineRule="auto" w:after="0"/>
+            </w:pPr>
+            <w:r/>
+            <w:r>
+              <w:rPr>
+                <w:sz w:val="17"/>
+              </w:rPr>
+              <w:t>78.0 / 91.8</w:t>
+            </w:r>
+          </w:p>
+        </w:tc>
+        <w:tc>
+          <w:tcPr>
+            <w:tcW w:type="dxa" w:w="1344"/>
+          </w:tcPr>
+          <w:p>
+            <w:pPr>
+              <w:keepNext/>
+              <w:spacing w:line="240" w:lineRule="auto" w:after="0"/>
+            </w:pPr>
+            <w:r/>
+            <w:r>
+              <w:rPr>
+                <w:sz w:val="17"/>
+              </w:rPr>
+              <w:t>88.9 / 97.2</w:t>
+            </w:r>
+          </w:p>
+        </w:tc>
+      </w:tr>
+      <w:tr>
+        <w:trPr>
+          <w:cantSplit/>
+        </w:trPr>
+        <w:tc>
+          <w:tcPr>
+            <w:tcW w:type="dxa" w:w="1344"/>
+          </w:tcPr>
+          <w:p>
+            <w:pPr>
+              <w:spacing w:line="240" w:lineRule="auto" w:after="0"/>
+            </w:pPr>
+            <w:r/>
+            <w:r>
+              <w:rPr>
+                <w:sz w:val="17"/>
+              </w:rPr>
+              <w:t>14.1.0 + v7 (frozen)</w:t>
+            </w:r>
+          </w:p>
+        </w:tc>
+        <w:tc>
+          <w:tcPr>
+            <w:tcW w:type="dxa" w:w="1344"/>
+          </w:tcPr>
+          <w:p>
+            <w:pPr>
+              <w:spacing w:line="240" w:lineRule="auto" w:after="0"/>
+            </w:pPr>
+            <w:r/>
+            <w:r>
+              <w:rPr>
+                <w:sz w:val="17"/>
+              </w:rPr>
+              <w:t>47.9</w:t>
+            </w:r>
+          </w:p>
+        </w:tc>
+        <w:tc>
+          <w:tcPr>
+            <w:tcW w:type="dxa" w:w="1344"/>
+          </w:tcPr>
+          <w:p>
+            <w:pPr>
+              <w:spacing w:line="240" w:lineRule="auto" w:after="0"/>
+            </w:pPr>
+            <w:r/>
+            <w:r>
+              <w:rPr>
+                <w:sz w:val="17"/>
+              </w:rPr>
+              <w:t>60.8</w:t>
+            </w:r>
+          </w:p>
+        </w:tc>
+        <w:tc>
+          <w:tcPr>
+            <w:tcW w:type="dxa" w:w="1344"/>
+          </w:tcPr>
+          <w:p>
+            <w:pPr>
+              <w:spacing w:line="240" w:lineRule="auto" w:after="0"/>
+            </w:pPr>
+            <w:r/>
+            <w:r>
+              <w:rPr>
+                <w:sz w:val="17"/>
+              </w:rPr>
+              <w:t>74.1</w:t>
+            </w:r>
+          </w:p>
+        </w:tc>
+        <w:tc>
+          <w:tcPr>
+            <w:tcW w:type="dxa" w:w="1344"/>
+          </w:tcPr>
+          <w:p>
+            <w:pPr>
+              <w:spacing w:line="240" w:lineRule="auto" w:after="0"/>
+            </w:pPr>
+            <w:r/>
+            <w:r>
+              <w:rPr>
+                <w:sz w:val="17"/>
+              </w:rPr>
+              <w:t>71.9</w:t>
+            </w:r>
+          </w:p>
+        </w:tc>
+        <w:tc>
+          <w:tcPr>
+            <w:tcW w:type="dxa" w:w="1344"/>
+          </w:tcPr>
+          <w:p>
+            <w:pPr>
+              <w:spacing w:line="240" w:lineRule="auto" w:after="0"/>
+            </w:pPr>
+            <w:r/>
+            <w:r>
+              <w:rPr>
+                <w:sz w:val="17"/>
+              </w:rPr>
+              <w:t>78.0 / 91.8</w:t>
+            </w:r>
+          </w:p>
+        </w:tc>
+        <w:tc>
+          <w:tcPr>
+            <w:tcW w:type="dxa" w:w="1344"/>
+          </w:tcPr>
+          <w:p>
+            <w:pPr>
+              <w:spacing w:line="240" w:lineRule="auto" w:after="0"/>
+            </w:pPr>
+            <w:r/>
+            <w:r>
+              <w:rPr>
+                <w:sz w:val="17"/>
+              </w:rPr>
+              <w:t>89.2 / 97.2</w:t>
+            </w:r>
+          </w:p>
+        </w:tc>
+      </w:tr>
+    </w:tbl>
+    <w:p/>
     <w:p>
       <w:r>
         <w:br w:type="page"/>

</xml_diff>

<commit_message>
Registry 15.3.0: ledger closure (D1 2 re-sourced w/ quotes, 2 convention, 2 retired; D2 HbA1c upper bound; D3 5 flags recorded; ledger label on 605 rules); gate identical on primary metrics; ledger dating fix; Note 18 closure; 720 tests pass
</commit_message>
<xml_diff>
--- a/docs/paper1/v7/Paper1_Hemoglyph_CMPB_EN_v7_R6.docx
+++ b/docs/paper1/v7/Paper1_Hemoglyph_CMPB_EN_v7_R6.docx
@@ -692,7 +692,7 @@
         <w:t>eval/verification_ledger/build_ledger.py</w:t>
       </w:r>
       <w:r>
-        <w:t>) joins the four methods, without any new measurement, for the 605 rules that are curated, active-core or sufficiency-arm members, and assigns each one label under a fixed precedence. Of the 272 anchors, 18 are quote-verified, 8 carry a discordant verdict (7 uncorrected), 101 cite a reachable but unchecked source and 141 are unresolvable or sampled as such; of the 364 active-core rules, 145 were retired under the 15.0.0 protocol, 37 are quote-verified and 157 unresolvable; the executable invariants reach the analyte of 104 of the 219 active-core rules still executable. Eight rules with a recorded discordant verdict and five with an open detector flag are unchanged in 15.2.0 and are listed as the input to the next registry protocol.</w:t>
+        <w:t>) joins the four methods, without any new measurement, for the 605 rules that are curated, active-core or sufficiency-arm members, and assigns each one label under a fixed precedence. Of the 272 anchors, 18 are quote-verified, 8 carry a discordant verdict (6 uncorrected), 101 cite a reachable but unchecked source and 141 are unresolvable or sampled as such; of the 364 active-core rules, 145 were retired under the 15.0.0 protocol, 37 are quote-verified and 157 unresolvable; the executable invariants reach the analyte of 104 of the 219 active-core rules still executable. Seven rules with a recorded discordant verdict and five with an open detector flag were unchanged in 15.2.0; under a written protocol (registry 15.3.0) two were re-sourced with retrieved quotes, two reclassified as reference-interval conventions, two retired, one boundary written, and the five flags inspected and left in place as recorded exceptions; the ledger also exposed one unimplemented line of the 15.0.0 protocol (a missing HbA1c upper bound). The non-regression gate was unchanged on every primary metric (eICU flat and two-tier recall identical; NHANES AUROCs identical; grouped recall@1 −0.3 points).</w:t>
       </w:r>
     </w:p>
     <w:p>
@@ -9250,7 +9250,7 @@
     </w:p>
     <w:p>
       <w:r>
-        <w:t>Notes: Note 1 SAP and amendments; Table S1 engine change log C1–C16 with sources; Table S2 quarantine criteria and outcomes (rounds 1 and 2); Note 2 LLM comparison protocol; Table S3 participant flow and baseline characteristics; Note 3 fusion/Theory-of-Evidence algorithm and consistency identities; Table S4 subgroup recall; Table S5 next-test utility (engine v5.3, superseded metric); Tables S6–S6c calibration, recalibration, decision curves, multiplicity and panel-size sensitivity; Table S7 survey-weighted NHANES AUROC; Table S8 per-group calibration; Table S9 label-mapping audit (400 stays); Table S10 registry count reconciliation; Table S11 precision/F1/NDCG, alert burden, per-group PPV and prevalence baseline; Table S12 fusion-weight sensitivity; Table S12b historical comparisons (superseded); Table S13 participant flow for the UCI cohorts; Table S15 open vs proprietary components; Table S16 sepsis companion model; Note 4 regression gate; Note 5 definitions, audits and completed TRIPOD+AI checklist; Note 6 version manifest; Note 7 evidence triage of twelve proposals; Note 8 source-concordance audit; Notes 9–12 material moved from the main text; Note 13 black-box property-conformance benchmark (engine and LLM on identical perturbed panels); Note 14 executable verifier behind the LLM and verified-consensus arm; Note 15 activity-guided provenance audit; Note 16 audit study (core sufficiency, mutation testing, second LLM-written corpus); Note 18 per-rule verification ledger; Note 17 component ablation, community survey and external cohorts (R6 §3.5–3.6 verbatim) and earlier-release eICU rows; Fig. S1 provenance audit; Fig. S2 per-release eICU metrics; Fig. S3 per-group panel-supported recall; Fig. S4 per-group calibration; Fig. S5 context-echo analysis; Fig. S6 historical LLM comparison vs engine v5.1; Fig. S7 participant flow; Data 1 per-stay outputs and LLM prompts/outputs.</w:t>
+        <w:t>Notes: Note 1 SAP and amendments; Table S1 engine change log C1–C16 with sources; Table S2 quarantine criteria and outcomes (rounds 1 and 2); Note 2 LLM comparison protocol; Table S3 participant flow and baseline characteristics; Note 3 fusion/Theory-of-Evidence algorithm and consistency identities; Table S4 subgroup recall; Table S5 next-test utility (engine v5.3, superseded metric); Tables S6–S6c calibration, recalibration, decision curves, multiplicity and panel-size sensitivity; Table S7 survey-weighted NHANES AUROC; Table S8 per-group calibration; Table S9 label-mapping audit (400 stays); Table S10 registry count reconciliation; Table S11 precision/F1/NDCG, alert burden, per-group PPV and prevalence baseline; Table S12 fusion-weight sensitivity; Table S12b historical comparisons (superseded); Table S13 participant flow for the UCI cohorts; Table S15 open vs proprietary components; Table S16 sepsis companion model; Note 4 regression gate; Note 5 definitions, audits and completed TRIPOD+AI checklist; Note 6 version manifest; Note 7 evidence triage of twelve proposals; Note 8 source-concordance audit; Notes 9–12 material moved from the main text; Note 13 black-box property-conformance benchmark (engine and LLM on identical perturbed panels); Note 14 executable verifier behind the LLM and verified-consensus arm; Note 15 activity-guided provenance audit; Note 16 audit study (core sufficiency, mutation testing, second LLM-written corpus); Note 18 per-rule verification ledger and its closure in registry 15.3.0; Note 17 component ablation, community survey and external cohorts (R6 §3.5–3.6 verbatim) and earlier-release eICU rows; Fig. S1 provenance audit; Fig. S2 per-release eICU metrics; Fig. S3 per-group panel-supported recall; Fig. S4 per-group calibration; Fig. S5 context-echo analysis; Fig. S6 historical LLM comparison vs engine v5.1; Fig. S7 participant flow; Data 1 per-stay outputs and LLM prompts/outputs.</w:t>
       </w:r>
     </w:p>
     <w:p>

</xml_diff>

<commit_message>
Paper 1 R8: redrawn Figures 1-8 (make_figures_R8.py), new Fig. 3 (verification), renumbering, condensed Discussion/Conclusion (no numbers changed), supplement blank-line bug fixed (figures now embedded), Fig S6 withdrawn -> Table S12b
</commit_message>
<xml_diff>
--- a/docs/paper1/v7/Paper1_Hemoglyph_CMPB_EN_v7_R6.docx
+++ b/docs/paper1/v7/Paper1_Hemoglyph_CMPB_EN_v7_R6.docx
@@ -522,7 +522,7 @@
     </w:p>
     <w:p>
       <w:r>
-        <w:t xml:space="preserve">Of 200 rules sampled under the frozen protocol, only 16 could be resolved from the locators the registry provides: 15 were discordant—7 attribution errors among curated anchors (e.g. a hypernatraemia rule citing the hyponatraemia guideline) and 8 thresholds or definitions absent from an on-topic source (e.g. a candidate acute-kidney-injury "criterion" defined by a fixed creatinine &gt; 1.1 mg/dL and attributed to KDIGO 2012, which defines AKI only by change from baseline)—and 1 concordant. The remaining 184 (92%, 95% CI 87.4–95.1) were unresolvable: 12 with no retrievable text, 55 with only a title or abstract, 46 citing generic methodological standards that cannot contain a disease-specific threshold, and 71 organisation landing pages. Because an attribution error is visible from a title while concordance needs the full text, 15/16 is not an estimate of the discordance rate; the defensible statements are that at least 7.5% (4.6–12.0) of sampled rules are demonstrably discordant and that the registry is not auditable rule-by-rule from its own locators. A provenance scan of all 785 sources resolved 112 DOIs via Crossref and reached 533 landing pages; 39 were unreachable, 34 lacked a locator, nine invalid DOIs were removed and 28 rules were flagged </w:t>
+        <w:t xml:space="preserve">Of 200 rules sampled under the frozen protocol (Fig. 3b), only 16 could be resolved from the locators the registry provides: 15 were discordant—7 attribution errors among curated anchors (e.g. a hypernatraemia rule citing the hyponatraemia guideline) and 8 thresholds or definitions absent from an on-topic source (e.g. a candidate acute-kidney-injury "criterion" defined by a fixed creatinine &gt; 1.1 mg/dL and attributed to KDIGO 2012, which defines AKI only by change from baseline)—and 1 concordant. The remaining 184 (92%, 95% CI 87.4–95.1) were unresolvable: 12 with no retrievable text, 55 with only a title or abstract, 46 citing generic methodological standards that cannot contain a disease-specific threshold, and 71 organisation landing pages. Because an attribution error is visible from a title while concordance needs the full text, 15/16 is not an estimate of the discordance rate; the defensible statements are that at least 7.5% (4.6–12.0) of sampled rules are demonstrably discordant and that the registry is not auditable rule-by-rule from its own locators. A provenance scan of all 785 sources resolved 112 DOIs via Crossref and reached 533 landing pages; 39 were unreachable, 34 lacked a locator, nine invalid DOIs were removed and 28 rules were flagged </w:t>
       </w:r>
       <w:r>
         <w:rPr>
@@ -547,7 +547,7 @@
     </w:p>
     <w:p>
       <w:r>
-        <w:t>On 3,814 real panels 1,991 rules fired and 364 (1.1%) ever placed a diagnosis in a top-10 differential; 174 did so ten or more times; 31,192 (94.0%) never fired. The active core holds 46 of the 272 curated anchors and 105 generated templates; its first-cited source is a resolved DOI for 10.4% of rules against 0.8% registry-wide. Automated search located the rule's threshold in a document reached from the locator for 8 of 364 active rules; 120 locators were organisation landing pages, 63 blocked or 404, 150 reached a page without the statement. In the fresh sample of 100 active rules, 6 were concordant (ADA 2026 diabetes and prediabetes criteria, ADA/EASD 2024 DKA severity and HHS criteria, BSG 2021 iron-deficiency anaemia), 2 discordant (an HbA1c "&gt; 5.7%" pattern against an inclusive 5.7–6.4% range; CK "≥ 1000" against "&gt; 1000 U/L" in a systematic review) and 92 unresolvable (95% CI 85.0–95.9; 88.6% among the 70 non-template rules), of which at least 18 cite a specific document that does not address the rule's analyte, 30 an organisation page and 5 a WHO URL returning 404. None of the four registered expectations was met (Supplementary Note 15).</w:t>
+        <w:t>On 3,814 real panels 1,991 rules fired and 364 (1.1%) ever placed a diagnosis in a top-10 differential (Fig. 3a); 174 did so ten or more times; 31,192 (94.0%) never fired. The active core holds 46 of the 272 curated anchors and 105 generated templates; its first-cited source is a resolved DOI for 10.4% of rules against 0.8% registry-wide. Automated search located the rule's threshold in a document reached from the locator for 8 of 364 active rules; 120 locators were organisation landing pages, 63 blocked or 404, 150 reached a page without the statement. In the fresh sample of 100 active rules, 6 were concordant (ADA 2026 diabetes and prediabetes criteria, ADA/EASD 2024 DKA severity and HHS criteria, BSG 2021 iron-deficiency anaemia), 2 discordant (an HbA1c "&gt; 5.7%" pattern against an inclusive 5.7–6.4% range; CK "≥ 1000" against "&gt; 1000 U/L" in a systematic review) and 92 unresolvable (95% CI 85.0–95.9; 88.6% among the 70 non-template rules), of which at least 18 cite a specific document that does not address the rule's analyte, 30 an organisation page and 5 a WHO URL returning 404. None of the four registered expectations was met (Supplementary Note 15).</w:t>
       </w:r>
     </w:p>
     <w:p>
@@ -568,7 +568,7 @@
     </w:p>
     <w:p>
       <w:r>
-        <w:t>The reference standard bounds these metrics (Fig. 2b): of 2,707 label targets, 541 belonged to groups with no single laboratory criterion, 275 lacked the key analyte and 431 were contradicted by the first panel (e.g. hypokalaemia coded with potassium 4.1 mmol/L after repletion). Among the 1,460 labels whose first panel met the guideline criterion—a secondary metric defined after the ceiling was observed—flat recall was 29.6/62.5/78.0/91.8% at k = 1/3/5/10. Supervised models trained on the labels (Fig. 3) exceeded the untrained engine only in outcome-defined groups without a laboratory signature (sepsis AUROC 0.82 vs 0.68; GI bleeding 0.85 vs 0.75; alcohol withdrawal 0.80 vs 0.54) and were matched or beaten in nine guideline-defined groups.</w:t>
+        <w:t>The reference standard bounds these metrics (Fig. 2b): of 2,707 label targets, 541 belonged to groups with no single laboratory criterion, 275 lacked the key analyte and 431 were contradicted by the first panel (e.g. hypokalaemia coded with potassium 4.1 mmol/L after repletion). Among the 1,460 labels whose first panel met the guideline criterion—a secondary metric defined after the ceiling was observed—flat recall was 29.6/62.5/78.0/91.8% at k = 1/3/5/10. Supervised models trained on the labels (Fig. 4) exceeded the untrained engine only in outcome-defined groups without a laboratory signature (sepsis AUROC 0.82 vs 0.68; GI bleeding 0.85 vs 0.75; alcohol withdrawal 0.80 vs 0.54) and were matched or beaten in nine guideline-defined groups.</w:t>
       </w:r>
     </w:p>
     <w:p>
@@ -584,7 +584,7 @@
     </w:p>
     <w:p>
       <w:r>
-        <w:t>Two components carry the signal (Table 1): removing the rule-engine vote cost 12.1 points of flat recall@5 (−14.4 to −9.8) and removing the syndrome layer 9.5 points (−11.1 to −7.9); the Bayesian network contributed 1.3 points and any fusion-weight profile changed recall by ≤ 1.4 points. Restricting the registry to the 272 curated anchors (32,911 AI-drafted rules off) lowered recall@5 by 0.9 points (−2.1 to +0.2); the headline therefore rests on hand-curated components, and registry scale is not claimed as a merit. In 3,000 NHANES adults per cycle, AUROCs reproduced across the development cycle (2017–18) and the two quarantine cycles (2013–14, 2015–16): diabetes 0.946/0.938/0.924, CKD 0.959/0.968/0.962, anaemia 0.972/0.994/0.983, hypercholesterolaemia 0.905/0.883/0.886 (Fig. 4; Table 4); against self-reported physician diagnosis, which does not overlap the inputs, AUROC was 0.90–0.92 for diabetes and 0.75–0.82 for kidney disease; among guideline-healthy adults the engine asserted a disease in 2/485 (0.4%). In PhysioNet/CinC 2019 the sepsis score discriminated Sepsis-3 onset with AUROC 0.600, 0.610 and 0.588 in sets A, B and B2 versus 0.691, 0.712 and 0.679 for a supervised logistic model on the same features (Fig. 5)—a pre-specified negative result; Hemoglyph is not a sepsis predictor and was not tuned to the task afterwards. External cohorts (UCI thyroid 0.979/0.798, HCV 0.925, ILPD 0.704, MIMIC-IV demo top-5 47.5%, PMC case reports 26% specific/68% syndrome), raw-score calibration (pooled AUROC 0.797; Fig. 7) and subgroup analyses are in Table 4 and Supplementary Note 17.</w:t>
+        <w:t>Two components carry the signal (Table 1): removing the rule-engine vote cost 12.1 points of flat recall@5 (−14.4 to −9.8) and removing the syndrome layer 9.5 points (−11.1 to −7.9); the Bayesian network contributed 1.3 points and any fusion-weight profile changed recall by ≤ 1.4 points. Restricting the registry to the 272 curated anchors (32,911 AI-drafted rules off) lowered recall@5 by 0.9 points (−2.1 to +0.2); the headline therefore rests on hand-curated components, and registry scale is not claimed as a merit. In 3,000 NHANES adults per cycle, AUROCs reproduced across the development cycle (2017–18) and the two quarantine cycles (2013–14, 2015–16): diabetes 0.946/0.938/0.924, CKD 0.959/0.968/0.962, anaemia 0.972/0.994/0.983, hypercholesterolaemia 0.905/0.883/0.886 (Fig. 5; Table 4); against self-reported physician diagnosis, which does not overlap the inputs, AUROC was 0.90–0.92 for diabetes and 0.75–0.82 for kidney disease; among guideline-healthy adults the engine asserted a disease in 2/485 (0.4%). In PhysioNet/CinC 2019 the sepsis score discriminated Sepsis-3 onset with AUROC 0.600, 0.610 and 0.588 in sets A, B and B2 versus 0.691, 0.712 and 0.679 for a supervised logistic model on the same features (Fig. 6)—a pre-specified negative result; Hemoglyph is not a sepsis predictor and was not tuned to the task afterwards. External cohorts (UCI thyroid 0.979/0.798, HCV 0.925, ILPD 0.704, MIMIC-IV demo top-5 47.5%, PMC case reports 26% specific/68% syndrome), raw-score calibration (pooled AUROC 0.797; Fig. 8) and subgroup analyses are in Table 4 and Supplementary Note 17.</w:t>
       </w:r>
     </w:p>
     <w:p>
@@ -600,7 +600,7 @@
     </w:p>
     <w:p>
       <w:r>
-        <w:t>On 400 stays (291 with scorable labels; 596 labels), recall@5—the pre-specified primary comparison—was 60.7% (56.5–65.0) for Hemoglyph versus 59.6% (55.3–63.6) for the LLM, difference +1.2 points (−2.5 to +5.1; cluster-adjusted McNemar p = 0.54). The LLM was better at rank 1 (28.2% vs 24.0%, p = 0.013) and rank 3 (50.8% vs 47.0%, p = 0.041); the engine at rank 10 (72.0% vs 65.1%, p = 0.0002) and left fewer labels absent (21.8% vs 34.9%); mean reciprocal rank 0.391 vs 0.408 (Fig. 6; Table 5). On 40 panels re-read by the LLM, top-5 agreement with its own first reading was κ 0.69; the engine's was 1.00.</w:t>
+        <w:t>On 400 stays (291 with scorable labels; 596 labels), recall@5—the pre-specified primary comparison—was 60.7% (56.5–65.0) for Hemoglyph versus 59.6% (55.3–63.6) for the LLM, difference +1.2 points (−2.5 to +5.1; cluster-adjusted McNemar p = 0.54). The LLM was better at rank 1 (28.2% vs 24.0%, p = 0.013) and rank 3 (50.8% vs 47.0%, p = 0.041); the engine at rank 10 (72.0% vs 65.1%, p = 0.0002) and left fewer labels absent (21.8% vs 34.9%); mean reciprocal rank 0.391 vs 0.408 (Fig. 7; Table 5). On 40 panels re-read by the LLM, top-5 agreement with its own first reading was κ 0.69; the engine's was 1.00.</w:t>
       </w:r>
     </w:p>
     <w:p>
@@ -663,7 +663,7 @@
         <w:t>Mutation.</w:t>
       </w:r>
       <w:r>
-        <w:t xml:space="preserve"> Detector recall was 1.00 for inverted or impossible tiers (301/301), 0.98 for multi-analyte rules collapsed to a single ubiquitous analyte (138/141), 0.74 for unit substitution (113/152), 0.55 for thresholds pushed outside physiological limits (40/73), 0.46 for random source substitution (40/88), 0.13 for operator flips (36/274) and 0.003 for plausible threshold changes (1/303); specificity on unmutated seeds was 0.974, and four of the eight flagged seeds were real defects (an adult haemoglobin threshold under a neonatal population gate). These, with 126 unit-label and 14 source errors found during calibration, were corrected in registry 15.2.0 under a written protocol, with every eICU and NHANES gate count identical before and after. </w:t>
+        <w:t xml:space="preserve"> (Fig. 3c) Detector recall was 1.00 for inverted or impossible tiers (301/301), 0.98 for multi-analyte rules collapsed to a single ubiquitous analyte (138/141), 0.74 for unit substitution (113/152), 0.55 for thresholds pushed outside physiological limits (40/73), 0.46 for random source substitution (40/88), 0.13 for operator flips (36/274) and 0.003 for plausible threshold changes (1/303); specificity on unmutated seeds was 0.974, and four of the eight flagged seeds were real defects (an adult haemoglobin threshold under a neonatal population gate). These, with 126 unit-label and 14 source errors found during calibration, were corrected in registry 15.2.0 under a written protocol, with every eICU and NHANES gate count identical before and after. </w:t>
       </w:r>
       <w:r>
         <w:rPr>
@@ -683,7 +683,7 @@
         <w:t>Ledger.</w:t>
       </w:r>
       <w:r>
-        <w:t xml:space="preserve"> A per-rule verification ledger (Supplementary Note 18; </w:t>
+        <w:t xml:space="preserve"> A per-rule verification ledger (Fig. 3d; Supplementary Note 18; </w:t>
       </w:r>
       <w:r>
         <w:rPr>
@@ -708,12 +708,12 @@
     </w:p>
     <w:p>
       <w:r>
-        <w:t>Each of the four methods produced information that conventional validation had not: two engine defects that 353 adversarial vignettes missed; a rule base that cannot be audited from its own locators, with at least 7.5% of sampled rules discordant; an output carried by 1.1% of rules that fail in the same way as the bulk; recall@5 parity with a frontier LLM while a prevalence baseline reached 51%, so the engine's contribution is ordering (NDCG@5 56.5% vs 39.0%) and specificity, not coverage; and an audit of the audit showing that the audited core reproduces the primary results, that static detectors catch structural defects but not plausible wrong numbers, and that a second LLM-written rule set shows the same defect classes.</w:t>
+        <w:t>Each method produced information that conventional validation had not: two engine defects that 353 adversarial vignettes missed; a rule base that cannot be audited from its own locators, with at least 7.5% of sampled rules discordant; an output carried by 1.1% of rules that fail in the same way as the bulk; recall@5 parity with a frontier LLM while a prevalence baseline reached 51%, so the engine's contribution is ordering (NDCG@5 56.5% vs 39.0%) and specificity, not coverage; and an audit of the audit showing that 335 curated or quote-verified rules reproduce the primary results, that static detectors catch structural but not plausible defects, and that a second LLM-written rule set shows the same defect classes.</w:t>
       </w:r>
     </w:p>
     <w:p>
       <w:r>
-        <w:t xml:space="preserve">Executable invariants are a genuine advantage of a rule engine over an LLM: they can be stated, run on every release and violated only visibly. On identical panels the engine held unit and presentation invariance where the LLM's output changed in most panels, and the same test found two engine defects—which is the point: a violated invariant is a bug report with a reproducer, whereas an LLM's changed answer is not actionable. The criteria also work as a verifier </w:t>
+        <w:t xml:space="preserve">Executable invariants are a genuine advantage of a rule engine over an LLM: they can be stated, run on every release and violated only visibly. On identical panels the engine held unit and presentation invariance where the LLM's output changed in most panels, and the same test found two engine defects—a violated invariant is a bug report with a reproducer, whereas an LLM's changed answer is not actionable. The criteria also work as a verifier </w:t>
       </w:r>
       <w:r>
         <w:rPr>
@@ -722,12 +722,12 @@
         <w:t>behind</w:t>
       </w:r>
       <w:r>
-        <w:t xml:space="preserve"> the LLM, removing 40% of its unsupported top-5 assertions at no recall cost while flagging the engine's own output more often; fusing the two did not help at rank 5, because filtering admits only the verifiable while the engine's residual advantage lies in outcome syndromes no single criterion verifies. Invariants establish consistency, not correctness: a mistranscribed threshold passes every invariant, and the mutation study quantifies this (recall 0.003 for a plausible wrong number). The concordance audit shows why correctness is hard to reach: the limiting factor was not rater effort but locator granularity—organisation-level URLs and generic standards make 92% of rules uncheckable, and where checking was possible the error was usually attribution. Audit protocols should therefore require the verbatim source sentence for every verdict, and auditable registries should carry section- or table-level locators; an independent clinical audit is the next step. All four tools transfer unchanged to any rule base whose records carry analyte, operator, threshold, unit, population and locator, and the benchmark scripts run unchanged on the credentialed full eICU and MIMIC-IV releases.</w:t>
+        <w:t xml:space="preserve"> the LLM, removing 40% of its unsupported top-5 assertions at no recall cost; fusing the two did not help at rank 5, because filtering admits only the verifiable while the engine's residual advantage lies in outcome syndromes no single criterion verifies. Invariants establish consistency, not correctness: a mistranscribed threshold passes every invariant (mutation recall 0.003 for a plausible wrong number). The concordance audit shows why correctness is hard to reach: the limiting factor was locator granularity, not rater effort—organisation-level URLs and generic standards make 92% of rules uncheckable, and where checking was possible the error was usually attribution. Audit protocols should therefore require the verbatim source sentence for every verdict, registries should carry section- or table-level locators, and an independent clinical audit is the next step. All four tools transfer unchanged to any rule base whose records carry analyte, operator, threshold, unit, population and locator.</w:t>
       </w:r>
     </w:p>
     <w:p>
       <w:r>
-        <w:t>The benchmark numbers measure the reference standard at least as much as the engine. A quarter of problem-list entries were not inferable from the first panel; the panel-supported subset is recovered at 78.0% (k = 5) and 91.8% (k = 10), supervised models did not exceed 0.82 AUROC for outcome-defined groups, and a prevalence baseline overtakes any method at k = 10, so no laboratory-only system can score much higher on this reference. Of the 85.8% of top-5 assertions not on the problem list, 54.8% satisfy the group's criterion in the same panel and only 12.6% are criterion-negative—coded precision (14.2%) is a lower bound, 69.0% an upper bound. Where the engine loses (sepsis, bleeding, withdrawal, CKD without a second creatinine) the label is an outcome learned from hidden correlates or needs longitudinal data; part of the loss was chosen, since withdrawing single-creatinine CKD assertions to comply with KDIGO cost three points of recall@5. Ablation and sufficiency agree that the result lives in the rule vote and a few hundred curated constellations and core rules; the bulk adds one to three points and 94% of it never fired, so the activity log converts an unauditable registry into a tractable verification queue. The contribution of such an engine is therefore not accuracy beyond what the reference permits but a property no LLM or trained model offers: every output carries a rule identifier, threshold and source, runs offline in about one second, and is verifiable before release. The design also answers criticisms of recent LLM benchmarks—unstable metrics, leakage and post-hoc selection [28,33]: releases were frozen with manifests, quarantine data were run once, the failed round is disclosed, and the LLM's test–retest variability (κ 0.69) exceeded the between-system difference. Unlike Isabel and DXplain studies [13–16,34], this study isolates laboratory-only reasoning on more than 20,000 encounters and releases its knowledge base under an open licence; the per-entry rule identifier and source are consistent with the transparency principle of the FDA's January 2026 clinical-decision-support guidance, without any regulatory claim.</w:t>
+        <w:t>The benchmark numbers measure the reference standard at least as much as the engine. A quarter of problem-list entries were not inferable from the first panel; the panel-supported subset is recovered at 78.0% (k = 5) and 91.8% (k = 10), supervised models did not exceed 0.82 AUROC for outcome-defined groups, and a prevalence baseline overtakes any method at k = 10. Of the 85.8% of top-5 assertions not on the problem list, 54.8% satisfy the group's criterion in the same panel and only 12.6% are criterion-negative—coded precision (14.2%) is a lower bound, 69.0% an upper bound. Where the engine loses (sepsis, bleeding, withdrawal, CKD without a second creatinine) the label is an outcome learned from hidden correlates or needs longitudinal data; part of the loss was chosen, since withdrawing single-creatinine CKD assertions to comply with KDIGO cost three points of recall@5. Ablation and sufficiency agree that the result lives in the rule vote and a few hundred curated constellations; the bulk adds one to three points and 94% of it never fired, so the activity log converts an unauditable registry into a tractable verification queue. The design answers criticisms of recent LLM benchmarks—unstable metrics, leakage and post-hoc selection [28,33]: releases were frozen with manifests, quarantine data were run once, the failed round is disclosed, and the LLM's test–retest variability (κ 0.69) exceeded the between-system difference. Unlike Isabel and DXplain studies [13–16,34], this study isolates laboratory-only reasoning on more than 20,000 encounters and releases its knowledge base under an open licence; the per-entry rule identifier and source are consistent with the transparency principle of the FDA's January 2026 clinical-decision-support guidance, without any regulatory claim.</w:t>
       </w:r>
     </w:p>
     <w:p>
@@ -759,7 +759,7 @@
     </w:p>
     <w:p>
       <w:r>
-        <w:t>Executable invariants, a frozen source-concordance protocol with an activity log, a hash-frozen one-shot benchmark and an audit of the audit itself are four low-cost, reproducible methods for verifying an AI-drafted clinical rule base. A rule engine whose every output carries a rule identifier, threshold and source can be audited in ways a language model cannot—and can audit the language model's output in turn. Applied to Hemoglyph they found defects that vignettes had missed, showed that provenance granularity rather than rule count limits auditability, that 1.1% of the rules carry the output and that 335 curated or quote-verified rules reproduce the primary results alone, and that static checks cannot catch a plausible wrong number; and they placed an untrained, traceable engine at parity with a frontier LLM on a blinded laboratory-panel task close to the ceiling the reference standard allows. The limits—an unaudited rule base, outcome-defined syndromes, uncalibrated scores—are stated so that they can be measured and closed.</w:t>
+        <w:t>Executable invariants, a frozen source-concordance protocol with an activity log, a hash-frozen one-shot benchmark and an audit of the audit are four low-cost, reproducible methods for verifying an AI-drafted clinical rule base; a rule engine whose every output carries a rule identifier, threshold and source can be audited in ways a language model cannot, and can audit the language model's output in turn. Applied to Hemoglyph they found defects that vignettes had missed, showed that provenance granularity rather than rule count limits auditability, that 1.1% of the rules carry the output and 335 curated or quote-verified rules reproduce the primary results alone, that static checks cannot catch a plausible wrong number, and placed an untrained, traceable engine at parity with a frontier LLM close to the ceiling the reference standard allows. The limits—an unaudited rule base, outcome-defined syndromes, uncalibrated scores—are stated so that they can be measured and closed.</w:t>
       </w:r>
     </w:p>
     <w:p>
@@ -1780,7 +1780,7 @@
         <w:rPr>
           <w:sz w:val="20"/>
         </w:rPr>
-        <w:t xml:space="preserve"> (a) SAP, freezes and the two one-shot quarantine rounds, including the failed round. (b) Decomposition of 2,707 eICU label targets and recall on the 1,460 panel-supported labels for the product release, v7 and the registry-off ablation.</w:t>
+        <w:t xml:space="preserve"> (a) SAP, freezes and the two one-shot quarantine rounds, including the failed round. (b) Decomposition of the 2,707 eICU label targets. (c) Recall on the 1,460 panel-supported labels for the product release, 14.1/v6, v7 and the registry-off ablation.</w:t>
       </w:r>
     </w:p>
     <w:p>
@@ -1789,7 +1789,22 @@
           <w:b/>
           <w:sz w:val="20"/>
         </w:rPr>
-        <w:t>Fig. 3 | Untrained engine versus supervised models on identical inputs (eICU).</w:t>
+        <w:t>Fig. 3 | What the verification methods established about the rule base.</w:t>
+      </w:r>
+      <w:r>
+        <w:rPr>
+          <w:sz w:val="20"/>
+        </w:rPr>
+        <w:t xml:space="preserve"> (a) Activity log over 3,814 real panels: 31,192 of 33,183 executable rules never fired, 1,627 fired without ever entering a top-10 differential, 364 formed the active core (174 hot). (b) Source concordance of the 200-rule frozen sample and of 100 active-core rules after re-sourcing (single declared AI rater). (c) Recall of seeded defects by the static detectors (mutation testing, Supplementary Note 16). (d) Per-rule verification ledger (Supplementary Note 18): status of the curated anchors, the active core and the sufficiency-arm rules in registry 15.2.0.</w:t>
+      </w:r>
+    </w:p>
+    <w:p>
+      <w:r>
+        <w:rPr>
+          <w:b/>
+          <w:sz w:val="20"/>
+        </w:rPr>
+        <w:t>Fig. 4 | Untrained engine versus supervised models on identical inputs (eICU).</w:t>
       </w:r>
       <w:r>
         <w:rPr>
@@ -1804,7 +1819,7 @@
           <w:b/>
           <w:sz w:val="20"/>
         </w:rPr>
-        <w:t>Fig. 4 | NHANES screening across three independent cycles.</w:t>
+        <w:t>Fig. 5 | NHANES screening across three independent cycles.</w:t>
       </w:r>
       <w:r>
         <w:rPr>
@@ -1819,13 +1834,13 @@
           <w:b/>
           <w:sz w:val="20"/>
         </w:rPr>
-        <w:t>Fig. 5 | Sepsis: a pre-specified negative result.</w:t>
+        <w:t>Fig. 6 | Sepsis: a pre-specified negative result.</w:t>
       </w:r>
       <w:r>
         <w:rPr>
           <w:sz w:val="20"/>
         </w:rPr>
-        <w:t xml:space="preserve"> Engine versus supervised logistic AUROC in prediction and concurrent frames across sets A, B and B2.</w:t>
+        <w:t xml:space="preserve"> Engine versus supervised logistic AUROC (95% CI) in the prediction frame (a) and the concurrent frame (b) across PhysioNet 2019 sets A, B and B2; concurrent values are those recorded at each one-shot round.</w:t>
       </w:r>
     </w:p>
     <w:p>
@@ -1834,13 +1849,13 @@
           <w:b/>
           <w:sz w:val="20"/>
         </w:rPr>
-        <w:t>Fig. 6 | Blinded LLM comparison (400 stays, 596 labels), frozen engine v7.</w:t>
+        <w:t>Fig. 7 | Blinded LLM comparison and black-box property conformance.</w:t>
       </w:r>
       <w:r>
         <w:rPr>
           <w:sz w:val="20"/>
         </w:rPr>
-        <w:t xml:space="preserve"> Per-group recall@5 and recall@k curves for Hemoglyph and the unnamed frontier LLM model.</w:t>
+        <w:t xml:space="preserve"> (a) Per-group recall@5 for groups with ≥ 10 labels and (b) recall@k curves, 400 stays / 596 labels, frozen engine v7 versus the unnamed frontier LLM; (c) conformance on identical perturbed panels (Table 6; engine v8.2).</w:t>
       </w:r>
     </w:p>
     <w:p>
@@ -1849,13 +1864,13 @@
           <w:b/>
           <w:sz w:val="20"/>
         </w:rPr>
-        <w:t>Fig. 7 | Calibration and decision curves (eICU, engine v7).</w:t>
+        <w:t>Fig. 8 | Calibration and decision curves (eICU, engine v7).</w:t>
       </w:r>
       <w:r>
         <w:rPr>
           <w:sz w:val="20"/>
         </w:rPr>
-        <w:t xml:space="preserve"> Reliability diagrams before and after cross-fitted isotonic recalibration and decision curves for the five largest groups.</w:t>
+        <w:t xml:space="preserve"> (a) Reliability by decile before and after cross-fitted isotonic recalibration, all groups pooled; (b) decision curves (net benefit per 100) for the five largest groups.</w:t>
       </w:r>
     </w:p>
     <w:p>
@@ -6969,7 +6984,7 @@
         <w:rPr>
           <w:sz w:val="20"/>
         </w:rPr>
-        <w:t xml:space="preserve"> The historical v5.1 comparison from the first submission is in Supplementary Figure S (superseded).</w:t>
+        <w:t xml:space="preserve"> The historical v5.1 comparison from the first submission is in Supplementary Table S12b (superseded).</w:t>
       </w:r>
     </w:p>
     <w:tbl>
@@ -9250,7 +9265,7 @@
     </w:p>
     <w:p>
       <w:r>
-        <w:t>Notes: Note 1 SAP and amendments; Table S1 engine change log C1–C16 with sources; Table S2 quarantine criteria and outcomes (rounds 1 and 2); Note 2 LLM comparison protocol; Table S3 participant flow and baseline characteristics; Note 3 fusion/Theory-of-Evidence algorithm and consistency identities; Table S4 subgroup recall; Table S5 next-test utility (engine v5.3, superseded metric); Tables S6–S6c calibration, recalibration, decision curves, multiplicity and panel-size sensitivity; Table S7 survey-weighted NHANES AUROC; Table S8 per-group calibration; Table S9 label-mapping audit (400 stays); Table S10 registry count reconciliation; Table S11 precision/F1/NDCG, alert burden, per-group PPV and prevalence baseline; Table S12 fusion-weight sensitivity; Table S12b historical comparisons (superseded); Table S13 participant flow for the UCI cohorts; Table S15 open vs proprietary components; Table S16 sepsis companion model; Note 4 regression gate; Note 5 definitions, audits and completed TRIPOD+AI checklist; Note 6 version manifest; Note 7 evidence triage of twelve proposals; Note 8 source-concordance audit; Notes 9–12 material moved from the main text; Note 13 black-box property-conformance benchmark (engine and LLM on identical perturbed panels); Note 14 executable verifier behind the LLM and verified-consensus arm; Note 15 activity-guided provenance audit; Note 16 audit study (core sufficiency, mutation testing, second LLM-written corpus); Note 18 per-rule verification ledger and its closure in registry 15.3.0; Note 17 component ablation, community survey and external cohorts (R6 §3.5–3.6 verbatim) and earlier-release eICU rows; Fig. S1 provenance audit; Fig. S2 per-release eICU metrics; Fig. S3 per-group panel-supported recall; Fig. S4 per-group calibration; Fig. S5 context-echo analysis; Fig. S6 historical LLM comparison vs engine v5.1; Fig. S7 participant flow; Data 1 per-stay outputs and LLM prompts/outputs.</w:t>
+        <w:t>Notes: Note 1 SAP and amendments; Table S1 engine change log C1–C16 with sources; Table S2 quarantine criteria and outcomes (rounds 1 and 2); Note 2 LLM comparison protocol; Table S3 participant flow and baseline characteristics; Note 3 fusion/Theory-of-Evidence algorithm and consistency identities; Table S4 subgroup recall; Table S5 next-test utility (engine v5.3, superseded metric); Tables S6–S6c calibration, recalibration, decision curves, multiplicity and panel-size sensitivity; Table S7 survey-weighted NHANES AUROC; Table S8 per-group calibration; Table S9 label-mapping audit (400 stays); Table S10 registry count reconciliation; Table S11 precision/F1/NDCG, alert burden, per-group PPV and prevalence baseline; Table S12 fusion-weight sensitivity; Table S12b historical comparisons (superseded); Table S13 participant flow for the UCI cohorts; Table S15 open vs proprietary components; Table S16 sepsis companion model; Note 4 regression gate; Note 5 definitions, audits and completed TRIPOD+AI checklist; Note 6 version manifest; Note 7 evidence triage of twelve proposals; Note 8 source-concordance audit; Notes 9–12 material moved from the main text; Note 13 black-box property-conformance benchmark (engine and LLM on identical perturbed panels); Note 14 executable verifier behind the LLM and verified-consensus arm; Note 15 activity-guided provenance audit; Note 16 audit study (core sufficiency, mutation testing, second LLM-written corpus); Note 18 per-rule verification ledger and its closure in registry 15.3.0; Note 17 component ablation, community survey and external cohorts (R6 §3.5–3.6 verbatim) and earlier-release eICU rows; Fig. S1 provenance audit; Fig. S2 per-release eICU metrics; Fig. S3 per-group panel-supported recall; Fig. S4 per-group calibration; Fig. S5 context-echo analysis; Fig. S6 participant flow; Data 1 per-stay outputs and LLM prompts/outputs.</w:t>
       </w:r>
     </w:p>
     <w:p>
@@ -9357,7 +9372,7 @@
     </w:p>
     <w:p>
       <w:r>
-        <w:t xml:space="preserve">Pooled over 52,689 stay–group units, AUROC was 0.797 but raw scores were over-confident: calibration slope 0.25, ECE 0.162, Brier 0.117 (Fig. 7). Split-half cross-fitted isotonic recalibration reduced ECE to 0.003 within eICU—evidence that ranks are recalibrable, not a transferable calibration. Raw scores are therefore ranks, not probabilities. Twenty-seven of 29 groups with ≥10 labels had AUROC above 0.5 after Benjamini–Hochberg adjustment (exceptions: malnutrition, hypocalcaemia). Recall@5 was 62.3% in men and 58.5% in women, 58–64% across age bands and 59–61% across the three largest ethnicity strata (Supplementary Table S4); three strata in one US dataset do not support a fairness claim. The engine contains no race or ethnicity term, and its optional </w:t>
+        <w:t xml:space="preserve">Pooled over 52,689 stay–group units, AUROC was 0.797 but raw scores were over-confident: calibration slope 0.25, ECE 0.162, Brier 0.117 (Fig. 8). Split-half cross-fitted isotonic recalibration reduced ECE to 0.003 within eICU—evidence that ranks are recalibrable, not a transferable calibration. Raw scores are therefore ranks, not probabilities. Twenty-seven of 29 groups with ≥10 labels had AUROC above 0.5 after Benjamini–Hochberg adjustment (exceptions: malnutrition, hypocalcaemia). Recall@5 was 62.3% in men and 58.5% in women, 58–64% across age bands and 59–61% across the three largest ethnicity strata (Supplementary Table S4); three strata in one US dataset do not support a fairness claim. The engine contains no race or ethnicity term, and its optional </w:t>
       </w:r>
       <w:r>
         <w:rPr>
@@ -9683,7 +9698,7 @@
     </w:p>
     <w:p>
       <w:r>
-        <w:t>Three comparators used identical inputs (Fig. 3). A raw key-analyte threshold matched or exceeded the engine's AUROC for single-analyte groups (hyperkalaemia 0.96 vs 0.92; anaemia 0.83 vs 0.78), as expected for findings that are definitions. Gradient boosting and logistic regression trained on the labels (five-fold out-of-fold) exceeded the untrained engine only in outcome-defined groups without a laboratory signature—sepsis (0.82 vs 0.68), GI bleeding (0.85 vs 0.75), alcohol withdrawal (0.80 vs 0.54)—and were matched or beaten in nine guideline-defined groups (CKD 0.79 vs 0.81; hyponatraemia 0.85 vs 0.89; cirrhosis 0.83 vs 0.87). Adding documented history and medications raised recall@5 by 0.9 points for labels not named in the history (n = 2,467) but by 23.3 points for labels already named (n = 240); the context arm mainly echoes documentation and is reported only in the Supplement.</w:t>
+        <w:t>Three comparators used identical inputs (Fig. 4). A raw key-analyte threshold matched or exceeded the engine's AUROC for single-analyte groups (hyperkalaemia 0.96 vs 0.92; anaemia 0.83 vs 0.78), as expected for findings that are definitions. Gradient boosting and logistic regression trained on the labels (five-fold out-of-fold) exceeded the untrained engine only in outcome-defined groups without a laboratory signature—sepsis (0.82 vs 0.68), GI bleeding (0.85 vs 0.75), alcohol withdrawal (0.80 vs 0.54)—and were matched or beaten in nine guideline-defined groups (CKD 0.79 vs 0.81; hyponatraemia 0.85 vs 0.89; cirrhosis 0.83 vs 0.87). Adding documented history and medications raised recall@5 by 0.9 points for labels not named in the history (n = 2,467) but by 23.3 points for labels already named (n = 240); the context arm mainly echoes documentation and is reported only in the Supplement.</w:t>
       </w:r>
     </w:p>
     <w:p>
@@ -9715,7 +9730,7 @@
     </w:p>
     <w:p>
       <w:r>
-        <w:t>In 3,000 adults per cycle, unweighted AUROCs reproduced across the development cycle (2017–18) and the two quarantine cycles (2013–14, 2015–16): diabetes 0.946/0.938/0.924, CKD 0.959/0.968/0.962, anaemia 0.972/0.994/0.983, iron deficiency 0.989/–/0.972, hyperuricaemia 0.943/0.958/0.955, hypercholesterolaemia 0.905/0.883/0.886 and ALT elevation 0.872/0.880/0.877 (Fig. 4; Table 3). A correction: the previous version quoted 0.721 for ALT in 2017–18; that value came from registry 14.0.0, not the frozen v7. These laboratory-defined labels overlap the inputs and test criterion recognition; against self-reported physician diagnosis, AUROC was 0.90–0.92 for diabetes and 0.75–0.82 for kidney disease. Examination weights changed laboratory-defined AUROCs by ≤0.015 but lowered self-reported kidney disease in 2017–18 from 0.816 to 0.744 (Supplementary Table S7). Among guideline-healthy adults (30-analyte filter, Supplementary Note 5), the engine asserted a disease in 1/160, 1/246 and 0/79 (2/485, 0.4%); because the filter covers 30 analytes, this is a lower bound on false assertions. Separately, 0/1,000 synthetic guideline-normal panels produced a disease (a regression check, not evidence).</w:t>
+        <w:t>In 3,000 adults per cycle, unweighted AUROCs reproduced across the development cycle (2017–18) and the two quarantine cycles (2013–14, 2015–16): diabetes 0.946/0.938/0.924, CKD 0.959/0.968/0.962, anaemia 0.972/0.994/0.983, iron deficiency 0.989/–/0.972, hyperuricaemia 0.943/0.958/0.955, hypercholesterolaemia 0.905/0.883/0.886 and ALT elevation 0.872/0.880/0.877 (Fig. 5; Table 3). A correction: the previous version quoted 0.721 for ALT in 2017–18; that value came from registry 14.0.0, not the frozen v7. These laboratory-defined labels overlap the inputs and test criterion recognition; against self-reported physician diagnosis, AUROC was 0.90–0.92 for diabetes and 0.75–0.82 for kidney disease. Examination weights changed laboratory-defined AUROCs by ≤0.015 but lowered self-reported kidney disease in 2017–18 from 0.816 to 0.744 (Supplementary Table S7). Among guideline-healthy adults (30-analyte filter, Supplementary Note 5), the engine asserted a disease in 1/160, 1/246 and 0/79 (2/485, 0.4%); because the filter covers 30 analytes, this is a lower bound on false assertions. Separately, 0/1,000 synthetic guideline-normal panels produced a disease (a regression check, not evidence).</w:t>
       </w:r>
     </w:p>
     <w:p>
@@ -9747,7 +9762,7 @@
     </w:p>
     <w:p>
       <w:r>
-        <w:t>In PhysioNet/CinC 2019, the engine's sepsis score from first-24-h laboratory values discriminated Sepsis-3 onset with AUROC 0.600 (0.575–0.625) in set A, 0.610 (0.583–0.640) in quarantine set B and 0.588 (0.559–0.616) in set B2, versus 0.691, 0.712 and 0.679 for a supervised logistic model on the same features (Fig. 5). Guideline-sourced SIRS/qSOFA rules added afterwards (Amendment 15; developed on A, validated once on B2) added about 0.04 AUROC and are labelled post hoc. Hemoglyph is not a sepsis predictor.</w:t>
+        <w:t>In PhysioNet/CinC 2019, the engine's sepsis score from first-24-h laboratory values discriminated Sepsis-3 onset with AUROC 0.600 (0.575–0.625) in set A, 0.610 (0.583–0.640) in quarantine set B and 0.588 (0.559–0.616) in set B2, versus 0.691, 0.712 and 0.679 for a supervised logistic model on the same features (Fig. 6). Guideline-sourced SIRS/qSOFA rules added afterwards (Amendment 15; developed on A, validated once on B2) added about 0.04 AUROC and are labelled post hoc. Hemoglyph is not a sepsis predictor.</w:t>
       </w:r>
     </w:p>
     <w:p>
@@ -9763,7 +9778,7 @@
     </w:p>
     <w:p>
       <w:r>
-        <w:t>On 400 stays (291 with scorable labels; 596 labels) an unnamed frontier LLM, accessed through an agent platform that does not disclose the model, received the identical panel, age and sex and returned ten ranked diagnoses, blinded to labels (Supplementary Note 2). Recall@5—the pre-specified primary comparison—was 60.7% (56.5–65.0) for Hemoglyph versus 59.6% (55.3–63.6), difference +1.2 points (−2.5 to +5.1; cluster-adjusted McNemar p = 0.54). The LLM was better at rank 1 (28.2% vs 24.0%, p = 0.013) and rank 3 (50.8% vs 47.0%, p = 0.041); the engine at rank 10 (72.0% vs 65.1%, p = 0.0002) and left fewer labels absent (21.8% vs 34.9%); mean reciprocal rank 0.391 vs 0.408 (Fig. 6; Table 5). Crediting either engine tier—a post-hoc metric with no LLM counterpart—gave 69.8% vs 59.6%. An earlier comparison with engine v5.1 had favoured Hemoglyph (64.4%, p = 0.009); the v7 correctness changes removed that advantage. The engine led for GI bleeding (84 vs 50%), diabetes (50 vs 37%) and hypokalaemia (59 vs 41%); the LLM for metabolic acidosis (79 vs 50%), hyperkalaemia (90 vs 70%) and DKA (83 vs 73%). On 40 re-read panels the LLM's agreement with itself was 85.7% (κ = 0.69) and its recall@5 varied by ±5 points across reads and prompts—more than the engine–LLM difference. Both flagged 39/39 CAP critical values in 50 stays, a shared safety floor.</w:t>
+        <w:t>On 400 stays (291 with scorable labels; 596 labels) an unnamed frontier LLM, accessed through an agent platform that does not disclose the model, received the identical panel, age and sex and returned ten ranked diagnoses, blinded to labels (Supplementary Note 2). Recall@5—the pre-specified primary comparison—was 60.7% (56.5–65.0) for Hemoglyph versus 59.6% (55.3–63.6), difference +1.2 points (−2.5 to +5.1; cluster-adjusted McNemar p = 0.54). The LLM was better at rank 1 (28.2% vs 24.0%, p = 0.013) and rank 3 (50.8% vs 47.0%, p = 0.041); the engine at rank 10 (72.0% vs 65.1%, p = 0.0002) and left fewer labels absent (21.8% vs 34.9%); mean reciprocal rank 0.391 vs 0.408 (Fig. 7; Table 5). Crediting either engine tier—a post-hoc metric with no LLM counterpart—gave 69.8% vs 59.6%. An earlier comparison with engine v5.1 had favoured Hemoglyph (64.4%, p = 0.009); the v7 correctness changes removed that advantage. The engine led for GI bleeding (84 vs 50%), diabetes (50 vs 37%) and hypokalaemia (59 vs 41%); the LLM for metabolic acidosis (79 vs 50%), hyperkalaemia (90 vs 70%) and DKA (83 vs 73%). On 40 re-read panels the LLM's agreement with itself was 85.7% (κ = 0.69) and its recall@5 varied by ±5 points across reads and prompts—more than the engine–LLM difference. Both flagged 39/39 CAP critical values in 50 stays, a shared safety floor.</w:t>
       </w:r>
     </w:p>
     <w:p>
@@ -9779,7 +9794,7 @@
     </w:p>
     <w:p>
       <w:r>
-        <w:t>Raw scores were uncalibrated (pooled AUROC 0.797; reliability and decision curves before and after cross-fitted isotonic regression in Fig. 7); subgroup recall by age, sex and unit type, unit-invariance and perturbation results are given in Supplementary Note 11 and Table S4.</w:t>
+        <w:t>Raw scores were uncalibrated (pooled AUROC 0.797; reliability and decision curves before and after cross-fitted isotonic regression in Fig. 8); subgroup recall by age, sex and unit type, unit-invariance and perturbation results are given in Supplementary Note 11 and Table S4.</w:t>
       </w:r>
     </w:p>
     <w:p>
@@ -10028,7 +10043,7 @@
     </w:p>
     <w:p>
       <w:r>
-        <w:t>In 3,000 NHANES adults per cycle, unweighted AUROCs reproduced across the development cycle (2017–18) and the two quarantine cycles (2013–14, 2015–16): diabetes 0.946/0.938/0.924, CKD 0.959/0.968/0.962, anaemia 0.972/0.994/0.983, hyperuricaemia 0.943/0.958/0.955, hypercholesterolaemia 0.905/0.883/0.886, ALT elevation 0.872/0.880/0.877 (Fig. 4; Table 4). These laboratory-defined labels overlap the inputs; against self-reported physician diagnosis AUROC was 0.90–0.92 for diabetes and 0.75–0.82 for kidney disease. Among guideline-healthy adults the engine asserted a disease in 2/485 (0.4%). External cohorts (UCI thyroid 0.979/0.798, HCV 0.925, ILPD 0.704, MIMIC-IV demo top-5 47.5%, PMC case reports 26% specific/68% syndrome) are in Table 4 and Supplementary Note 10. In PhysioNet/CinC 2019 the engine's sepsis score discriminated Sepsis-3 onset with AUROC 0.600, 0.610 and 0.588 in sets A, B and B2 versus 0.691, 0.712 and 0.679 for a supervised logistic model on the same features (Fig. 5); Hemoglyph is not a sepsis predictor and was not tuned to the task afterwards. Raw scores were uncalibrated (pooled AUROC 0.797; Fig. 7); subgroup and robustness results are in Supplementary Note 11.</w:t>
+        <w:t>In 3,000 NHANES adults per cycle, unweighted AUROCs reproduced across the development cycle (2017–18) and the two quarantine cycles (2013–14, 2015–16): diabetes 0.946/0.938/0.924, CKD 0.959/0.968/0.962, anaemia 0.972/0.994/0.983, hyperuricaemia 0.943/0.958/0.955, hypercholesterolaemia 0.905/0.883/0.886, ALT elevation 0.872/0.880/0.877 (Fig. 5; Table 4). These laboratory-defined labels overlap the inputs; against self-reported physician diagnosis AUROC was 0.90–0.92 for diabetes and 0.75–0.82 for kidney disease. Among guideline-healthy adults the engine asserted a disease in 2/485 (0.4%). External cohorts (UCI thyroid 0.979/0.798, HCV 0.925, ILPD 0.704, MIMIC-IV demo top-5 47.5%, PMC case reports 26% specific/68% syndrome) are in Table 4 and Supplementary Note 10. In PhysioNet/CinC 2019 the engine's sepsis score discriminated Sepsis-3 onset with AUROC 0.600, 0.610 and 0.588 in sets A, B and B2 versus 0.691, 0.712 and 0.679 for a supervised logistic model on the same features (Fig. 6); Hemoglyph is not a sepsis predictor and was not tuned to the task afterwards. Raw scores were uncalibrated (pooled AUROC 0.797; Fig. 8); subgroup and robustness results are in Supplementary Note 11.</w:t>
       </w:r>
     </w:p>
     <w:p>
@@ -10633,7 +10648,7 @@
       <w:r>
         <w:drawing>
           <wp:inline xmlns:a="http://schemas.openxmlformats.org/drawingml/2006/main" xmlns:pic="http://schemas.openxmlformats.org/drawingml/2006/picture">
-            <wp:extent cx="5760000" cy="2722909"/>
+            <wp:extent cx="5760000" cy="3174640"/>
             <wp:docPr id="1" name="Picture 1"/>
             <wp:cNvGraphicFramePr>
               <a:graphicFrameLocks noChangeAspect="1"/>
@@ -10642,7 +10657,7 @@
               <a:graphicData uri="http://schemas.openxmlformats.org/drawingml/2006/picture">
                 <pic:pic>
                   <pic:nvPicPr>
-                    <pic:cNvPr id="0" name="Fig1.png"/>
+                    <pic:cNvPr id="0" name="Figure_1.png"/>
                     <pic:cNvPicPr/>
                   </pic:nvPicPr>
                   <pic:blipFill>
@@ -10654,7 +10669,7 @@
                   <pic:spPr>
                     <a:xfrm>
                       <a:off x="0" y="0"/>
-                      <a:ext cx="5760000" cy="2722909"/>
+                      <a:ext cx="5760000" cy="3174640"/>
                     </a:xfrm>
                     <a:prstGeom prst="rect"/>
                   </pic:spPr>
@@ -10692,7 +10707,7 @@
       <w:r>
         <w:drawing>
           <wp:inline xmlns:a="http://schemas.openxmlformats.org/drawingml/2006/main" xmlns:pic="http://schemas.openxmlformats.org/drawingml/2006/picture">
-            <wp:extent cx="5760000" cy="4032000"/>
+            <wp:extent cx="5760000" cy="3729590"/>
             <wp:docPr id="2" name="Picture 2"/>
             <wp:cNvGraphicFramePr>
               <a:graphicFrameLocks noChangeAspect="1"/>
@@ -10701,7 +10716,7 @@
               <a:graphicData uri="http://schemas.openxmlformats.org/drawingml/2006/picture">
                 <pic:pic>
                   <pic:nvPicPr>
-                    <pic:cNvPr id="0" name="Fig3.png"/>
+                    <pic:cNvPr id="0" name="Figure_2.png"/>
                     <pic:cNvPicPr/>
                   </pic:nvPicPr>
                   <pic:blipFill>
@@ -10713,7 +10728,7 @@
                   <pic:spPr>
                     <a:xfrm>
                       <a:off x="0" y="0"/>
-                      <a:ext cx="5760000" cy="4032000"/>
+                      <a:ext cx="5760000" cy="3729590"/>
                     </a:xfrm>
                     <a:prstGeom prst="rect"/>
                   </pic:spPr>
@@ -10739,7 +10754,7 @@
         <w:rPr>
           <w:sz w:val="19"/>
         </w:rPr>
-        <w:t>(a) SAP, freezes and the two one-shot quarantine rounds, including the failed round. (b) Decomposition of 2,707 eICU label targets and recall on the 1,460 panel-supported labels for the product release, v7 and the registry-off ablation.</w:t>
+        <w:t>(a) SAP, freezes and the two one-shot quarantine rounds, including the failed round. (b) Decomposition of the 2,707 eICU label targets. (c) Recall on the 1,460 panel-supported labels for the product release, 14.1/v6, v7 and the registry-off ablation.</w:t>
       </w:r>
     </w:p>
     <w:p>
@@ -10751,7 +10766,7 @@
       <w:r>
         <w:drawing>
           <wp:inline xmlns:a="http://schemas.openxmlformats.org/drawingml/2006/main" xmlns:pic="http://schemas.openxmlformats.org/drawingml/2006/picture">
-            <wp:extent cx="5760000" cy="4680000"/>
+            <wp:extent cx="5760000" cy="3530971"/>
             <wp:docPr id="3" name="Picture 3"/>
             <wp:cNvGraphicFramePr>
               <a:graphicFrameLocks noChangeAspect="1"/>
@@ -10760,7 +10775,7 @@
               <a:graphicData uri="http://schemas.openxmlformats.org/drawingml/2006/picture">
                 <pic:pic>
                   <pic:nvPicPr>
-                    <pic:cNvPr id="0" name="Fig4.png"/>
+                    <pic:cNvPr id="0" name="Figure_3.png"/>
                     <pic:cNvPicPr/>
                   </pic:nvPicPr>
                   <pic:blipFill>
@@ -10772,7 +10787,7 @@
                   <pic:spPr>
                     <a:xfrm>
                       <a:off x="0" y="0"/>
-                      <a:ext cx="5760000" cy="4680000"/>
+                      <a:ext cx="5760000" cy="3530971"/>
                     </a:xfrm>
                     <a:prstGeom prst="rect"/>
                   </pic:spPr>
@@ -10792,13 +10807,13 @@
           <w:b/>
           <w:sz w:val="19"/>
         </w:rPr>
-        <w:t xml:space="preserve">Fig. 3 | Untrained engine versus supervised models on identical inputs (eICU). </w:t>
+        <w:t xml:space="preserve">Fig. 3 | What the verification methods established about the rule base. </w:t>
       </w:r>
       <w:r>
         <w:rPr>
           <w:sz w:val="19"/>
         </w:rPr>
-        <w:t>Per-group AUROC of Hemoglyph, five-fold out-of-fold gradient boosting and logistic regression.</w:t>
+        <w:t>(a) Activity log over 3,814 real panels: 31,192 of 33,183 executable rules never fired, 1,627 fired without ever entering a top-10 differential, 364 formed the active core (174 hot). (b) Source concordance of the 200-rule frozen sample and of 100 active-core rules after re-sourcing (single declared AI rater). (c) Recall of seeded defects by the static detectors (mutation testing, Supplementary Note 16). (d) Per-rule verification ledger (Supplementary Note 18): status of the curated anchors, the active core and the sufficiency-arm rules in registry 15.2.0.</w:t>
       </w:r>
     </w:p>
     <w:p>
@@ -10810,7 +10825,7 @@
       <w:r>
         <w:drawing>
           <wp:inline xmlns:a="http://schemas.openxmlformats.org/drawingml/2006/main" xmlns:pic="http://schemas.openxmlformats.org/drawingml/2006/picture">
-            <wp:extent cx="5760000" cy="2432000"/>
+            <wp:extent cx="5760000" cy="3125666"/>
             <wp:docPr id="4" name="Picture 4"/>
             <wp:cNvGraphicFramePr>
               <a:graphicFrameLocks noChangeAspect="1"/>
@@ -10819,7 +10834,7 @@
               <a:graphicData uri="http://schemas.openxmlformats.org/drawingml/2006/picture">
                 <pic:pic>
                   <pic:nvPicPr>
-                    <pic:cNvPr id="0" name="Fig5.png"/>
+                    <pic:cNvPr id="0" name="Figure_4.png"/>
                     <pic:cNvPicPr/>
                   </pic:nvPicPr>
                   <pic:blipFill>
@@ -10831,7 +10846,7 @@
                   <pic:spPr>
                     <a:xfrm>
                       <a:off x="0" y="0"/>
-                      <a:ext cx="5760000" cy="2432000"/>
+                      <a:ext cx="5760000" cy="3125666"/>
                     </a:xfrm>
                     <a:prstGeom prst="rect"/>
                   </pic:spPr>
@@ -10851,13 +10866,13 @@
           <w:b/>
           <w:sz w:val="19"/>
         </w:rPr>
-        <w:t xml:space="preserve">Fig. 4 | NHANES screening across three independent cycles. </w:t>
+        <w:t xml:space="preserve">Fig. 4 | Untrained engine versus supervised models on identical inputs (eICU). </w:t>
       </w:r>
       <w:r>
         <w:rPr>
           <w:sz w:val="19"/>
         </w:rPr>
-        <w:t>AUROC per task for the development cycle (2017–18, frozen-v7 re-run) and quarantine cycles (2013–14, 2015–16), n = 3,000 each; y-axis truncated at 0.5 (chance level) to resolve differences of 0.01–0.05.</w:t>
+        <w:t>Per-group AUROC of Hemoglyph, five-fold out-of-fold gradient boosting and logistic regression.</w:t>
       </w:r>
     </w:p>
     <w:p>
@@ -10869,7 +10884,7 @@
       <w:r>
         <w:drawing>
           <wp:inline xmlns:a="http://schemas.openxmlformats.org/drawingml/2006/main" xmlns:pic="http://schemas.openxmlformats.org/drawingml/2006/picture">
-            <wp:extent cx="5760000" cy="2432000"/>
+            <wp:extent cx="5760000" cy="2678741"/>
             <wp:docPr id="5" name="Picture 5"/>
             <wp:cNvGraphicFramePr>
               <a:graphicFrameLocks noChangeAspect="1"/>
@@ -10878,7 +10893,7 @@
               <a:graphicData uri="http://schemas.openxmlformats.org/drawingml/2006/picture">
                 <pic:pic>
                   <pic:nvPicPr>
-                    <pic:cNvPr id="0" name="Fig6.png"/>
+                    <pic:cNvPr id="0" name="Figure_5.png"/>
                     <pic:cNvPicPr/>
                   </pic:nvPicPr>
                   <pic:blipFill>
@@ -10890,7 +10905,7 @@
                   <pic:spPr>
                     <a:xfrm>
                       <a:off x="0" y="0"/>
-                      <a:ext cx="5760000" cy="2432000"/>
+                      <a:ext cx="5760000" cy="2678741"/>
                     </a:xfrm>
                     <a:prstGeom prst="rect"/>
                   </pic:spPr>
@@ -10910,13 +10925,13 @@
           <w:b/>
           <w:sz w:val="19"/>
         </w:rPr>
-        <w:t xml:space="preserve">Fig. 5 | Sepsis: a pre-specified negative result. </w:t>
+        <w:t xml:space="preserve">Fig. 5 | NHANES screening across three independent cycles. </w:t>
       </w:r>
       <w:r>
         <w:rPr>
           <w:sz w:val="19"/>
         </w:rPr>
-        <w:t>Engine versus supervised logistic AUROC in prediction and concurrent frames across sets A, B and B2.</w:t>
+        <w:t>AUROC per task for the development cycle (2017–18, frozen-v7 re-run) and quarantine cycles (2013–14, 2015–16), n = 3,000 each; y-axis truncated at 0.5 (chance level) to resolve differences of 0.01–0.05.</w:t>
       </w:r>
     </w:p>
     <w:p>
@@ -10928,7 +10943,7 @@
       <w:r>
         <w:drawing>
           <wp:inline xmlns:a="http://schemas.openxmlformats.org/drawingml/2006/main" xmlns:pic="http://schemas.openxmlformats.org/drawingml/2006/picture">
-            <wp:extent cx="5760000" cy="2618182"/>
+            <wp:extent cx="5760000" cy="1774913"/>
             <wp:docPr id="6" name="Picture 6"/>
             <wp:cNvGraphicFramePr>
               <a:graphicFrameLocks noChangeAspect="1"/>
@@ -10937,7 +10952,7 @@
               <a:graphicData uri="http://schemas.openxmlformats.org/drawingml/2006/picture">
                 <pic:pic>
                   <pic:nvPicPr>
-                    <pic:cNvPr id="0" name="Fig7_llm_v7.png"/>
+                    <pic:cNvPr id="0" name="Figure_6.png"/>
                     <pic:cNvPicPr/>
                   </pic:nvPicPr>
                   <pic:blipFill>
@@ -10949,7 +10964,7 @@
                   <pic:spPr>
                     <a:xfrm>
                       <a:off x="0" y="0"/>
-                      <a:ext cx="5760000" cy="2618182"/>
+                      <a:ext cx="5760000" cy="1774913"/>
                     </a:xfrm>
                     <a:prstGeom prst="rect"/>
                   </pic:spPr>
@@ -10969,13 +10984,13 @@
           <w:b/>
           <w:sz w:val="19"/>
         </w:rPr>
-        <w:t xml:space="preserve">Fig. 6 | Blinded LLM comparison (400 stays, 596 labels), frozen engine v7. </w:t>
+        <w:t xml:space="preserve">Fig. 6 | Sepsis: a pre-specified negative result. </w:t>
       </w:r>
       <w:r>
         <w:rPr>
           <w:sz w:val="19"/>
         </w:rPr>
-        <w:t>Per-group recall@5 and recall@k curves for Hemoglyph and the unnamed frontier LLM model.</w:t>
+        <w:t>Engine versus supervised logistic AUROC (95% CI) in the prediction frame (a) and the concurrent frame (b) across PhysioNet 2019 sets A, B and B2; concurrent values are those recorded at each one-shot round.</w:t>
       </w:r>
     </w:p>
     <w:p>
@@ -10987,7 +11002,7 @@
       <w:r>
         <w:drawing>
           <wp:inline xmlns:a="http://schemas.openxmlformats.org/drawingml/2006/main" xmlns:pic="http://schemas.openxmlformats.org/drawingml/2006/picture">
-            <wp:extent cx="5760000" cy="3544615"/>
+            <wp:extent cx="5760000" cy="3323822"/>
             <wp:docPr id="7" name="Picture 7"/>
             <wp:cNvGraphicFramePr>
               <a:graphicFrameLocks noChangeAspect="1"/>
@@ -10996,7 +11011,7 @@
               <a:graphicData uri="http://schemas.openxmlformats.org/drawingml/2006/picture">
                 <pic:pic>
                   <pic:nvPicPr>
-                    <pic:cNvPr id="0" name="Fig8_calibration_dca.png"/>
+                    <pic:cNvPr id="0" name="Figure_7.png"/>
                     <pic:cNvPicPr/>
                   </pic:nvPicPr>
                   <pic:blipFill>
@@ -11008,7 +11023,7 @@
                   <pic:spPr>
                     <a:xfrm>
                       <a:off x="0" y="0"/>
-                      <a:ext cx="5760000" cy="3544615"/>
+                      <a:ext cx="5760000" cy="3323822"/>
                     </a:xfrm>
                     <a:prstGeom prst="rect"/>
                   </pic:spPr>
@@ -11028,13 +11043,72 @@
           <w:b/>
           <w:sz w:val="19"/>
         </w:rPr>
-        <w:t xml:space="preserve">Fig. 7 | Calibration and decision curves (eICU, engine v7). </w:t>
+        <w:t xml:space="preserve">Fig. 7 | Blinded LLM comparison and black-box property conformance. </w:t>
       </w:r>
       <w:r>
         <w:rPr>
           <w:sz w:val="19"/>
         </w:rPr>
-        <w:t>Reliability diagrams before and after cross-fitted isotonic recalibration and decision curves for the five largest groups.</w:t>
+        <w:t>(a) Per-group recall@5 for groups with ≥ 10 labels and (b) recall@k curves, 400 stays / 596 labels, frozen engine v7 versus the unnamed frontier LLM; (c) conformance on identical perturbed panels (Table 6; engine v8.2).</w:t>
+      </w:r>
+    </w:p>
+    <w:p>
+      <w:r>
+        <w:br w:type="page"/>
+      </w:r>
+    </w:p>
+    <w:p>
+      <w:r>
+        <w:drawing>
+          <wp:inline xmlns:a="http://schemas.openxmlformats.org/drawingml/2006/main" xmlns:pic="http://schemas.openxmlformats.org/drawingml/2006/picture">
+            <wp:extent cx="5760000" cy="2774481"/>
+            <wp:docPr id="8" name="Picture 8"/>
+            <wp:cNvGraphicFramePr>
+              <a:graphicFrameLocks noChangeAspect="1"/>
+            </wp:cNvGraphicFramePr>
+            <a:graphic>
+              <a:graphicData uri="http://schemas.openxmlformats.org/drawingml/2006/picture">
+                <pic:pic>
+                  <pic:nvPicPr>
+                    <pic:cNvPr id="0" name="Figure_8.png"/>
+                    <pic:cNvPicPr/>
+                  </pic:nvPicPr>
+                  <pic:blipFill>
+                    <a:blip r:embed="rId16"/>
+                    <a:stretch>
+                      <a:fillRect/>
+                    </a:stretch>
+                  </pic:blipFill>
+                  <pic:spPr>
+                    <a:xfrm>
+                      <a:off x="0" y="0"/>
+                      <a:ext cx="5760000" cy="2774481"/>
+                    </a:xfrm>
+                    <a:prstGeom prst="rect"/>
+                  </pic:spPr>
+                </pic:pic>
+              </a:graphicData>
+            </a:graphic>
+          </wp:inline>
+        </w:drawing>
+      </w:r>
+    </w:p>
+    <w:p>
+      <w:pPr>
+        <w:spacing w:line="276" w:lineRule="auto"/>
+      </w:pPr>
+      <w:r>
+        <w:rPr>
+          <w:b/>
+          <w:sz w:val="19"/>
+        </w:rPr>
+        <w:t xml:space="preserve">Fig. 8 | Calibration and decision curves (eICU, engine v7). </w:t>
+      </w:r>
+      <w:r>
+        <w:rPr>
+          <w:sz w:val="19"/>
+        </w:rPr>
+        <w:t>(a) Reliability by decile before and after cross-fitted isotonic recalibration, all groups pooled; (b) decision curves (net benefit per 100) for the five largest groups.</w:t>
       </w:r>
     </w:p>
     <w:p>

</xml_diff>